<commit_message>
Publish weighted NIS report tables
Co-Authored-By: Claude Opus 5.5 <noreply@anthropic.com>
</commit_message>
<xml_diff>
--- a/docs/quarto/index.docx
+++ b/docs/quarto/index.docx
@@ -158,7 +158,7 @@
               </w:numPr>
             </w:pPr>
             <w:r>
-              <w:t xml:space="preserve">The study included</w:t>
+              <w:t xml:space="preserve">The cohort represented</w:t>
             </w:r>
             <w:r>
               <w:t xml:space="preserve"> </w:t>
@@ -168,13 +168,13 @@
                 <w:b/>
                 <w:bCs/>
               </w:rPr>
-              <w:t xml:space="preserve">49,914</w:t>
+              <w:t xml:space="preserve">249,570</w:t>
             </w:r>
             <w:r>
               <w:t xml:space="preserve"> </w:t>
             </w:r>
             <w:r>
-              <w:t xml:space="preserve">adult hospitalizations;</w:t>
+              <w:t xml:space="preserve">hospitalizations nationally;</w:t>
             </w:r>
             <w:r>
               <w:t xml:space="preserve"> </w:t>
@@ -184,13 +184,23 @@
                 <w:b/>
                 <w:bCs/>
               </w:rPr>
-              <w:t xml:space="preserve">11,654</w:t>
+              <w:t xml:space="preserve">58,270</w:t>
             </w:r>
             <w:r>
               <w:t xml:space="preserve"> </w:t>
             </w:r>
             <w:r>
-              <w:t xml:space="preserve">had coded alcohol withdrawal syndrome (AWS).</w:t>
+              <w:t xml:space="preserve">(</w:t>
+            </w:r>
+            <w:r>
+              <w:rPr>
+                <w:b/>
+                <w:bCs/>
+              </w:rPr>
+              <w:t xml:space="preserve">23.3%</w:t>
+            </w:r>
+            <w:r>
+              <w:t xml:space="preserve">) had coded alcohol withdrawal syndrome (AWS).</w:t>
             </w:r>
           </w:p>
           <w:p>
@@ -451,20 +461,7 @@
         <w:pStyle w:val="FirstParagraph"/>
       </w:pPr>
       <w:r>
-        <w:t xml:space="preserve">We compared hospitalizations with and without coded AWS using survey-weighted regression. Adjusted odds ratios summarize the association after accounting for the listed covariates; values above 1 indicate higher odds and values below 1 indicate lower odds. Results describe associations and do not establish cause and effect. HCUP-required small-cell suppression is shown as</w:t>
-      </w:r>
-      <w:r>
-        <w:t xml:space="preserve"> </w:t>
-      </w:r>
-      <w:r>
-        <w:rPr>
-          <w:b/>
-          <w:bCs/>
-        </w:rPr>
-        <w:t xml:space="preserve">≤10</w:t>
-      </w:r>
-      <w:r>
-        <w:t xml:space="preserve">; related percentages and values recoverable by subtraction are also masked.</w:t>
+        <w:t xml:space="preserve">We compared hospitalizations with and without coded AWS using survey-weighted regression. Adjusted odds ratios summarize the association after accounting for the listed covariates; values above 1 indicate higher odds and values below 1 indicate lower odds. Results describe associations and do not establish cause and effect. All counts and percentages are survey-weighted national estimates, reported as weighted n (weighted %). The analysis included 49,914 sampled hospitalizations, representing 249,570 hospitalizations nationally. Cells based on 10 or fewer sampled hospitalizations are suppressed (≤10) per the HCUP data use agreement.</w:t>
       </w:r>
     </w:p>
     <w:bookmarkEnd w:id="15"/>
@@ -618,11 +615,11 @@
               <w:tblLook w:firstRow="1" w:lastRow="0" w:firstColumn="0" w:lastColumn="0" w:noHBand="0" w:noVBand="0" w:val="0020"/>
             </w:tblPr>
             <w:tblGrid>
-              <w:gridCol w:w="4364"/>
-              <w:gridCol w:w="969"/>
-              <w:gridCol w:w="969"/>
-              <w:gridCol w:w="969"/>
-              <w:gridCol w:w="646"/>
+              <w:gridCol w:w="3593"/>
+              <w:gridCol w:w="1397"/>
+              <w:gridCol w:w="1331"/>
+              <w:gridCol w:w="1064"/>
+              <w:gridCol w:w="532"/>
             </w:tblGrid>
             <w:tr>
               <w:trPr>
@@ -650,33 +647,33 @@
                     <w:jc w:val="center"/>
                   </w:pPr>
                   <w:r>
-                    <w:t xml:space="preserve">Overall</w:t>
-                  </w:r>
-                </w:p>
-              </w:tc>
-              <w:tc>
-                <w:tcPr/>
-                <w:p>
-                  <w:pPr>
-                    <w:pStyle w:val="Compact"/>
-                    <w:jc w:val="left"/>
-                    <w:jc w:val="center"/>
-                  </w:pPr>
-                  <w:r>
-                    <w:t xml:space="preserve">No AWS</w:t>
-                  </w:r>
-                </w:p>
-              </w:tc>
-              <w:tc>
-                <w:tcPr/>
-                <w:p>
-                  <w:pPr>
-                    <w:pStyle w:val="Compact"/>
-                    <w:jc w:val="left"/>
-                    <w:jc w:val="center"/>
-                  </w:pPr>
-                  <w:r>
-                    <w:t xml:space="preserve">AWS</w:t>
+                    <w:t xml:space="preserve">Overall, N = 249,570</w:t>
+                  </w:r>
+                </w:p>
+              </w:tc>
+              <w:tc>
+                <w:tcPr/>
+                <w:p>
+                  <w:pPr>
+                    <w:pStyle w:val="Compact"/>
+                    <w:jc w:val="left"/>
+                    <w:jc w:val="center"/>
+                  </w:pPr>
+                  <w:r>
+                    <w:t xml:space="preserve">No AWS, N = 191,300</w:t>
+                  </w:r>
+                </w:p>
+              </w:tc>
+              <w:tc>
+                <w:tcPr/>
+                <w:p>
+                  <w:pPr>
+                    <w:pStyle w:val="Compact"/>
+                    <w:jc w:val="left"/>
+                    <w:jc w:val="center"/>
+                  </w:pPr>
+                  <w:r>
+                    <w:t xml:space="preserve">AWS, N = 58,270</w:t>
                   </w:r>
                 </w:p>
               </w:tc>
@@ -836,33 +833,33 @@
                     <w:jc w:val="center"/>
                   </w:pPr>
                   <w:r>
-                    <w:t xml:space="preserve">78%</w:t>
-                  </w:r>
-                </w:p>
-              </w:tc>
-              <w:tc>
-                <w:tcPr/>
-                <w:p>
-                  <w:pPr>
-                    <w:pStyle w:val="Compact"/>
-                    <w:jc w:val="left"/>
-                    <w:jc w:val="center"/>
-                  </w:pPr>
-                  <w:r>
-                    <w:t xml:space="preserve">77%</w:t>
-                  </w:r>
-                </w:p>
-              </w:tc>
-              <w:tc>
-                <w:tcPr/>
-                <w:p>
-                  <w:pPr>
-                    <w:pStyle w:val="Compact"/>
-                    <w:jc w:val="left"/>
-                    <w:jc w:val="center"/>
-                  </w:pPr>
-                  <w:r>
-                    <w:t xml:space="preserve">81%</w:t>
+                    <w:t xml:space="preserve">194,195 (77.8%)</w:t>
+                  </w:r>
+                </w:p>
+              </w:tc>
+              <w:tc>
+                <w:tcPr/>
+                <w:p>
+                  <w:pPr>
+                    <w:pStyle w:val="Compact"/>
+                    <w:jc w:val="left"/>
+                    <w:jc w:val="center"/>
+                  </w:pPr>
+                  <w:r>
+                    <w:t xml:space="preserve">146,785 (76.7%)</w:t>
+                  </w:r>
+                </w:p>
+              </w:tc>
+              <w:tc>
+                <w:tcPr/>
+                <w:p>
+                  <w:pPr>
+                    <w:pStyle w:val="Compact"/>
+                    <w:jc w:val="left"/>
+                    <w:jc w:val="center"/>
+                  </w:pPr>
+                  <w:r>
+                    <w:t xml:space="preserve">47,410 (81.4%)</w:t>
                   </w:r>
                 </w:p>
               </w:tc>
@@ -898,33 +895,33 @@
                     <w:jc w:val="center"/>
                   </w:pPr>
                   <w:r>
-                    <w:t xml:space="preserve">22%</w:t>
-                  </w:r>
-                </w:p>
-              </w:tc>
-              <w:tc>
-                <w:tcPr/>
-                <w:p>
-                  <w:pPr>
-                    <w:pStyle w:val="Compact"/>
-                    <w:jc w:val="left"/>
-                    <w:jc w:val="center"/>
-                  </w:pPr>
-                  <w:r>
-                    <w:t xml:space="preserve">23%</w:t>
-                  </w:r>
-                </w:p>
-              </w:tc>
-              <w:tc>
-                <w:tcPr/>
-                <w:p>
-                  <w:pPr>
-                    <w:pStyle w:val="Compact"/>
-                    <w:jc w:val="left"/>
-                    <w:jc w:val="center"/>
-                  </w:pPr>
-                  <w:r>
-                    <w:t xml:space="preserve">19%</w:t>
+                    <w:t xml:space="preserve">≤10</w:t>
+                  </w:r>
+                </w:p>
+              </w:tc>
+              <w:tc>
+                <w:tcPr/>
+                <w:p>
+                  <w:pPr>
+                    <w:pStyle w:val="Compact"/>
+                    <w:jc w:val="left"/>
+                    <w:jc w:val="center"/>
+                  </w:pPr>
+                  <w:r>
+                    <w:t xml:space="preserve">44,425 (23.2%)</w:t>
+                  </w:r>
+                </w:p>
+              </w:tc>
+              <w:tc>
+                <w:tcPr/>
+                <w:p>
+                  <w:pPr>
+                    <w:pStyle w:val="Compact"/>
+                    <w:jc w:val="left"/>
+                    <w:jc w:val="center"/>
+                  </w:pPr>
+                  <w:r>
+                    <w:t xml:space="preserve">≤10</w:t>
                   </w:r>
                 </w:p>
               </w:tc>
@@ -973,7 +970,7 @@
                     <w:jc w:val="center"/>
                   </w:pPr>
                   <w:r>
-                    <w:t xml:space="preserve">≤10</w:t>
+                    <w:t xml:space="preserve">90 (0.0%)</w:t>
                   </w:r>
                 </w:p>
               </w:tc>
@@ -1074,33 +1071,33 @@
                     <w:jc w:val="center"/>
                   </w:pPr>
                   <w:r>
-                    <w:t xml:space="preserve">62%</w:t>
-                  </w:r>
-                </w:p>
-              </w:tc>
-              <w:tc>
-                <w:tcPr/>
-                <w:p>
-                  <w:pPr>
-                    <w:pStyle w:val="Compact"/>
-                    <w:jc w:val="left"/>
-                    <w:jc w:val="center"/>
-                  </w:pPr>
-                  <w:r>
-                    <w:t xml:space="preserve">61%</w:t>
-                  </w:r>
-                </w:p>
-              </w:tc>
-              <w:tc>
-                <w:tcPr/>
-                <w:p>
-                  <w:pPr>
-                    <w:pStyle w:val="Compact"/>
-                    <w:jc w:val="left"/>
-                    <w:jc w:val="center"/>
-                  </w:pPr>
-                  <w:r>
-                    <w:t xml:space="preserve">68%</w:t>
+                    <w:t xml:space="preserve">155,975 (62.5%)</w:t>
+                  </w:r>
+                </w:p>
+              </w:tc>
+              <w:tc>
+                <w:tcPr/>
+                <w:p>
+                  <w:pPr>
+                    <w:pStyle w:val="Compact"/>
+                    <w:jc w:val="left"/>
+                    <w:jc w:val="center"/>
+                  </w:pPr>
+                  <w:r>
+                    <w:t xml:space="preserve">116,220 (60.8%)</w:t>
+                  </w:r>
+                </w:p>
+              </w:tc>
+              <w:tc>
+                <w:tcPr/>
+                <w:p>
+                  <w:pPr>
+                    <w:pStyle w:val="Compact"/>
+                    <w:jc w:val="left"/>
+                    <w:jc w:val="center"/>
+                  </w:pPr>
+                  <w:r>
+                    <w:t xml:space="preserve">39,755 (68.2%)</w:t>
                   </w:r>
                 </w:p>
               </w:tc>
@@ -1136,33 +1133,33 @@
                     <w:jc w:val="center"/>
                   </w:pPr>
                   <w:r>
-                    <w:t xml:space="preserve">13%</w:t>
-                  </w:r>
-                </w:p>
-              </w:tc>
-              <w:tc>
-                <w:tcPr/>
-                <w:p>
-                  <w:pPr>
-                    <w:pStyle w:val="Compact"/>
-                    <w:jc w:val="left"/>
-                    <w:jc w:val="center"/>
-                  </w:pPr>
-                  <w:r>
-                    <w:t xml:space="preserve">14%</w:t>
-                  </w:r>
-                </w:p>
-              </w:tc>
-              <w:tc>
-                <w:tcPr/>
-                <w:p>
-                  <w:pPr>
-                    <w:pStyle w:val="Compact"/>
-                    <w:jc w:val="left"/>
-                    <w:jc w:val="center"/>
-                  </w:pPr>
-                  <w:r>
-                    <w:t xml:space="preserve">9.6%</w:t>
+                    <w:t xml:space="preserve">31,640 (12.7%)</w:t>
+                  </w:r>
+                </w:p>
+              </w:tc>
+              <w:tc>
+                <w:tcPr/>
+                <w:p>
+                  <w:pPr>
+                    <w:pStyle w:val="Compact"/>
+                    <w:jc w:val="left"/>
+                    <w:jc w:val="center"/>
+                  </w:pPr>
+                  <w:r>
+                    <w:t xml:space="preserve">26,040 (13.6%)</w:t>
+                  </w:r>
+                </w:p>
+              </w:tc>
+              <w:tc>
+                <w:tcPr/>
+                <w:p>
+                  <w:pPr>
+                    <w:pStyle w:val="Compact"/>
+                    <w:jc w:val="left"/>
+                    <w:jc w:val="center"/>
+                  </w:pPr>
+                  <w:r>
+                    <w:t xml:space="preserve">5,600 (9.6%)</w:t>
                   </w:r>
                 </w:p>
               </w:tc>
@@ -1198,33 +1195,33 @@
                     <w:jc w:val="center"/>
                   </w:pPr>
                   <w:r>
-                    <w:t xml:space="preserve">14%</w:t>
-                  </w:r>
-                </w:p>
-              </w:tc>
-              <w:tc>
-                <w:tcPr/>
-                <w:p>
-                  <w:pPr>
-                    <w:pStyle w:val="Compact"/>
-                    <w:jc w:val="left"/>
-                    <w:jc w:val="center"/>
-                  </w:pPr>
-                  <w:r>
-                    <w:t xml:space="preserve">14%</w:t>
-                  </w:r>
-                </w:p>
-              </w:tc>
-              <w:tc>
-                <w:tcPr/>
-                <w:p>
-                  <w:pPr>
-                    <w:pStyle w:val="Compact"/>
-                    <w:jc w:val="left"/>
-                    <w:jc w:val="center"/>
-                  </w:pPr>
-                  <w:r>
-                    <w:t xml:space="preserve">12%</w:t>
+                    <w:t xml:space="preserve">34,230 (13.7%)</w:t>
+                  </w:r>
+                </w:p>
+              </w:tc>
+              <w:tc>
+                <w:tcPr/>
+                <w:p>
+                  <w:pPr>
+                    <w:pStyle w:val="Compact"/>
+                    <w:jc w:val="left"/>
+                    <w:jc w:val="center"/>
+                  </w:pPr>
+                  <w:r>
+                    <w:t xml:space="preserve">27,185 (14.2%)</w:t>
+                  </w:r>
+                </w:p>
+              </w:tc>
+              <w:tc>
+                <w:tcPr/>
+                <w:p>
+                  <w:pPr>
+                    <w:pStyle w:val="Compact"/>
+                    <w:jc w:val="left"/>
+                    <w:jc w:val="center"/>
+                  </w:pPr>
+                  <w:r>
+                    <w:t xml:space="preserve">7,045 (12.1%)</w:t>
                   </w:r>
                 </w:p>
               </w:tc>
@@ -1260,33 +1257,33 @@
                     <w:jc w:val="center"/>
                   </w:pPr>
                   <w:r>
-                    <w:t xml:space="preserve">1.4%</w:t>
-                  </w:r>
-                </w:p>
-              </w:tc>
-              <w:tc>
-                <w:tcPr/>
-                <w:p>
-                  <w:pPr>
-                    <w:pStyle w:val="Compact"/>
-                    <w:jc w:val="left"/>
-                    <w:jc w:val="center"/>
-                  </w:pPr>
-                  <w:r>
-                    <w:t xml:space="preserve">1.4%</w:t>
-                  </w:r>
-                </w:p>
-              </w:tc>
-              <w:tc>
-                <w:tcPr/>
-                <w:p>
-                  <w:pPr>
-                    <w:pStyle w:val="Compact"/>
-                    <w:jc w:val="left"/>
-                    <w:jc w:val="center"/>
-                  </w:pPr>
-                  <w:r>
-                    <w:t xml:space="preserve">1.1%</w:t>
+                    <w:t xml:space="preserve">3,400 (1.4%)</w:t>
+                  </w:r>
+                </w:p>
+              </w:tc>
+              <w:tc>
+                <w:tcPr/>
+                <w:p>
+                  <w:pPr>
+                    <w:pStyle w:val="Compact"/>
+                    <w:jc w:val="left"/>
+                    <w:jc w:val="center"/>
+                  </w:pPr>
+                  <w:r>
+                    <w:t xml:space="preserve">2,765 (1.4%)</w:t>
+                  </w:r>
+                </w:p>
+              </w:tc>
+              <w:tc>
+                <w:tcPr/>
+                <w:p>
+                  <w:pPr>
+                    <w:pStyle w:val="Compact"/>
+                    <w:jc w:val="left"/>
+                    <w:jc w:val="center"/>
+                  </w:pPr>
+                  <w:r>
+                    <w:t xml:space="preserve">635 (1.1%)</w:t>
                   </w:r>
                 </w:p>
               </w:tc>
@@ -1322,33 +1319,33 @@
                     <w:jc w:val="center"/>
                   </w:pPr>
                   <w:r>
-                    <w:t xml:space="preserve">2.2%</w:t>
-                  </w:r>
-                </w:p>
-              </w:tc>
-              <w:tc>
-                <w:tcPr/>
-                <w:p>
-                  <w:pPr>
-                    <w:pStyle w:val="Compact"/>
-                    <w:jc w:val="left"/>
-                    <w:jc w:val="center"/>
-                  </w:pPr>
-                  <w:r>
-                    <w:t xml:space="preserve">2.1%</w:t>
-                  </w:r>
-                </w:p>
-              </w:tc>
-              <w:tc>
-                <w:tcPr/>
-                <w:p>
-                  <w:pPr>
-                    <w:pStyle w:val="Compact"/>
-                    <w:jc w:val="left"/>
-                    <w:jc w:val="center"/>
-                  </w:pPr>
-                  <w:r>
-                    <w:t xml:space="preserve">2.4%</w:t>
+                    <w:t xml:space="preserve">5,510 (2.2%)</w:t>
+                  </w:r>
+                </w:p>
+              </w:tc>
+              <w:tc>
+                <w:tcPr/>
+                <w:p>
+                  <w:pPr>
+                    <w:pStyle w:val="Compact"/>
+                    <w:jc w:val="left"/>
+                    <w:jc w:val="center"/>
+                  </w:pPr>
+                  <w:r>
+                    <w:t xml:space="preserve">4,105 (2.1%)</w:t>
+                  </w:r>
+                </w:p>
+              </w:tc>
+              <w:tc>
+                <w:tcPr/>
+                <w:p>
+                  <w:pPr>
+                    <w:pStyle w:val="Compact"/>
+                    <w:jc w:val="left"/>
+                    <w:jc w:val="center"/>
+                  </w:pPr>
+                  <w:r>
+                    <w:t xml:space="preserve">1,405 (2.4%)</w:t>
                   </w:r>
                 </w:p>
               </w:tc>
@@ -1384,33 +1381,33 @@
                     <w:jc w:val="center"/>
                   </w:pPr>
                   <w:r>
-                    <w:t xml:space="preserve">3.7%</w:t>
-                  </w:r>
-                </w:p>
-              </w:tc>
-              <w:tc>
-                <w:tcPr/>
-                <w:p>
-                  <w:pPr>
-                    <w:pStyle w:val="Compact"/>
-                    <w:jc w:val="left"/>
-                    <w:jc w:val="center"/>
-                  </w:pPr>
-                  <w:r>
-                    <w:t xml:space="preserve">3.9%</w:t>
-                  </w:r>
-                </w:p>
-              </w:tc>
-              <w:tc>
-                <w:tcPr/>
-                <w:p>
-                  <w:pPr>
-                    <w:pStyle w:val="Compact"/>
-                    <w:jc w:val="left"/>
-                    <w:jc w:val="center"/>
-                  </w:pPr>
-                  <w:r>
-                    <w:t xml:space="preserve">3.2%</w:t>
+                    <w:t xml:space="preserve">9,305 (3.7%)</w:t>
+                  </w:r>
+                </w:p>
+              </w:tc>
+              <w:tc>
+                <w:tcPr/>
+                <w:p>
+                  <w:pPr>
+                    <w:pStyle w:val="Compact"/>
+                    <w:jc w:val="left"/>
+                    <w:jc w:val="center"/>
+                  </w:pPr>
+                  <w:r>
+                    <w:t xml:space="preserve">7,420 (3.9%)</w:t>
+                  </w:r>
+                </w:p>
+              </w:tc>
+              <w:tc>
+                <w:tcPr/>
+                <w:p>
+                  <w:pPr>
+                    <w:pStyle w:val="Compact"/>
+                    <w:jc w:val="left"/>
+                    <w:jc w:val="center"/>
+                  </w:pPr>
+                  <w:r>
+                    <w:t xml:space="preserve">1,885 (3.2%)</w:t>
                   </w:r>
                 </w:p>
               </w:tc>
@@ -1446,33 +1443,33 @@
                     <w:jc w:val="center"/>
                   </w:pPr>
                   <w:r>
-                    <w:t xml:space="preserve">3.8%</w:t>
-                  </w:r>
-                </w:p>
-              </w:tc>
-              <w:tc>
-                <w:tcPr/>
-                <w:p>
-                  <w:pPr>
-                    <w:pStyle w:val="Compact"/>
-                    <w:jc w:val="left"/>
-                    <w:jc w:val="center"/>
-                  </w:pPr>
-                  <w:r>
-                    <w:t xml:space="preserve">4.0%</w:t>
-                  </w:r>
-                </w:p>
-              </w:tc>
-              <w:tc>
-                <w:tcPr/>
-                <w:p>
-                  <w:pPr>
-                    <w:pStyle w:val="Compact"/>
-                    <w:jc w:val="left"/>
-                    <w:jc w:val="center"/>
-                  </w:pPr>
-                  <w:r>
-                    <w:t xml:space="preserve">3.3%</w:t>
+                    <w:t xml:space="preserve">9,510 (3.8%)</w:t>
+                  </w:r>
+                </w:p>
+              </w:tc>
+              <w:tc>
+                <w:tcPr/>
+                <w:p>
+                  <w:pPr>
+                    <w:pStyle w:val="Compact"/>
+                    <w:jc w:val="left"/>
+                    <w:jc w:val="center"/>
+                  </w:pPr>
+                  <w:r>
+                    <w:t xml:space="preserve">7,565 (4.0%)</w:t>
+                  </w:r>
+                </w:p>
+              </w:tc>
+              <w:tc>
+                <w:tcPr/>
+                <w:p>
+                  <w:pPr>
+                    <w:pStyle w:val="Compact"/>
+                    <w:jc w:val="left"/>
+                    <w:jc w:val="center"/>
+                  </w:pPr>
+                  <w:r>
+                    <w:t xml:space="preserve">1,945 (3.3%)</w:t>
                   </w:r>
                 </w:p>
               </w:tc>
@@ -1560,33 +1557,33 @@
                     <w:jc w:val="center"/>
                   </w:pPr>
                   <w:r>
-                    <w:t xml:space="preserve">25%</w:t>
-                  </w:r>
-                </w:p>
-              </w:tc>
-              <w:tc>
-                <w:tcPr/>
-                <w:p>
-                  <w:pPr>
-                    <w:pStyle w:val="Compact"/>
-                    <w:jc w:val="left"/>
-                    <w:jc w:val="center"/>
-                  </w:pPr>
-                  <w:r>
-                    <w:t xml:space="preserve">24%</w:t>
-                  </w:r>
-                </w:p>
-              </w:tc>
-              <w:tc>
-                <w:tcPr/>
-                <w:p>
-                  <w:pPr>
-                    <w:pStyle w:val="Compact"/>
-                    <w:jc w:val="left"/>
-                    <w:jc w:val="center"/>
-                  </w:pPr>
-                  <w:r>
-                    <w:t xml:space="preserve">27%</w:t>
+                    <w:t xml:space="preserve">62,235 (24.9%)</w:t>
+                  </w:r>
+                </w:p>
+              </w:tc>
+              <w:tc>
+                <w:tcPr/>
+                <w:p>
+                  <w:pPr>
+                    <w:pStyle w:val="Compact"/>
+                    <w:jc w:val="left"/>
+                    <w:jc w:val="center"/>
+                  </w:pPr>
+                  <w:r>
+                    <w:t xml:space="preserve">46,655 (24.4%)</w:t>
+                  </w:r>
+                </w:p>
+              </w:tc>
+              <w:tc>
+                <w:tcPr/>
+                <w:p>
+                  <w:pPr>
+                    <w:pStyle w:val="Compact"/>
+                    <w:jc w:val="left"/>
+                    <w:jc w:val="center"/>
+                  </w:pPr>
+                  <w:r>
+                    <w:t xml:space="preserve">15,580 (26.7%)</w:t>
                   </w:r>
                 </w:p>
               </w:tc>
@@ -1622,33 +1619,33 @@
                     <w:jc w:val="center"/>
                   </w:pPr>
                   <w:r>
-                    <w:t xml:space="preserve">29%</w:t>
-                  </w:r>
-                </w:p>
-              </w:tc>
-              <w:tc>
-                <w:tcPr/>
-                <w:p>
-                  <w:pPr>
-                    <w:pStyle w:val="Compact"/>
-                    <w:jc w:val="left"/>
-                    <w:jc w:val="center"/>
-                  </w:pPr>
-                  <w:r>
-                    <w:t xml:space="preserve">27%</w:t>
-                  </w:r>
-                </w:p>
-              </w:tc>
-              <w:tc>
-                <w:tcPr/>
-                <w:p>
-                  <w:pPr>
-                    <w:pStyle w:val="Compact"/>
-                    <w:jc w:val="left"/>
-                    <w:jc w:val="center"/>
-                  </w:pPr>
-                  <w:r>
-                    <w:t xml:space="preserve">34%</w:t>
+                    <w:t xml:space="preserve">72,170 (28.9%)</w:t>
+                  </w:r>
+                </w:p>
+              </w:tc>
+              <w:tc>
+                <w:tcPr/>
+                <w:p>
+                  <w:pPr>
+                    <w:pStyle w:val="Compact"/>
+                    <w:jc w:val="left"/>
+                    <w:jc w:val="center"/>
+                  </w:pPr>
+                  <w:r>
+                    <w:t xml:space="preserve">52,335 (27.4%)</w:t>
+                  </w:r>
+                </w:p>
+              </w:tc>
+              <w:tc>
+                <w:tcPr/>
+                <w:p>
+                  <w:pPr>
+                    <w:pStyle w:val="Compact"/>
+                    <w:jc w:val="left"/>
+                    <w:jc w:val="center"/>
+                  </w:pPr>
+                  <w:r>
+                    <w:t xml:space="preserve">19,835 (34.0%)</w:t>
                   </w:r>
                 </w:p>
               </w:tc>
@@ -1684,33 +1681,33 @@
                     <w:jc w:val="center"/>
                   </w:pPr>
                   <w:r>
-                    <w:t xml:space="preserve">28%</w:t>
-                  </w:r>
-                </w:p>
-              </w:tc>
-              <w:tc>
-                <w:tcPr/>
-                <w:p>
-                  <w:pPr>
-                    <w:pStyle w:val="Compact"/>
-                    <w:jc w:val="left"/>
-                    <w:jc w:val="center"/>
-                  </w:pPr>
-                  <w:r>
-                    <w:t xml:space="preserve">30%</w:t>
-                  </w:r>
-                </w:p>
-              </w:tc>
-              <w:tc>
-                <w:tcPr/>
-                <w:p>
-                  <w:pPr>
-                    <w:pStyle w:val="Compact"/>
-                    <w:jc w:val="left"/>
-                    <w:jc w:val="center"/>
-                  </w:pPr>
-                  <w:r>
-                    <w:t xml:space="preserve">24%</w:t>
+                    <w:t xml:space="preserve">70,490 (28.2%)</w:t>
+                  </w:r>
+                </w:p>
+              </w:tc>
+              <w:tc>
+                <w:tcPr/>
+                <w:p>
+                  <w:pPr>
+                    <w:pStyle w:val="Compact"/>
+                    <w:jc w:val="left"/>
+                    <w:jc w:val="center"/>
+                  </w:pPr>
+                  <w:r>
+                    <w:t xml:space="preserve">56,710 (29.6%)</w:t>
+                  </w:r>
+                </w:p>
+              </w:tc>
+              <w:tc>
+                <w:tcPr/>
+                <w:p>
+                  <w:pPr>
+                    <w:pStyle w:val="Compact"/>
+                    <w:jc w:val="left"/>
+                    <w:jc w:val="center"/>
+                  </w:pPr>
+                  <w:r>
+                    <w:t xml:space="preserve">13,780 (23.6%)</w:t>
                   </w:r>
                 </w:p>
               </w:tc>
@@ -1746,33 +1743,33 @@
                     <w:jc w:val="center"/>
                   </w:pPr>
                   <w:r>
-                    <w:t xml:space="preserve">12%</w:t>
-                  </w:r>
-                </w:p>
-              </w:tc>
-              <w:tc>
-                <w:tcPr/>
-                <w:p>
-                  <w:pPr>
-                    <w:pStyle w:val="Compact"/>
-                    <w:jc w:val="left"/>
-                    <w:jc w:val="center"/>
-                  </w:pPr>
-                  <w:r>
-                    <w:t xml:space="preserve">12%</w:t>
-                  </w:r>
-                </w:p>
-              </w:tc>
-              <w:tc>
-                <w:tcPr/>
-                <w:p>
-                  <w:pPr>
-                    <w:pStyle w:val="Compact"/>
-                    <w:jc w:val="left"/>
-                    <w:jc w:val="center"/>
-                  </w:pPr>
-                  <w:r>
-                    <w:t xml:space="preserve">9.5%</w:t>
+                    <w:t xml:space="preserve">29,185 (11.7%)</w:t>
+                  </w:r>
+                </w:p>
+              </w:tc>
+              <w:tc>
+                <w:tcPr/>
+                <w:p>
+                  <w:pPr>
+                    <w:pStyle w:val="Compact"/>
+                    <w:jc w:val="left"/>
+                    <w:jc w:val="center"/>
+                  </w:pPr>
+                  <w:r>
+                    <w:t xml:space="preserve">23,665 (12.4%)</w:t>
+                  </w:r>
+                </w:p>
+              </w:tc>
+              <w:tc>
+                <w:tcPr/>
+                <w:p>
+                  <w:pPr>
+                    <w:pStyle w:val="Compact"/>
+                    <w:jc w:val="left"/>
+                    <w:jc w:val="center"/>
+                  </w:pPr>
+                  <w:r>
+                    <w:t xml:space="preserve">5,520 (9.5%)</w:t>
                   </w:r>
                 </w:p>
               </w:tc>
@@ -1808,33 +1805,33 @@
                     <w:jc w:val="center"/>
                   </w:pPr>
                   <w:r>
-                    <w:t xml:space="preserve">1.1%</w:t>
-                  </w:r>
-                </w:p>
-              </w:tc>
-              <w:tc>
-                <w:tcPr/>
-                <w:p>
-                  <w:pPr>
-                    <w:pStyle w:val="Compact"/>
-                    <w:jc w:val="left"/>
-                    <w:jc w:val="center"/>
-                  </w:pPr>
-                  <w:r>
-                    <w:t xml:space="preserve">1.1%</w:t>
-                  </w:r>
-                </w:p>
-              </w:tc>
-              <w:tc>
-                <w:tcPr/>
-                <w:p>
-                  <w:pPr>
-                    <w:pStyle w:val="Compact"/>
-                    <w:jc w:val="left"/>
-                    <w:jc w:val="center"/>
-                  </w:pPr>
-                  <w:r>
-                    <w:t xml:space="preserve">1.0%</w:t>
+                    <w:t xml:space="preserve">2,720 (1.1%)</w:t>
+                  </w:r>
+                </w:p>
+              </w:tc>
+              <w:tc>
+                <w:tcPr/>
+                <w:p>
+                  <w:pPr>
+                    <w:pStyle w:val="Compact"/>
+                    <w:jc w:val="left"/>
+                    <w:jc w:val="center"/>
+                  </w:pPr>
+                  <w:r>
+                    <w:t xml:space="preserve">2,160 (1.1%)</w:t>
+                  </w:r>
+                </w:p>
+              </w:tc>
+              <w:tc>
+                <w:tcPr/>
+                <w:p>
+                  <w:pPr>
+                    <w:pStyle w:val="Compact"/>
+                    <w:jc w:val="left"/>
+                    <w:jc w:val="center"/>
+                  </w:pPr>
+                  <w:r>
+                    <w:t xml:space="preserve">560 (1.0%)</w:t>
                   </w:r>
                 </w:p>
               </w:tc>
@@ -1870,33 +1867,33 @@
                     <w:jc w:val="center"/>
                   </w:pPr>
                   <w:r>
-                    <w:t xml:space="preserve">4.8%</w:t>
-                  </w:r>
-                </w:p>
-              </w:tc>
-              <w:tc>
-                <w:tcPr/>
-                <w:p>
-                  <w:pPr>
-                    <w:pStyle w:val="Compact"/>
-                    <w:jc w:val="left"/>
-                    <w:jc w:val="center"/>
-                  </w:pPr>
-                  <w:r>
-                    <w:t xml:space="preserve">4.8%</w:t>
-                  </w:r>
-                </w:p>
-              </w:tc>
-              <w:tc>
-                <w:tcPr/>
-                <w:p>
-                  <w:pPr>
-                    <w:pStyle w:val="Compact"/>
-                    <w:jc w:val="left"/>
-                    <w:jc w:val="center"/>
-                  </w:pPr>
-                  <w:r>
-                    <w:t xml:space="preserve">4.9%</w:t>
+                    <w:t xml:space="preserve">12,000 (4.8%)</w:t>
+                  </w:r>
+                </w:p>
+              </w:tc>
+              <w:tc>
+                <w:tcPr/>
+                <w:p>
+                  <w:pPr>
+                    <w:pStyle w:val="Compact"/>
+                    <w:jc w:val="left"/>
+                    <w:jc w:val="center"/>
+                  </w:pPr>
+                  <w:r>
+                    <w:t xml:space="preserve">9,150 (4.8%)</w:t>
+                  </w:r>
+                </w:p>
+              </w:tc>
+              <w:tc>
+                <w:tcPr/>
+                <w:p>
+                  <w:pPr>
+                    <w:pStyle w:val="Compact"/>
+                    <w:jc w:val="left"/>
+                    <w:jc w:val="center"/>
+                  </w:pPr>
+                  <w:r>
+                    <w:t xml:space="preserve">2,850 (4.9%)</w:t>
                   </w:r>
                 </w:p>
               </w:tc>
@@ -1932,33 +1929,33 @@
                     <w:jc w:val="center"/>
                   </w:pPr>
                   <w:r>
-                    <w:t xml:space="preserve">0.3%</w:t>
-                  </w:r>
-                </w:p>
-              </w:tc>
-              <w:tc>
-                <w:tcPr/>
-                <w:p>
-                  <w:pPr>
-                    <w:pStyle w:val="Compact"/>
-                    <w:jc w:val="left"/>
-                    <w:jc w:val="center"/>
-                  </w:pPr>
-                  <w:r>
-                    <w:t xml:space="preserve">0.3%</w:t>
-                  </w:r>
-                </w:p>
-              </w:tc>
-              <w:tc>
-                <w:tcPr/>
-                <w:p>
-                  <w:pPr>
-                    <w:pStyle w:val="Compact"/>
-                    <w:jc w:val="left"/>
-                    <w:jc w:val="center"/>
-                  </w:pPr>
-                  <w:r>
-                    <w:t xml:space="preserve">0.2%</w:t>
+                    <w:t xml:space="preserve">770 (0.3%)</w:t>
+                  </w:r>
+                </w:p>
+              </w:tc>
+              <w:tc>
+                <w:tcPr/>
+                <w:p>
+                  <w:pPr>
+                    <w:pStyle w:val="Compact"/>
+                    <w:jc w:val="left"/>
+                    <w:jc w:val="center"/>
+                  </w:pPr>
+                  <w:r>
+                    <w:t xml:space="preserve">625 (0.3%)</w:t>
+                  </w:r>
+                </w:p>
+              </w:tc>
+              <w:tc>
+                <w:tcPr/>
+                <w:p>
+                  <w:pPr>
+                    <w:pStyle w:val="Compact"/>
+                    <w:jc w:val="left"/>
+                    <w:jc w:val="center"/>
+                  </w:pPr>
+                  <w:r>
+                    <w:t xml:space="preserve">145 (0.2%)</w:t>
                   </w:r>
                 </w:p>
               </w:tc>
@@ -2046,33 +2043,33 @@
                     <w:jc w:val="center"/>
                   </w:pPr>
                   <w:r>
-                    <w:t xml:space="preserve">30%</w:t>
-                  </w:r>
-                </w:p>
-              </w:tc>
-              <w:tc>
-                <w:tcPr/>
-                <w:p>
-                  <w:pPr>
-                    <w:pStyle w:val="Compact"/>
-                    <w:jc w:val="left"/>
-                    <w:jc w:val="center"/>
-                  </w:pPr>
-                  <w:r>
-                    <w:t xml:space="preserve">31%</w:t>
-                  </w:r>
-                </w:p>
-              </w:tc>
-              <w:tc>
-                <w:tcPr/>
-                <w:p>
-                  <w:pPr>
-                    <w:pStyle w:val="Compact"/>
-                    <w:jc w:val="left"/>
-                    <w:jc w:val="center"/>
-                  </w:pPr>
-                  <w:r>
-                    <w:t xml:space="preserve">28%</w:t>
+                    <w:t xml:space="preserve">75,235 (30.1%)</w:t>
+                  </w:r>
+                </w:p>
+              </w:tc>
+              <w:tc>
+                <w:tcPr/>
+                <w:p>
+                  <w:pPr>
+                    <w:pStyle w:val="Compact"/>
+                    <w:jc w:val="left"/>
+                    <w:jc w:val="center"/>
+                  </w:pPr>
+                  <w:r>
+                    <w:t xml:space="preserve">59,195 (30.9%)</w:t>
+                  </w:r>
+                </w:p>
+              </w:tc>
+              <w:tc>
+                <w:tcPr/>
+                <w:p>
+                  <w:pPr>
+                    <w:pStyle w:val="Compact"/>
+                    <w:jc w:val="left"/>
+                    <w:jc w:val="center"/>
+                  </w:pPr>
+                  <w:r>
+                    <w:t xml:space="preserve">16,040 (27.5%)</w:t>
                   </w:r>
                 </w:p>
               </w:tc>
@@ -2108,33 +2105,33 @@
                     <w:jc w:val="center"/>
                   </w:pPr>
                   <w:r>
-                    <w:t xml:space="preserve">24%</w:t>
-                  </w:r>
-                </w:p>
-              </w:tc>
-              <w:tc>
-                <w:tcPr/>
-                <w:p>
-                  <w:pPr>
-                    <w:pStyle w:val="Compact"/>
-                    <w:jc w:val="left"/>
-                    <w:jc w:val="center"/>
-                  </w:pPr>
-                  <w:r>
-                    <w:t xml:space="preserve">24%</w:t>
-                  </w:r>
-                </w:p>
-              </w:tc>
-              <w:tc>
-                <w:tcPr/>
-                <w:p>
-                  <w:pPr>
-                    <w:pStyle w:val="Compact"/>
-                    <w:jc w:val="left"/>
-                    <w:jc w:val="center"/>
-                  </w:pPr>
-                  <w:r>
-                    <w:t xml:space="preserve">23%</w:t>
+                    <w:t xml:space="preserve">59,755 (23.9%)</w:t>
+                  </w:r>
+                </w:p>
+              </w:tc>
+              <w:tc>
+                <w:tcPr/>
+                <w:p>
+                  <w:pPr>
+                    <w:pStyle w:val="Compact"/>
+                    <w:jc w:val="left"/>
+                    <w:jc w:val="center"/>
+                  </w:pPr>
+                  <w:r>
+                    <w:t xml:space="preserve">46,300 (24.2%)</w:t>
+                  </w:r>
+                </w:p>
+              </w:tc>
+              <w:tc>
+                <w:tcPr/>
+                <w:p>
+                  <w:pPr>
+                    <w:pStyle w:val="Compact"/>
+                    <w:jc w:val="left"/>
+                    <w:jc w:val="center"/>
+                  </w:pPr>
+                  <w:r>
+                    <w:t xml:space="preserve">13,455 (23.1%)</w:t>
                   </w:r>
                 </w:p>
               </w:tc>
@@ -2170,33 +2167,33 @@
                     <w:jc w:val="center"/>
                   </w:pPr>
                   <w:r>
-                    <w:t xml:space="preserve">23%</w:t>
-                  </w:r>
-                </w:p>
-              </w:tc>
-              <w:tc>
-                <w:tcPr/>
-                <w:p>
-                  <w:pPr>
-                    <w:pStyle w:val="Compact"/>
-                    <w:jc w:val="left"/>
-                    <w:jc w:val="center"/>
-                  </w:pPr>
-                  <w:r>
-                    <w:t xml:space="preserve">23%</w:t>
-                  </w:r>
-                </w:p>
-              </w:tc>
-              <w:tc>
-                <w:tcPr/>
-                <w:p>
-                  <w:pPr>
-                    <w:pStyle w:val="Compact"/>
-                    <w:jc w:val="left"/>
-                    <w:jc w:val="center"/>
-                  </w:pPr>
-                  <w:r>
-                    <w:t xml:space="preserve">24%</w:t>
+                    <w:t xml:space="preserve">57,325 (23.0%)</w:t>
+                  </w:r>
+                </w:p>
+              </w:tc>
+              <w:tc>
+                <w:tcPr/>
+                <w:p>
+                  <w:pPr>
+                    <w:pStyle w:val="Compact"/>
+                    <w:jc w:val="left"/>
+                    <w:jc w:val="center"/>
+                  </w:pPr>
+                  <w:r>
+                    <w:t xml:space="preserve">43,500 (22.7%)</w:t>
+                  </w:r>
+                </w:p>
+              </w:tc>
+              <w:tc>
+                <w:tcPr/>
+                <w:p>
+                  <w:pPr>
+                    <w:pStyle w:val="Compact"/>
+                    <w:jc w:val="left"/>
+                    <w:jc w:val="center"/>
+                  </w:pPr>
+                  <w:r>
+                    <w:t xml:space="preserve">13,825 (23.7%)</w:t>
                   </w:r>
                 </w:p>
               </w:tc>
@@ -2232,33 +2229,33 @@
                     <w:jc w:val="center"/>
                   </w:pPr>
                   <w:r>
-                    <w:t xml:space="preserve">19%</w:t>
-                  </w:r>
-                </w:p>
-              </w:tc>
-              <w:tc>
-                <w:tcPr/>
-                <w:p>
-                  <w:pPr>
-                    <w:pStyle w:val="Compact"/>
-                    <w:jc w:val="left"/>
-                    <w:jc w:val="center"/>
-                  </w:pPr>
-                  <w:r>
-                    <w:t xml:space="preserve">18%</w:t>
-                  </w:r>
-                </w:p>
-              </w:tc>
-              <w:tc>
-                <w:tcPr/>
-                <w:p>
-                  <w:pPr>
-                    <w:pStyle w:val="Compact"/>
-                    <w:jc w:val="left"/>
-                    <w:jc w:val="center"/>
-                  </w:pPr>
-                  <w:r>
-                    <w:t xml:space="preserve">20%</w:t>
+                    <w:t xml:space="preserve">47,240 (18.9%)</w:t>
+                  </w:r>
+                </w:p>
+              </w:tc>
+              <w:tc>
+                <w:tcPr/>
+                <w:p>
+                  <w:pPr>
+                    <w:pStyle w:val="Compact"/>
+                    <w:jc w:val="left"/>
+                    <w:jc w:val="center"/>
+                  </w:pPr>
+                  <w:r>
+                    <w:t xml:space="preserve">35,295 (18.5%)</w:t>
+                  </w:r>
+                </w:p>
+              </w:tc>
+              <w:tc>
+                <w:tcPr/>
+                <w:p>
+                  <w:pPr>
+                    <w:pStyle w:val="Compact"/>
+                    <w:jc w:val="left"/>
+                    <w:jc w:val="center"/>
+                  </w:pPr>
+                  <w:r>
+                    <w:t xml:space="preserve">11,945 (20.5%)</w:t>
                   </w:r>
                 </w:p>
               </w:tc>
@@ -2294,33 +2291,33 @@
                     <w:jc w:val="center"/>
                   </w:pPr>
                   <w:r>
-                    <w:t xml:space="preserve">4.0%</w:t>
-                  </w:r>
-                </w:p>
-              </w:tc>
-              <w:tc>
-                <w:tcPr/>
-                <w:p>
-                  <w:pPr>
-                    <w:pStyle w:val="Compact"/>
-                    <w:jc w:val="left"/>
-                    <w:jc w:val="center"/>
-                  </w:pPr>
-                  <w:r>
-                    <w:t xml:space="preserve">3.7%</w:t>
-                  </w:r>
-                </w:p>
-              </w:tc>
-              <w:tc>
-                <w:tcPr/>
-                <w:p>
-                  <w:pPr>
-                    <w:pStyle w:val="Compact"/>
-                    <w:jc w:val="left"/>
-                    <w:jc w:val="center"/>
-                  </w:pPr>
-                  <w:r>
-                    <w:t xml:space="preserve">5.2%</w:t>
+                    <w:t xml:space="preserve">10,015 (4.0%)</w:t>
+                  </w:r>
+                </w:p>
+              </w:tc>
+              <w:tc>
+                <w:tcPr/>
+                <w:p>
+                  <w:pPr>
+                    <w:pStyle w:val="Compact"/>
+                    <w:jc w:val="left"/>
+                    <w:jc w:val="center"/>
+                  </w:pPr>
+                  <w:r>
+                    <w:t xml:space="preserve">7,010 (3.7%)</w:t>
+                  </w:r>
+                </w:p>
+              </w:tc>
+              <w:tc>
+                <w:tcPr/>
+                <w:p>
+                  <w:pPr>
+                    <w:pStyle w:val="Compact"/>
+                    <w:jc w:val="left"/>
+                    <w:jc w:val="center"/>
+                  </w:pPr>
+                  <w:r>
+                    <w:t xml:space="preserve">3,005 (5.2%)</w:t>
                   </w:r>
                 </w:p>
               </w:tc>
@@ -2408,33 +2405,33 @@
                     <w:jc w:val="center"/>
                   </w:pPr>
                   <w:r>
-                    <w:t xml:space="preserve">50%</w:t>
-                  </w:r>
-                </w:p>
-              </w:tc>
-              <w:tc>
-                <w:tcPr/>
-                <w:p>
-                  <w:pPr>
-                    <w:pStyle w:val="Compact"/>
-                    <w:jc w:val="left"/>
-                    <w:jc w:val="center"/>
-                  </w:pPr>
-                  <w:r>
-                    <w:t xml:space="preserve">51%</w:t>
-                  </w:r>
-                </w:p>
-              </w:tc>
-              <w:tc>
-                <w:tcPr/>
-                <w:p>
-                  <w:pPr>
-                    <w:pStyle w:val="Compact"/>
-                    <w:jc w:val="left"/>
-                    <w:jc w:val="center"/>
-                  </w:pPr>
-                  <w:r>
-                    <w:t xml:space="preserve">46%</w:t>
+                    <w:t xml:space="preserve">123,830 (49.6%)</w:t>
+                  </w:r>
+                </w:p>
+              </w:tc>
+              <w:tc>
+                <w:tcPr/>
+                <w:p>
+                  <w:pPr>
+                    <w:pStyle w:val="Compact"/>
+                    <w:jc w:val="left"/>
+                    <w:jc w:val="center"/>
+                  </w:pPr>
+                  <w:r>
+                    <w:t xml:space="preserve">97,035 (50.7%)</w:t>
+                  </w:r>
+                </w:p>
+              </w:tc>
+              <w:tc>
+                <w:tcPr/>
+                <w:p>
+                  <w:pPr>
+                    <w:pStyle w:val="Compact"/>
+                    <w:jc w:val="left"/>
+                    <w:jc w:val="center"/>
+                  </w:pPr>
+                  <w:r>
+                    <w:t xml:space="preserve">26,795 (46.0%)</w:t>
                   </w:r>
                 </w:p>
               </w:tc>
@@ -2470,33 +2467,33 @@
                     <w:jc w:val="center"/>
                   </w:pPr>
                   <w:r>
-                    <w:t xml:space="preserve">17%</w:t>
-                  </w:r>
-                </w:p>
-              </w:tc>
-              <w:tc>
-                <w:tcPr/>
-                <w:p>
-                  <w:pPr>
-                    <w:pStyle w:val="Compact"/>
-                    <w:jc w:val="left"/>
-                    <w:jc w:val="center"/>
-                  </w:pPr>
-                  <w:r>
-                    <w:t xml:space="preserve">17%</w:t>
-                  </w:r>
-                </w:p>
-              </w:tc>
-              <w:tc>
-                <w:tcPr/>
-                <w:p>
-                  <w:pPr>
-                    <w:pStyle w:val="Compact"/>
-                    <w:jc w:val="left"/>
-                    <w:jc w:val="center"/>
-                  </w:pPr>
-                  <w:r>
-                    <w:t xml:space="preserve">18%</w:t>
+                    <w:t xml:space="preserve">43,375 (17.4%)</w:t>
+                  </w:r>
+                </w:p>
+              </w:tc>
+              <w:tc>
+                <w:tcPr/>
+                <w:p>
+                  <w:pPr>
+                    <w:pStyle w:val="Compact"/>
+                    <w:jc w:val="left"/>
+                    <w:jc w:val="center"/>
+                  </w:pPr>
+                  <w:r>
+                    <w:t xml:space="preserve">32,850 (17.2%)</w:t>
+                  </w:r>
+                </w:p>
+              </w:tc>
+              <w:tc>
+                <w:tcPr/>
+                <w:p>
+                  <w:pPr>
+                    <w:pStyle w:val="Compact"/>
+                    <w:jc w:val="left"/>
+                    <w:jc w:val="center"/>
+                  </w:pPr>
+                  <w:r>
+                    <w:t xml:space="preserve">10,525 (18.1%)</w:t>
                   </w:r>
                 </w:p>
               </w:tc>
@@ -2532,33 +2529,33 @@
                     <w:jc w:val="center"/>
                   </w:pPr>
                   <w:r>
-                    <w:t xml:space="preserve">33%</w:t>
-                  </w:r>
-                </w:p>
-              </w:tc>
-              <w:tc>
-                <w:tcPr/>
-                <w:p>
-                  <w:pPr>
-                    <w:pStyle w:val="Compact"/>
-                    <w:jc w:val="left"/>
-                    <w:jc w:val="center"/>
-                  </w:pPr>
-                  <w:r>
-                    <w:t xml:space="preserve">32%</w:t>
-                  </w:r>
-                </w:p>
-              </w:tc>
-              <w:tc>
-                <w:tcPr/>
-                <w:p>
-                  <w:pPr>
-                    <w:pStyle w:val="Compact"/>
-                    <w:jc w:val="left"/>
-                    <w:jc w:val="center"/>
-                  </w:pPr>
-                  <w:r>
-                    <w:t xml:space="preserve">36%</w:t>
+                    <w:t xml:space="preserve">82,365 (33.0%)</w:t>
+                  </w:r>
+                </w:p>
+              </w:tc>
+              <w:tc>
+                <w:tcPr/>
+                <w:p>
+                  <w:pPr>
+                    <w:pStyle w:val="Compact"/>
+                    <w:jc w:val="left"/>
+                    <w:jc w:val="center"/>
+                  </w:pPr>
+                  <w:r>
+                    <w:t xml:space="preserve">61,415 (32.1%)</w:t>
+                  </w:r>
+                </w:p>
+              </w:tc>
+              <w:tc>
+                <w:tcPr/>
+                <w:p>
+                  <w:pPr>
+                    <w:pStyle w:val="Compact"/>
+                    <w:jc w:val="left"/>
+                    <w:jc w:val="center"/>
+                  </w:pPr>
+                  <w:r>
+                    <w:t xml:space="preserve">20,950 (36.0%)</w:t>
                   </w:r>
                 </w:p>
               </w:tc>
@@ -2646,33 +2643,33 @@
                     <w:jc w:val="center"/>
                   </w:pPr>
                   <w:r>
-                    <w:t xml:space="preserve">17%</w:t>
-                  </w:r>
-                </w:p>
-              </w:tc>
-              <w:tc>
-                <w:tcPr/>
-                <w:p>
-                  <w:pPr>
-                    <w:pStyle w:val="Compact"/>
-                    <w:jc w:val="left"/>
-                    <w:jc w:val="center"/>
-                  </w:pPr>
-                  <w:r>
-                    <w:t xml:space="preserve">16%</w:t>
-                  </w:r>
-                </w:p>
-              </w:tc>
-              <w:tc>
-                <w:tcPr/>
-                <w:p>
-                  <w:pPr>
-                    <w:pStyle w:val="Compact"/>
-                    <w:jc w:val="left"/>
-                    <w:jc w:val="center"/>
-                  </w:pPr>
-                  <w:r>
-                    <w:t xml:space="preserve">19%</w:t>
+                    <w:t xml:space="preserve">42,520 (17.0%)</w:t>
+                  </w:r>
+                </w:p>
+              </w:tc>
+              <w:tc>
+                <w:tcPr/>
+                <w:p>
+                  <w:pPr>
+                    <w:pStyle w:val="Compact"/>
+                    <w:jc w:val="left"/>
+                    <w:jc w:val="center"/>
+                  </w:pPr>
+                  <w:r>
+                    <w:t xml:space="preserve">31,325 (16.4%)</w:t>
+                  </w:r>
+                </w:p>
+              </w:tc>
+              <w:tc>
+                <w:tcPr/>
+                <w:p>
+                  <w:pPr>
+                    <w:pStyle w:val="Compact"/>
+                    <w:jc w:val="left"/>
+                    <w:jc w:val="center"/>
+                  </w:pPr>
+                  <w:r>
+                    <w:t xml:space="preserve">11,195 (19.2%)</w:t>
                   </w:r>
                 </w:p>
               </w:tc>
@@ -2708,33 +2705,33 @@
                     <w:jc w:val="center"/>
                   </w:pPr>
                   <w:r>
-                    <w:t xml:space="preserve">23%</w:t>
-                  </w:r>
-                </w:p>
-              </w:tc>
-              <w:tc>
-                <w:tcPr/>
-                <w:p>
-                  <w:pPr>
-                    <w:pStyle w:val="Compact"/>
-                    <w:jc w:val="left"/>
-                    <w:jc w:val="center"/>
-                  </w:pPr>
-                  <w:r>
-                    <w:t xml:space="preserve">24%</w:t>
-                  </w:r>
-                </w:p>
-              </w:tc>
-              <w:tc>
-                <w:tcPr/>
-                <w:p>
-                  <w:pPr>
-                    <w:pStyle w:val="Compact"/>
-                    <w:jc w:val="left"/>
-                    <w:jc w:val="center"/>
-                  </w:pPr>
-                  <w:r>
-                    <w:t xml:space="preserve">22%</w:t>
+                    <w:t xml:space="preserve">57,745 (23.1%)</w:t>
+                  </w:r>
+                </w:p>
+              </w:tc>
+              <w:tc>
+                <w:tcPr/>
+                <w:p>
+                  <w:pPr>
+                    <w:pStyle w:val="Compact"/>
+                    <w:jc w:val="left"/>
+                    <w:jc w:val="center"/>
+                  </w:pPr>
+                  <w:r>
+                    <w:t xml:space="preserve">45,160 (23.6%)</w:t>
+                  </w:r>
+                </w:p>
+              </w:tc>
+              <w:tc>
+                <w:tcPr/>
+                <w:p>
+                  <w:pPr>
+                    <w:pStyle w:val="Compact"/>
+                    <w:jc w:val="left"/>
+                    <w:jc w:val="center"/>
+                  </w:pPr>
+                  <w:r>
+                    <w:t xml:space="preserve">12,585 (21.6%)</w:t>
                   </w:r>
                 </w:p>
               </w:tc>
@@ -2770,33 +2767,33 @@
                     <w:jc w:val="center"/>
                   </w:pPr>
                   <w:r>
-                    <w:t xml:space="preserve">33%</w:t>
-                  </w:r>
-                </w:p>
-              </w:tc>
-              <w:tc>
-                <w:tcPr/>
-                <w:p>
-                  <w:pPr>
-                    <w:pStyle w:val="Compact"/>
-                    <w:jc w:val="left"/>
-                    <w:jc w:val="center"/>
-                  </w:pPr>
-                  <w:r>
-                    <w:t xml:space="preserve">33%</w:t>
-                  </w:r>
-                </w:p>
-              </w:tc>
-              <w:tc>
-                <w:tcPr/>
-                <w:p>
-                  <w:pPr>
-                    <w:pStyle w:val="Compact"/>
-                    <w:jc w:val="left"/>
-                    <w:jc w:val="center"/>
-                  </w:pPr>
-                  <w:r>
-                    <w:t xml:space="preserve">30%</w:t>
+                    <w:t xml:space="preserve">81,475 (32.6%)</w:t>
+                  </w:r>
+                </w:p>
+              </w:tc>
+              <w:tc>
+                <w:tcPr/>
+                <w:p>
+                  <w:pPr>
+                    <w:pStyle w:val="Compact"/>
+                    <w:jc w:val="left"/>
+                    <w:jc w:val="center"/>
+                  </w:pPr>
+                  <w:r>
+                    <w:t xml:space="preserve">63,950 (33.4%)</w:t>
+                  </w:r>
+                </w:p>
+              </w:tc>
+              <w:tc>
+                <w:tcPr/>
+                <w:p>
+                  <w:pPr>
+                    <w:pStyle w:val="Compact"/>
+                    <w:jc w:val="left"/>
+                    <w:jc w:val="center"/>
+                  </w:pPr>
+                  <w:r>
+                    <w:t xml:space="preserve">17,525 (30.1%)</w:t>
                   </w:r>
                 </w:p>
               </w:tc>
@@ -2832,33 +2829,33 @@
                     <w:jc w:val="center"/>
                   </w:pPr>
                   <w:r>
-                    <w:t xml:space="preserve">27%</w:t>
-                  </w:r>
-                </w:p>
-              </w:tc>
-              <w:tc>
-                <w:tcPr/>
-                <w:p>
-                  <w:pPr>
-                    <w:pStyle w:val="Compact"/>
-                    <w:jc w:val="left"/>
-                    <w:jc w:val="center"/>
-                  </w:pPr>
-                  <w:r>
-                    <w:t xml:space="preserve">27%</w:t>
-                  </w:r>
-                </w:p>
-              </w:tc>
-              <w:tc>
-                <w:tcPr/>
-                <w:p>
-                  <w:pPr>
-                    <w:pStyle w:val="Compact"/>
-                    <w:jc w:val="left"/>
-                    <w:jc w:val="center"/>
-                  </w:pPr>
-                  <w:r>
-                    <w:t xml:space="preserve">29%</w:t>
+                    <w:t xml:space="preserve">67,830 (27.2%)</w:t>
+                  </w:r>
+                </w:p>
+              </w:tc>
+              <w:tc>
+                <w:tcPr/>
+                <w:p>
+                  <w:pPr>
+                    <w:pStyle w:val="Compact"/>
+                    <w:jc w:val="left"/>
+                    <w:jc w:val="center"/>
+                  </w:pPr>
+                  <w:r>
+                    <w:t xml:space="preserve">50,865 (26.6%)</w:t>
+                  </w:r>
+                </w:p>
+              </w:tc>
+              <w:tc>
+                <w:tcPr/>
+                <w:p>
+                  <w:pPr>
+                    <w:pStyle w:val="Compact"/>
+                    <w:jc w:val="left"/>
+                    <w:jc w:val="center"/>
+                  </w:pPr>
+                  <w:r>
+                    <w:t xml:space="preserve">16,965 (29.1%)</w:t>
                   </w:r>
                 </w:p>
               </w:tc>
@@ -2946,33 +2943,33 @@
                     <w:jc w:val="center"/>
                   </w:pPr>
                   <w:r>
-                    <w:t xml:space="preserve">10%</w:t>
-                  </w:r>
-                </w:p>
-              </w:tc>
-              <w:tc>
-                <w:tcPr/>
-                <w:p>
-                  <w:pPr>
-                    <w:pStyle w:val="Compact"/>
-                    <w:jc w:val="left"/>
-                    <w:jc w:val="center"/>
-                  </w:pPr>
-                  <w:r>
-                    <w:t xml:space="preserve">9.9%</w:t>
-                  </w:r>
-                </w:p>
-              </w:tc>
-              <w:tc>
-                <w:tcPr/>
-                <w:p>
-                  <w:pPr>
-                    <w:pStyle w:val="Compact"/>
-                    <w:jc w:val="left"/>
-                    <w:jc w:val="center"/>
-                  </w:pPr>
-                  <w:r>
-                    <w:t xml:space="preserve">11%</w:t>
+                    <w:t xml:space="preserve">25,450 (10.2%)</w:t>
+                  </w:r>
+                </w:p>
+              </w:tc>
+              <w:tc>
+                <w:tcPr/>
+                <w:p>
+                  <w:pPr>
+                    <w:pStyle w:val="Compact"/>
+                    <w:jc w:val="left"/>
+                    <w:jc w:val="center"/>
+                  </w:pPr>
+                  <w:r>
+                    <w:t xml:space="preserve">18,955 (9.9%)</w:t>
+                  </w:r>
+                </w:p>
+              </w:tc>
+              <w:tc>
+                <w:tcPr/>
+                <w:p>
+                  <w:pPr>
+                    <w:pStyle w:val="Compact"/>
+                    <w:jc w:val="left"/>
+                    <w:jc w:val="center"/>
+                  </w:pPr>
+                  <w:r>
+                    <w:t xml:space="preserve">6,495 (11.1%)</w:t>
                   </w:r>
                 </w:p>
               </w:tc>
@@ -3008,33 +3005,33 @@
                     <w:jc w:val="center"/>
                   </w:pPr>
                   <w:r>
-                    <w:t xml:space="preserve">26%</w:t>
-                  </w:r>
-                </w:p>
-              </w:tc>
-              <w:tc>
-                <w:tcPr/>
-                <w:p>
-                  <w:pPr>
-                    <w:pStyle w:val="Compact"/>
-                    <w:jc w:val="left"/>
-                    <w:jc w:val="center"/>
-                  </w:pPr>
-                  <w:r>
-                    <w:t xml:space="preserve">26%</w:t>
-                  </w:r>
-                </w:p>
-              </w:tc>
-              <w:tc>
-                <w:tcPr/>
-                <w:p>
-                  <w:pPr>
-                    <w:pStyle w:val="Compact"/>
-                    <w:jc w:val="left"/>
-                    <w:jc w:val="center"/>
-                  </w:pPr>
-                  <w:r>
-                    <w:t xml:space="preserve">26%</w:t>
+                    <w:t xml:space="preserve">65,185 (26.1%)</w:t>
+                  </w:r>
+                </w:p>
+              </w:tc>
+              <w:tc>
+                <w:tcPr/>
+                <w:p>
+                  <w:pPr>
+                    <w:pStyle w:val="Compact"/>
+                    <w:jc w:val="left"/>
+                    <w:jc w:val="center"/>
+                  </w:pPr>
+                  <w:r>
+                    <w:t xml:space="preserve">49,750 (26.0%)</w:t>
+                  </w:r>
+                </w:p>
+              </w:tc>
+              <w:tc>
+                <w:tcPr/>
+                <w:p>
+                  <w:pPr>
+                    <w:pStyle w:val="Compact"/>
+                    <w:jc w:val="left"/>
+                    <w:jc w:val="center"/>
+                  </w:pPr>
+                  <w:r>
+                    <w:t xml:space="preserve">15,435 (26.5%)</w:t>
                   </w:r>
                 </w:p>
               </w:tc>
@@ -3070,33 +3067,33 @@
                     <w:jc w:val="center"/>
                   </w:pPr>
                   <w:r>
-                    <w:t xml:space="preserve">64%</w:t>
-                  </w:r>
-                </w:p>
-              </w:tc>
-              <w:tc>
-                <w:tcPr/>
-                <w:p>
-                  <w:pPr>
-                    <w:pStyle w:val="Compact"/>
-                    <w:jc w:val="left"/>
-                    <w:jc w:val="center"/>
-                  </w:pPr>
-                  <w:r>
-                    <w:t xml:space="preserve">64%</w:t>
-                  </w:r>
-                </w:p>
-              </w:tc>
-              <w:tc>
-                <w:tcPr/>
-                <w:p>
-                  <w:pPr>
-                    <w:pStyle w:val="Compact"/>
-                    <w:jc w:val="left"/>
-                    <w:jc w:val="center"/>
-                  </w:pPr>
-                  <w:r>
-                    <w:t xml:space="preserve">62%</w:t>
+                    <w:t xml:space="preserve">158,935 (63.7%)</w:t>
+                  </w:r>
+                </w:p>
+              </w:tc>
+              <w:tc>
+                <w:tcPr/>
+                <w:p>
+                  <w:pPr>
+                    <w:pStyle w:val="Compact"/>
+                    <w:jc w:val="left"/>
+                    <w:jc w:val="center"/>
+                  </w:pPr>
+                  <w:r>
+                    <w:t xml:space="preserve">122,595 (64.1%)</w:t>
+                  </w:r>
+                </w:p>
+              </w:tc>
+              <w:tc>
+                <w:tcPr/>
+                <w:p>
+                  <w:pPr>
+                    <w:pStyle w:val="Compact"/>
+                    <w:jc w:val="left"/>
+                    <w:jc w:val="center"/>
+                  </w:pPr>
+                  <w:r>
+                    <w:t xml:space="preserve">36,340 (62.4%)</w:t>
                   </w:r>
                 </w:p>
               </w:tc>
@@ -3184,33 +3181,33 @@
                     <w:jc w:val="center"/>
                   </w:pPr>
                   <w:r>
-                    <w:t xml:space="preserve">2.2%</w:t>
-                  </w:r>
-                </w:p>
-              </w:tc>
-              <w:tc>
-                <w:tcPr/>
-                <w:p>
-                  <w:pPr>
-                    <w:pStyle w:val="Compact"/>
-                    <w:jc w:val="left"/>
-                    <w:jc w:val="center"/>
-                  </w:pPr>
-                  <w:r>
-                    <w:t xml:space="preserve">2.2%</w:t>
-                  </w:r>
-                </w:p>
-              </w:tc>
-              <w:tc>
-                <w:tcPr/>
-                <w:p>
-                  <w:pPr>
-                    <w:pStyle w:val="Compact"/>
-                    <w:jc w:val="left"/>
-                    <w:jc w:val="center"/>
-                  </w:pPr>
-                  <w:r>
-                    <w:t xml:space="preserve">2.4%</w:t>
+                    <w:t xml:space="preserve">5,605 (2.2%)</w:t>
+                  </w:r>
+                </w:p>
+              </w:tc>
+              <w:tc>
+                <w:tcPr/>
+                <w:p>
+                  <w:pPr>
+                    <w:pStyle w:val="Compact"/>
+                    <w:jc w:val="left"/>
+                    <w:jc w:val="center"/>
+                  </w:pPr>
+                  <w:r>
+                    <w:t xml:space="preserve">4,190 (2.2%)</w:t>
+                  </w:r>
+                </w:p>
+              </w:tc>
+              <w:tc>
+                <w:tcPr/>
+                <w:p>
+                  <w:pPr>
+                    <w:pStyle w:val="Compact"/>
+                    <w:jc w:val="left"/>
+                    <w:jc w:val="center"/>
+                  </w:pPr>
+                  <w:r>
+                    <w:t xml:space="preserve">1,415 (2.4%)</w:t>
                   </w:r>
                 </w:p>
               </w:tc>
@@ -3246,33 +3243,33 @@
                     <w:jc w:val="center"/>
                   </w:pPr>
                   <w:r>
-                    <w:t xml:space="preserve">9.8%</w:t>
-                  </w:r>
-                </w:p>
-              </w:tc>
-              <w:tc>
-                <w:tcPr/>
-                <w:p>
-                  <w:pPr>
-                    <w:pStyle w:val="Compact"/>
-                    <w:jc w:val="left"/>
-                    <w:jc w:val="center"/>
-                  </w:pPr>
-                  <w:r>
-                    <w:t xml:space="preserve">9.4%</w:t>
-                  </w:r>
-                </w:p>
-              </w:tc>
-              <w:tc>
-                <w:tcPr/>
-                <w:p>
-                  <w:pPr>
-                    <w:pStyle w:val="Compact"/>
-                    <w:jc w:val="left"/>
-                    <w:jc w:val="center"/>
-                  </w:pPr>
-                  <w:r>
-                    <w:t xml:space="preserve">11%</w:t>
+                    <w:t xml:space="preserve">24,335 (9.8%)</w:t>
+                  </w:r>
+                </w:p>
+              </w:tc>
+              <w:tc>
+                <w:tcPr/>
+                <w:p>
+                  <w:pPr>
+                    <w:pStyle w:val="Compact"/>
+                    <w:jc w:val="left"/>
+                    <w:jc w:val="center"/>
+                  </w:pPr>
+                  <w:r>
+                    <w:t xml:space="preserve">17,945 (9.4%)</w:t>
+                  </w:r>
+                </w:p>
+              </w:tc>
+              <w:tc>
+                <w:tcPr/>
+                <w:p>
+                  <w:pPr>
+                    <w:pStyle w:val="Compact"/>
+                    <w:jc w:val="left"/>
+                    <w:jc w:val="center"/>
+                  </w:pPr>
+                  <w:r>
+                    <w:t xml:space="preserve">6,390 (11.0%)</w:t>
                   </w:r>
                 </w:p>
               </w:tc>
@@ -3308,33 +3305,33 @@
                     <w:jc w:val="center"/>
                   </w:pPr>
                   <w:r>
-                    <w:t xml:space="preserve">88%</w:t>
-                  </w:r>
-                </w:p>
-              </w:tc>
-              <w:tc>
-                <w:tcPr/>
-                <w:p>
-                  <w:pPr>
-                    <w:pStyle w:val="Compact"/>
-                    <w:jc w:val="left"/>
-                    <w:jc w:val="center"/>
-                  </w:pPr>
-                  <w:r>
-                    <w:t xml:space="preserve">88%</w:t>
-                  </w:r>
-                </w:p>
-              </w:tc>
-              <w:tc>
-                <w:tcPr/>
-                <w:p>
-                  <w:pPr>
-                    <w:pStyle w:val="Compact"/>
-                    <w:jc w:val="left"/>
-                    <w:jc w:val="center"/>
-                  </w:pPr>
-                  <w:r>
-                    <w:t xml:space="preserve">87%</w:t>
+                    <w:t xml:space="preserve">219,630 (88.0%)</w:t>
+                  </w:r>
+                </w:p>
+              </w:tc>
+              <w:tc>
+                <w:tcPr/>
+                <w:p>
+                  <w:pPr>
+                    <w:pStyle w:val="Compact"/>
+                    <w:jc w:val="left"/>
+                    <w:jc w:val="center"/>
+                  </w:pPr>
+                  <w:r>
+                    <w:t xml:space="preserve">169,165 (88.4%)</w:t>
+                  </w:r>
+                </w:p>
+              </w:tc>
+              <w:tc>
+                <w:tcPr/>
+                <w:p>
+                  <w:pPr>
+                    <w:pStyle w:val="Compact"/>
+                    <w:jc w:val="left"/>
+                    <w:jc w:val="center"/>
+                  </w:pPr>
+                  <w:r>
+                    <w:t xml:space="preserve">50,465 (86.6%)</w:t>
                   </w:r>
                 </w:p>
               </w:tc>
@@ -3422,33 +3419,33 @@
                     <w:jc w:val="center"/>
                   </w:pPr>
                   <w:r>
-                    <w:t xml:space="preserve">24%</w:t>
-                  </w:r>
-                </w:p>
-              </w:tc>
-              <w:tc>
-                <w:tcPr/>
-                <w:p>
-                  <w:pPr>
-                    <w:pStyle w:val="Compact"/>
-                    <w:jc w:val="left"/>
-                    <w:jc w:val="center"/>
-                  </w:pPr>
-                  <w:r>
-                    <w:t xml:space="preserve">25%</w:t>
-                  </w:r>
-                </w:p>
-              </w:tc>
-              <w:tc>
-                <w:tcPr/>
-                <w:p>
-                  <w:pPr>
-                    <w:pStyle w:val="Compact"/>
-                    <w:jc w:val="left"/>
-                    <w:jc w:val="center"/>
-                  </w:pPr>
-                  <w:r>
-                    <w:t xml:space="preserve">19%</w:t>
+                    <w:t xml:space="preserve">59,690 (23.9%)</w:t>
+                  </w:r>
+                </w:p>
+              </w:tc>
+              <w:tc>
+                <w:tcPr/>
+                <w:p>
+                  <w:pPr>
+                    <w:pStyle w:val="Compact"/>
+                    <w:jc w:val="left"/>
+                    <w:jc w:val="center"/>
+                  </w:pPr>
+                  <w:r>
+                    <w:t xml:space="preserve">48,555 (25.4%)</w:t>
+                  </w:r>
+                </w:p>
+              </w:tc>
+              <w:tc>
+                <w:tcPr/>
+                <w:p>
+                  <w:pPr>
+                    <w:pStyle w:val="Compact"/>
+                    <w:jc w:val="left"/>
+                    <w:jc w:val="center"/>
+                  </w:pPr>
+                  <w:r>
+                    <w:t xml:space="preserve">11,135 (19.1%)</w:t>
                   </w:r>
                 </w:p>
               </w:tc>
@@ -3484,33 +3481,33 @@
                     <w:jc w:val="center"/>
                   </w:pPr>
                   <w:r>
-                    <w:t xml:space="preserve">7.0%</w:t>
-                  </w:r>
-                </w:p>
-              </w:tc>
-              <w:tc>
-                <w:tcPr/>
-                <w:p>
-                  <w:pPr>
-                    <w:pStyle w:val="Compact"/>
-                    <w:jc w:val="left"/>
-                    <w:jc w:val="center"/>
-                  </w:pPr>
-                  <w:r>
-                    <w:t xml:space="preserve">6.9%</w:t>
-                  </w:r>
-                </w:p>
-              </w:tc>
-              <w:tc>
-                <w:tcPr/>
-                <w:p>
-                  <w:pPr>
-                    <w:pStyle w:val="Compact"/>
-                    <w:jc w:val="left"/>
-                    <w:jc w:val="center"/>
-                  </w:pPr>
-                  <w:r>
-                    <w:t xml:space="preserve">7.2%</w:t>
+                    <w:t xml:space="preserve">17,425 (7.0%)</w:t>
+                  </w:r>
+                </w:p>
+              </w:tc>
+              <w:tc>
+                <w:tcPr/>
+                <w:p>
+                  <w:pPr>
+                    <w:pStyle w:val="Compact"/>
+                    <w:jc w:val="left"/>
+                    <w:jc w:val="center"/>
+                  </w:pPr>
+                  <w:r>
+                    <w:t xml:space="preserve">13,230 (6.9%)</w:t>
+                  </w:r>
+                </w:p>
+              </w:tc>
+              <w:tc>
+                <w:tcPr/>
+                <w:p>
+                  <w:pPr>
+                    <w:pStyle w:val="Compact"/>
+                    <w:jc w:val="left"/>
+                    <w:jc w:val="center"/>
+                  </w:pPr>
+                  <w:r>
+                    <w:t xml:space="preserve">4,195 (7.2%)</w:t>
                   </w:r>
                 </w:p>
               </w:tc>
@@ -3546,33 +3543,33 @@
                     <w:jc w:val="center"/>
                   </w:pPr>
                   <w:r>
-                    <w:t xml:space="preserve">4.1%</w:t>
-                  </w:r>
-                </w:p>
-              </w:tc>
-              <w:tc>
-                <w:tcPr/>
-                <w:p>
-                  <w:pPr>
-                    <w:pStyle w:val="Compact"/>
-                    <w:jc w:val="left"/>
-                    <w:jc w:val="center"/>
-                  </w:pPr>
-                  <w:r>
-                    <w:t xml:space="preserve">4.2%</w:t>
-                  </w:r>
-                </w:p>
-              </w:tc>
-              <w:tc>
-                <w:tcPr/>
-                <w:p>
-                  <w:pPr>
-                    <w:pStyle w:val="Compact"/>
-                    <w:jc w:val="left"/>
-                    <w:jc w:val="center"/>
-                  </w:pPr>
-                  <w:r>
-                    <w:t xml:space="preserve">3.8%</w:t>
+                    <w:t xml:space="preserve">10,290 (4.1%)</w:t>
+                  </w:r>
+                </w:p>
+              </w:tc>
+              <w:tc>
+                <w:tcPr/>
+                <w:p>
+                  <w:pPr>
+                    <w:pStyle w:val="Compact"/>
+                    <w:jc w:val="left"/>
+                    <w:jc w:val="center"/>
+                  </w:pPr>
+                  <w:r>
+                    <w:t xml:space="preserve">8,075 (4.2%)</w:t>
+                  </w:r>
+                </w:p>
+              </w:tc>
+              <w:tc>
+                <w:tcPr/>
+                <w:p>
+                  <w:pPr>
+                    <w:pStyle w:val="Compact"/>
+                    <w:jc w:val="left"/>
+                    <w:jc w:val="center"/>
+                  </w:pPr>
+                  <w:r>
+                    <w:t xml:space="preserve">2,215 (3.8%)</w:t>
                   </w:r>
                 </w:p>
               </w:tc>
@@ -3608,33 +3605,33 @@
                     <w:jc w:val="center"/>
                   </w:pPr>
                   <w:r>
-                    <w:t xml:space="preserve">41%</w:t>
-                  </w:r>
-                </w:p>
-              </w:tc>
-              <w:tc>
-                <w:tcPr/>
-                <w:p>
-                  <w:pPr>
-                    <w:pStyle w:val="Compact"/>
-                    <w:jc w:val="left"/>
-                    <w:jc w:val="center"/>
-                  </w:pPr>
-                  <w:r>
-                    <w:t xml:space="preserve">39%</w:t>
-                  </w:r>
-                </w:p>
-              </w:tc>
-              <w:tc>
-                <w:tcPr/>
-                <w:p>
-                  <w:pPr>
-                    <w:pStyle w:val="Compact"/>
-                    <w:jc w:val="left"/>
-                    <w:jc w:val="center"/>
-                  </w:pPr>
-                  <w:r>
-                    <w:t xml:space="preserve">47%</w:t>
+                    <w:t xml:space="preserve">102,945 (41.2%)</w:t>
+                  </w:r>
+                </w:p>
+              </w:tc>
+              <w:tc>
+                <w:tcPr/>
+                <w:p>
+                  <w:pPr>
+                    <w:pStyle w:val="Compact"/>
+                    <w:jc w:val="left"/>
+                    <w:jc w:val="center"/>
+                  </w:pPr>
+                  <w:r>
+                    <w:t xml:space="preserve">75,315 (39.4%)</w:t>
+                  </w:r>
+                </w:p>
+              </w:tc>
+              <w:tc>
+                <w:tcPr/>
+                <w:p>
+                  <w:pPr>
+                    <w:pStyle w:val="Compact"/>
+                    <w:jc w:val="left"/>
+                    <w:jc w:val="center"/>
+                  </w:pPr>
+                  <w:r>
+                    <w:t xml:space="preserve">27,630 (47.4%)</w:t>
                   </w:r>
                 </w:p>
               </w:tc>
@@ -3670,33 +3667,33 @@
                     <w:jc w:val="center"/>
                   </w:pPr>
                   <w:r>
-                    <w:t xml:space="preserve">24%</w:t>
-                  </w:r>
-                </w:p>
-              </w:tc>
-              <w:tc>
-                <w:tcPr/>
-                <w:p>
-                  <w:pPr>
-                    <w:pStyle w:val="Compact"/>
-                    <w:jc w:val="left"/>
-                    <w:jc w:val="center"/>
-                  </w:pPr>
-                  <w:r>
-                    <w:t xml:space="preserve">24%</w:t>
-                  </w:r>
-                </w:p>
-              </w:tc>
-              <w:tc>
-                <w:tcPr/>
-                <w:p>
-                  <w:pPr>
-                    <w:pStyle w:val="Compact"/>
-                    <w:jc w:val="left"/>
-                    <w:jc w:val="center"/>
-                  </w:pPr>
-                  <w:r>
-                    <w:t xml:space="preserve">22%</w:t>
+                    <w:t xml:space="preserve">59,220 (23.7%)</w:t>
+                  </w:r>
+                </w:p>
+              </w:tc>
+              <w:tc>
+                <w:tcPr/>
+                <w:p>
+                  <w:pPr>
+                    <w:pStyle w:val="Compact"/>
+                    <w:jc w:val="left"/>
+                    <w:jc w:val="center"/>
+                  </w:pPr>
+                  <w:r>
+                    <w:t xml:space="preserve">46,125 (24.1%)</w:t>
+                  </w:r>
+                </w:p>
+              </w:tc>
+              <w:tc>
+                <w:tcPr/>
+                <w:p>
+                  <w:pPr>
+                    <w:pStyle w:val="Compact"/>
+                    <w:jc w:val="left"/>
+                    <w:jc w:val="center"/>
+                  </w:pPr>
+                  <w:r>
+                    <w:t xml:space="preserve">13,095 (22.5%)</w:t>
                   </w:r>
                 </w:p>
               </w:tc>
@@ -3732,33 +3729,33 @@
                     <w:jc w:val="center"/>
                   </w:pPr>
                   <w:r>
-                    <w:t xml:space="preserve">20%</w:t>
-                  </w:r>
-                </w:p>
-              </w:tc>
-              <w:tc>
-                <w:tcPr/>
-                <w:p>
-                  <w:pPr>
-                    <w:pStyle w:val="Compact"/>
-                    <w:jc w:val="left"/>
-                    <w:jc w:val="center"/>
-                  </w:pPr>
-                  <w:r>
-                    <w:t xml:space="preserve">22%</w:t>
-                  </w:r>
-                </w:p>
-              </w:tc>
-              <w:tc>
-                <w:tcPr/>
-                <w:p>
-                  <w:pPr>
-                    <w:pStyle w:val="Compact"/>
-                    <w:jc w:val="left"/>
-                    <w:jc w:val="center"/>
-                  </w:pPr>
-                  <w:r>
-                    <w:t xml:space="preserve">16%</w:t>
+                    <w:t xml:space="preserve">50,520 (20.2%)</w:t>
+                  </w:r>
+                </w:p>
+              </w:tc>
+              <w:tc>
+                <w:tcPr/>
+                <w:p>
+                  <w:pPr>
+                    <w:pStyle w:val="Compact"/>
+                    <w:jc w:val="left"/>
+                    <w:jc w:val="center"/>
+                  </w:pPr>
+                  <w:r>
+                    <w:t xml:space="preserve">41,215 (21.5%)</w:t>
+                  </w:r>
+                </w:p>
+              </w:tc>
+              <w:tc>
+                <w:tcPr/>
+                <w:p>
+                  <w:pPr>
+                    <w:pStyle w:val="Compact"/>
+                    <w:jc w:val="left"/>
+                    <w:jc w:val="center"/>
+                  </w:pPr>
+                  <w:r>
+                    <w:t xml:space="preserve">9,305 (16.0%)</w:t>
                   </w:r>
                 </w:p>
               </w:tc>
@@ -3799,33 +3796,33 @@
                     <w:jc w:val="center"/>
                   </w:pPr>
                   <w:r>
-                    <w:t xml:space="preserve">45%</w:t>
-                  </w:r>
-                </w:p>
-              </w:tc>
-              <w:tc>
-                <w:tcPr/>
-                <w:p>
-                  <w:pPr>
-                    <w:pStyle w:val="Compact"/>
-                    <w:jc w:val="left"/>
-                    <w:jc w:val="center"/>
-                  </w:pPr>
-                  <w:r>
-                    <w:t xml:space="preserve">48%</w:t>
-                  </w:r>
-                </w:p>
-              </w:tc>
-              <w:tc>
-                <w:tcPr/>
-                <w:p>
-                  <w:pPr>
-                    <w:pStyle w:val="Compact"/>
-                    <w:jc w:val="left"/>
-                    <w:jc w:val="center"/>
-                  </w:pPr>
-                  <w:r>
-                    <w:t xml:space="preserve">38%</w:t>
+                    <w:t xml:space="preserve">113,500 (45.5%)</w:t>
+                  </w:r>
+                </w:p>
+              </w:tc>
+              <w:tc>
+                <w:tcPr/>
+                <w:p>
+                  <w:pPr>
+                    <w:pStyle w:val="Compact"/>
+                    <w:jc w:val="left"/>
+                    <w:jc w:val="center"/>
+                  </w:pPr>
+                  <w:r>
+                    <w:t xml:space="preserve">91,155 (47.7%)</w:t>
+                  </w:r>
+                </w:p>
+              </w:tc>
+              <w:tc>
+                <w:tcPr/>
+                <w:p>
+                  <w:pPr>
+                    <w:pStyle w:val="Compact"/>
+                    <w:jc w:val="left"/>
+                    <w:jc w:val="center"/>
+                  </w:pPr>
+                  <w:r>
+                    <w:t xml:space="preserve">22,345 (38.3%)</w:t>
                   </w:r>
                 </w:p>
               </w:tc>
@@ -3866,33 +3863,33 @@
                     <w:jc w:val="center"/>
                   </w:pPr>
                   <w:r>
-                    <w:t xml:space="preserve">68%</w:t>
-                  </w:r>
-                </w:p>
-              </w:tc>
-              <w:tc>
-                <w:tcPr/>
-                <w:p>
-                  <w:pPr>
-                    <w:pStyle w:val="Compact"/>
-                    <w:jc w:val="left"/>
-                    <w:jc w:val="center"/>
-                  </w:pPr>
-                  <w:r>
-                    <w:t xml:space="preserve">68%</w:t>
-                  </w:r>
-                </w:p>
-              </w:tc>
-              <w:tc>
-                <w:tcPr/>
-                <w:p>
-                  <w:pPr>
-                    <w:pStyle w:val="Compact"/>
-                    <w:jc w:val="left"/>
-                    <w:jc w:val="center"/>
-                  </w:pPr>
-                  <w:r>
-                    <w:t xml:space="preserve">67%</w:t>
+                    <w:t xml:space="preserve">169,495 (67.9%)</w:t>
+                  </w:r>
+                </w:p>
+              </w:tc>
+              <w:tc>
+                <w:tcPr/>
+                <w:p>
+                  <w:pPr>
+                    <w:pStyle w:val="Compact"/>
+                    <w:jc w:val="left"/>
+                    <w:jc w:val="center"/>
+                  </w:pPr>
+                  <w:r>
+                    <w:t xml:space="preserve">130,580 (68.3%)</w:t>
+                  </w:r>
+                </w:p>
+              </w:tc>
+              <w:tc>
+                <w:tcPr/>
+                <w:p>
+                  <w:pPr>
+                    <w:pStyle w:val="Compact"/>
+                    <w:jc w:val="left"/>
+                    <w:jc w:val="center"/>
+                  </w:pPr>
+                  <w:r>
+                    <w:t xml:space="preserve">38,915 (66.8%)</w:t>
                   </w:r>
                 </w:p>
               </w:tc>
@@ -3985,33 +3982,33 @@
                     <w:jc w:val="center"/>
                   </w:pPr>
                   <w:r>
-                    <w:t xml:space="preserve">35%</w:t>
-                  </w:r>
-                </w:p>
-              </w:tc>
-              <w:tc>
-                <w:tcPr/>
-                <w:p>
-                  <w:pPr>
-                    <w:pStyle w:val="Compact"/>
-                    <w:jc w:val="left"/>
-                    <w:jc w:val="center"/>
-                  </w:pPr>
-                  <w:r>
-                    <w:t xml:space="preserve">39%</w:t>
-                  </w:r>
-                </w:p>
-              </w:tc>
-              <w:tc>
-                <w:tcPr/>
-                <w:p>
-                  <w:pPr>
-                    <w:pStyle w:val="Compact"/>
-                    <w:jc w:val="left"/>
-                    <w:jc w:val="center"/>
-                  </w:pPr>
-                  <w:r>
-                    <w:t xml:space="preserve">23%</w:t>
+                    <w:t xml:space="preserve">88,240 (35.4%)</w:t>
+                  </w:r>
+                </w:p>
+              </w:tc>
+              <w:tc>
+                <w:tcPr/>
+                <w:p>
+                  <w:pPr>
+                    <w:pStyle w:val="Compact"/>
+                    <w:jc w:val="left"/>
+                    <w:jc w:val="center"/>
+                  </w:pPr>
+                  <w:r>
+                    <w:t xml:space="preserve">74,960 (39.2%)</w:t>
+                  </w:r>
+                </w:p>
+              </w:tc>
+              <w:tc>
+                <w:tcPr/>
+                <w:p>
+                  <w:pPr>
+                    <w:pStyle w:val="Compact"/>
+                    <w:jc w:val="left"/>
+                    <w:jc w:val="center"/>
+                  </w:pPr>
+                  <w:r>
+                    <w:t xml:space="preserve">13,280 (22.8%)</w:t>
                   </w:r>
                 </w:p>
               </w:tc>
@@ -4047,33 +4044,33 @@
                     <w:jc w:val="center"/>
                   </w:pPr>
                   <w:r>
-                    <w:t xml:space="preserve">29%</w:t>
-                  </w:r>
-                </w:p>
-              </w:tc>
-              <w:tc>
-                <w:tcPr/>
-                <w:p>
-                  <w:pPr>
-                    <w:pStyle w:val="Compact"/>
-                    <w:jc w:val="left"/>
-                    <w:jc w:val="center"/>
-                  </w:pPr>
-                  <w:r>
-                    <w:t xml:space="preserve">28%</w:t>
-                  </w:r>
-                </w:p>
-              </w:tc>
-              <w:tc>
-                <w:tcPr/>
-                <w:p>
-                  <w:pPr>
-                    <w:pStyle w:val="Compact"/>
-                    <w:jc w:val="left"/>
-                    <w:jc w:val="center"/>
-                  </w:pPr>
-                  <w:r>
-                    <w:t xml:space="preserve">31%</w:t>
+                    <w:t xml:space="preserve">72,700 (29.1%)</w:t>
+                  </w:r>
+                </w:p>
+              </w:tc>
+              <w:tc>
+                <w:tcPr/>
+                <w:p>
+                  <w:pPr>
+                    <w:pStyle w:val="Compact"/>
+                    <w:jc w:val="left"/>
+                    <w:jc w:val="center"/>
+                  </w:pPr>
+                  <w:r>
+                    <w:t xml:space="preserve">54,345 (28.4%)</w:t>
+                  </w:r>
+                </w:p>
+              </w:tc>
+              <w:tc>
+                <w:tcPr/>
+                <w:p>
+                  <w:pPr>
+                    <w:pStyle w:val="Compact"/>
+                    <w:jc w:val="left"/>
+                    <w:jc w:val="center"/>
+                  </w:pPr>
+                  <w:r>
+                    <w:t xml:space="preserve">18,355 (31.5%)</w:t>
                   </w:r>
                 </w:p>
               </w:tc>
@@ -4109,33 +4106,33 @@
                     <w:jc w:val="center"/>
                   </w:pPr>
                   <w:r>
-                    <w:t xml:space="preserve">19%</w:t>
-                  </w:r>
-                </w:p>
-              </w:tc>
-              <w:tc>
-                <w:tcPr/>
-                <w:p>
-                  <w:pPr>
-                    <w:pStyle w:val="Compact"/>
-                    <w:jc w:val="left"/>
-                    <w:jc w:val="center"/>
-                  </w:pPr>
-                  <w:r>
-                    <w:t xml:space="preserve">17%</w:t>
-                  </w:r>
-                </w:p>
-              </w:tc>
-              <w:tc>
-                <w:tcPr/>
-                <w:p>
-                  <w:pPr>
-                    <w:pStyle w:val="Compact"/>
-                    <w:jc w:val="left"/>
-                    <w:jc w:val="center"/>
-                  </w:pPr>
-                  <w:r>
-                    <w:t xml:space="preserve">24%</w:t>
+                    <w:t xml:space="preserve">46,225 (18.5%)</w:t>
+                  </w:r>
+                </w:p>
+              </w:tc>
+              <w:tc>
+                <w:tcPr/>
+                <w:p>
+                  <w:pPr>
+                    <w:pStyle w:val="Compact"/>
+                    <w:jc w:val="left"/>
+                    <w:jc w:val="center"/>
+                  </w:pPr>
+                  <w:r>
+                    <w:t xml:space="preserve">32,285 (16.9%)</w:t>
+                  </w:r>
+                </w:p>
+              </w:tc>
+              <w:tc>
+                <w:tcPr/>
+                <w:p>
+                  <w:pPr>
+                    <w:pStyle w:val="Compact"/>
+                    <w:jc w:val="left"/>
+                    <w:jc w:val="center"/>
+                  </w:pPr>
+                  <w:r>
+                    <w:t xml:space="preserve">13,940 (23.9%)</w:t>
                   </w:r>
                 </w:p>
               </w:tc>
@@ -4171,33 +4168,33 @@
                     <w:jc w:val="center"/>
                   </w:pPr>
                   <w:r>
-                    <w:t xml:space="preserve">17%</w:t>
-                  </w:r>
-                </w:p>
-              </w:tc>
-              <w:tc>
-                <w:tcPr/>
-                <w:p>
-                  <w:pPr>
-                    <w:pStyle w:val="Compact"/>
-                    <w:jc w:val="left"/>
-                    <w:jc w:val="center"/>
-                  </w:pPr>
-                  <w:r>
-                    <w:t xml:space="preserve">16%</w:t>
-                  </w:r>
-                </w:p>
-              </w:tc>
-              <w:tc>
-                <w:tcPr/>
-                <w:p>
-                  <w:pPr>
-                    <w:pStyle w:val="Compact"/>
-                    <w:jc w:val="left"/>
-                    <w:jc w:val="center"/>
-                  </w:pPr>
-                  <w:r>
-                    <w:t xml:space="preserve">22%</w:t>
+                    <w:t xml:space="preserve">42,405 (17.0%)</w:t>
+                  </w:r>
+                </w:p>
+              </w:tc>
+              <w:tc>
+                <w:tcPr/>
+                <w:p>
+                  <w:pPr>
+                    <w:pStyle w:val="Compact"/>
+                    <w:jc w:val="left"/>
+                    <w:jc w:val="center"/>
+                  </w:pPr>
+                  <w:r>
+                    <w:t xml:space="preserve">29,710 (15.5%)</w:t>
+                  </w:r>
+                </w:p>
+              </w:tc>
+              <w:tc>
+                <w:tcPr/>
+                <w:p>
+                  <w:pPr>
+                    <w:pStyle w:val="Compact"/>
+                    <w:jc w:val="left"/>
+                    <w:jc w:val="center"/>
+                  </w:pPr>
+                  <w:r>
+                    <w:t xml:space="preserve">12,695 (21.8%)</w:t>
                   </w:r>
                 </w:p>
               </w:tc>
@@ -4233,33 +4230,33 @@
                     <w:jc w:val="center"/>
                   </w:pPr>
                   <w:r>
-                    <w:t xml:space="preserve">44%</w:t>
-                  </w:r>
-                </w:p>
-              </w:tc>
-              <w:tc>
-                <w:tcPr/>
-                <w:p>
-                  <w:pPr>
-                    <w:pStyle w:val="Compact"/>
-                    <w:jc w:val="left"/>
-                    <w:jc w:val="center"/>
-                  </w:pPr>
-                  <w:r>
-                    <w:t xml:space="preserve">41%</w:t>
-                  </w:r>
-                </w:p>
-              </w:tc>
-              <w:tc>
-                <w:tcPr/>
-                <w:p>
-                  <w:pPr>
-                    <w:pStyle w:val="Compact"/>
-                    <w:jc w:val="left"/>
-                    <w:jc w:val="center"/>
-                  </w:pPr>
-                  <w:r>
-                    <w:t xml:space="preserve">54%</w:t>
+                    <w:t xml:space="preserve">110,430 (44.2%)</w:t>
+                  </w:r>
+                </w:p>
+              </w:tc>
+              <w:tc>
+                <w:tcPr/>
+                <w:p>
+                  <w:pPr>
+                    <w:pStyle w:val="Compact"/>
+                    <w:jc w:val="left"/>
+                    <w:jc w:val="center"/>
+                  </w:pPr>
+                  <w:r>
+                    <w:t xml:space="preserve">78,965 (41.3%)</w:t>
+                  </w:r>
+                </w:p>
+              </w:tc>
+              <w:tc>
+                <w:tcPr/>
+                <w:p>
+                  <w:pPr>
+                    <w:pStyle w:val="Compact"/>
+                    <w:jc w:val="left"/>
+                    <w:jc w:val="center"/>
+                  </w:pPr>
+                  <w:r>
+                    <w:t xml:space="preserve">31,465 (54.0%)</w:t>
                   </w:r>
                 </w:p>
               </w:tc>
@@ -4300,33 +4297,33 @@
                     <w:jc w:val="center"/>
                   </w:pPr>
                   <w:r>
-                    <w:t xml:space="preserve">11%</w:t>
-                  </w:r>
-                </w:p>
-              </w:tc>
-              <w:tc>
-                <w:tcPr/>
-                <w:p>
-                  <w:pPr>
-                    <w:pStyle w:val="Compact"/>
-                    <w:jc w:val="left"/>
-                    <w:jc w:val="center"/>
-                  </w:pPr>
-                  <w:r>
-                    <w:t xml:space="preserve">11%</w:t>
-                  </w:r>
-                </w:p>
-              </w:tc>
-              <w:tc>
-                <w:tcPr/>
-                <w:p>
-                  <w:pPr>
-                    <w:pStyle w:val="Compact"/>
-                    <w:jc w:val="left"/>
-                    <w:jc w:val="center"/>
-                  </w:pPr>
-                  <w:r>
-                    <w:t xml:space="preserve">11%</w:t>
+                    <w:t xml:space="preserve">26,935 (10.8%)</w:t>
+                  </w:r>
+                </w:p>
+              </w:tc>
+              <w:tc>
+                <w:tcPr/>
+                <w:p>
+                  <w:pPr>
+                    <w:pStyle w:val="Compact"/>
+                    <w:jc w:val="left"/>
+                    <w:jc w:val="center"/>
+                  </w:pPr>
+                  <w:r>
+                    <w:t xml:space="preserve">20,550 (10.7%)</w:t>
+                  </w:r>
+                </w:p>
+              </w:tc>
+              <w:tc>
+                <w:tcPr/>
+                <w:p>
+                  <w:pPr>
+                    <w:pStyle w:val="Compact"/>
+                    <w:jc w:val="left"/>
+                    <w:jc w:val="center"/>
+                  </w:pPr>
+                  <w:r>
+                    <w:t xml:space="preserve">6,385 (11.0%)</w:t>
                   </w:r>
                 </w:p>
               </w:tc>
@@ -4367,33 +4364,33 @@
                     <w:jc w:val="center"/>
                   </w:pPr>
                   <w:r>
-                    <w:t xml:space="preserve">12%</w:t>
-                  </w:r>
-                </w:p>
-              </w:tc>
-              <w:tc>
-                <w:tcPr/>
-                <w:p>
-                  <w:pPr>
-                    <w:pStyle w:val="Compact"/>
-                    <w:jc w:val="left"/>
-                    <w:jc w:val="center"/>
-                  </w:pPr>
-                  <w:r>
-                    <w:t xml:space="preserve">12%</w:t>
-                  </w:r>
-                </w:p>
-              </w:tc>
-              <w:tc>
-                <w:tcPr/>
-                <w:p>
-                  <w:pPr>
-                    <w:pStyle w:val="Compact"/>
-                    <w:jc w:val="left"/>
-                    <w:jc w:val="center"/>
-                  </w:pPr>
-                  <w:r>
-                    <w:t xml:space="preserve">14%</w:t>
+                    <w:t xml:space="preserve">30,550 (12.2%)</w:t>
+                  </w:r>
+                </w:p>
+              </w:tc>
+              <w:tc>
+                <w:tcPr/>
+                <w:p>
+                  <w:pPr>
+                    <w:pStyle w:val="Compact"/>
+                    <w:jc w:val="left"/>
+                    <w:jc w:val="center"/>
+                  </w:pPr>
+                  <w:r>
+                    <w:t xml:space="preserve">22,120 (11.6%)</w:t>
+                  </w:r>
+                </w:p>
+              </w:tc>
+              <w:tc>
+                <w:tcPr/>
+                <w:p>
+                  <w:pPr>
+                    <w:pStyle w:val="Compact"/>
+                    <w:jc w:val="left"/>
+                    <w:jc w:val="center"/>
+                  </w:pPr>
+                  <w:r>
+                    <w:t xml:space="preserve">8,430 (14.5%)</w:t>
                   </w:r>
                 </w:p>
               </w:tc>
@@ -4434,33 +4431,33 @@
                     <w:jc w:val="center"/>
                   </w:pPr>
                   <w:r>
-                    <w:t xml:space="preserve">4.9%</w:t>
-                  </w:r>
-                </w:p>
-              </w:tc>
-              <w:tc>
-                <w:tcPr/>
-                <w:p>
-                  <w:pPr>
-                    <w:pStyle w:val="Compact"/>
-                    <w:jc w:val="left"/>
-                    <w:jc w:val="center"/>
-                  </w:pPr>
-                  <w:r>
-                    <w:t xml:space="preserve">4.3%</w:t>
-                  </w:r>
-                </w:p>
-              </w:tc>
-              <w:tc>
-                <w:tcPr/>
-                <w:p>
-                  <w:pPr>
-                    <w:pStyle w:val="Compact"/>
-                    <w:jc w:val="left"/>
-                    <w:jc w:val="center"/>
-                  </w:pPr>
-                  <w:r>
-                    <w:t xml:space="preserve">6.7%</w:t>
+                    <w:t xml:space="preserve">12,130 (4.9%)</w:t>
+                  </w:r>
+                </w:p>
+              </w:tc>
+              <w:tc>
+                <w:tcPr/>
+                <w:p>
+                  <w:pPr>
+                    <w:pStyle w:val="Compact"/>
+                    <w:jc w:val="left"/>
+                    <w:jc w:val="center"/>
+                  </w:pPr>
+                  <w:r>
+                    <w:t xml:space="preserve">8,245 (4.3%)</w:t>
+                  </w:r>
+                </w:p>
+              </w:tc>
+              <w:tc>
+                <w:tcPr/>
+                <w:p>
+                  <w:pPr>
+                    <w:pStyle w:val="Compact"/>
+                    <w:jc w:val="left"/>
+                    <w:jc w:val="center"/>
+                  </w:pPr>
+                  <w:r>
+                    <w:t xml:space="preserve">3,885 (6.7%)</w:t>
                   </w:r>
                 </w:p>
               </w:tc>
@@ -4501,33 +4498,33 @@
                     <w:jc w:val="center"/>
                   </w:pPr>
                   <w:r>
-                    <w:t xml:space="preserve">3.1%</w:t>
-                  </w:r>
-                </w:p>
-              </w:tc>
-              <w:tc>
-                <w:tcPr/>
-                <w:p>
-                  <w:pPr>
-                    <w:pStyle w:val="Compact"/>
-                    <w:jc w:val="left"/>
-                    <w:jc w:val="center"/>
-                  </w:pPr>
-                  <w:r>
-                    <w:t xml:space="preserve">3.2%</w:t>
-                  </w:r>
-                </w:p>
-              </w:tc>
-              <w:tc>
-                <w:tcPr/>
-                <w:p>
-                  <w:pPr>
-                    <w:pStyle w:val="Compact"/>
-                    <w:jc w:val="left"/>
-                    <w:jc w:val="center"/>
-                  </w:pPr>
-                  <w:r>
-                    <w:t xml:space="preserve">3.0%</w:t>
+                    <w:t xml:space="preserve">7,815 (3.1%)</w:t>
+                  </w:r>
+                </w:p>
+              </w:tc>
+              <w:tc>
+                <w:tcPr/>
+                <w:p>
+                  <w:pPr>
+                    <w:pStyle w:val="Compact"/>
+                    <w:jc w:val="left"/>
+                    <w:jc w:val="center"/>
+                  </w:pPr>
+                  <w:r>
+                    <w:t xml:space="preserve">6,055 (3.2%)</w:t>
+                  </w:r>
+                </w:p>
+              </w:tc>
+              <w:tc>
+                <w:tcPr/>
+                <w:p>
+                  <w:pPr>
+                    <w:pStyle w:val="Compact"/>
+                    <w:jc w:val="left"/>
+                    <w:jc w:val="center"/>
+                  </w:pPr>
+                  <w:r>
+                    <w:t xml:space="preserve">1,760 (3.0%)</w:t>
                   </w:r>
                 </w:p>
               </w:tc>
@@ -4568,33 +4565,33 @@
                     <w:jc w:val="center"/>
                   </w:pPr>
                   <w:r>
-                    <w:t xml:space="preserve">13%</w:t>
-                  </w:r>
-                </w:p>
-              </w:tc>
-              <w:tc>
-                <w:tcPr/>
-                <w:p>
-                  <w:pPr>
-                    <w:pStyle w:val="Compact"/>
-                    <w:jc w:val="left"/>
-                    <w:jc w:val="center"/>
-                  </w:pPr>
-                  <w:r>
-                    <w:t xml:space="preserve">12%</w:t>
-                  </w:r>
-                </w:p>
-              </w:tc>
-              <w:tc>
-                <w:tcPr/>
-                <w:p>
-                  <w:pPr>
-                    <w:pStyle w:val="Compact"/>
-                    <w:jc w:val="left"/>
-                    <w:jc w:val="center"/>
-                  </w:pPr>
-                  <w:r>
-                    <w:t xml:space="preserve">18%</w:t>
+                    <w:t xml:space="preserve">33,620 (13.5%)</w:t>
+                  </w:r>
+                </w:p>
+              </w:tc>
+              <w:tc>
+                <w:tcPr/>
+                <w:p>
+                  <w:pPr>
+                    <w:pStyle w:val="Compact"/>
+                    <w:jc w:val="left"/>
+                    <w:jc w:val="center"/>
+                  </w:pPr>
+                  <w:r>
+                    <w:t xml:space="preserve">23,235 (12.1%)</w:t>
+                  </w:r>
+                </w:p>
+              </w:tc>
+              <w:tc>
+                <w:tcPr/>
+                <w:p>
+                  <w:pPr>
+                    <w:pStyle w:val="Compact"/>
+                    <w:jc w:val="left"/>
+                    <w:jc w:val="center"/>
+                  </w:pPr>
+                  <w:r>
+                    <w:t xml:space="preserve">10,385 (17.8%)</w:t>
                   </w:r>
                 </w:p>
               </w:tc>
@@ -4635,33 +4632,33 @@
                     <w:jc w:val="center"/>
                   </w:pPr>
                   <w:r>
-                    <w:t xml:space="preserve">5.6%</w:t>
-                  </w:r>
-                </w:p>
-              </w:tc>
-              <w:tc>
-                <w:tcPr/>
-                <w:p>
-                  <w:pPr>
-                    <w:pStyle w:val="Compact"/>
-                    <w:jc w:val="left"/>
-                    <w:jc w:val="center"/>
-                  </w:pPr>
-                  <w:r>
-                    <w:t xml:space="preserve">5.6%</w:t>
-                  </w:r>
-                </w:p>
-              </w:tc>
-              <w:tc>
-                <w:tcPr/>
-                <w:p>
-                  <w:pPr>
-                    <w:pStyle w:val="Compact"/>
-                    <w:jc w:val="left"/>
-                    <w:jc w:val="center"/>
-                  </w:pPr>
-                  <w:r>
-                    <w:t xml:space="preserve">5.4%</w:t>
+                    <w:t xml:space="preserve">13,865 (5.6%)</w:t>
+                  </w:r>
+                </w:p>
+              </w:tc>
+              <w:tc>
+                <w:tcPr/>
+                <w:p>
+                  <w:pPr>
+                    <w:pStyle w:val="Compact"/>
+                    <w:jc w:val="left"/>
+                    <w:jc w:val="center"/>
+                  </w:pPr>
+                  <w:r>
+                    <w:t xml:space="preserve">10,705 (5.6%)</w:t>
+                  </w:r>
+                </w:p>
+              </w:tc>
+              <w:tc>
+                <w:tcPr/>
+                <w:p>
+                  <w:pPr>
+                    <w:pStyle w:val="Compact"/>
+                    <w:jc w:val="left"/>
+                    <w:jc w:val="center"/>
+                  </w:pPr>
+                  <w:r>
+                    <w:t xml:space="preserve">3,160 (5.4%)</w:t>
                   </w:r>
                 </w:p>
               </w:tc>
@@ -4702,33 +4699,33 @@
                     <w:jc w:val="center"/>
                   </w:pPr>
                   <w:r>
-                    <w:t xml:space="preserve">14%</w:t>
-                  </w:r>
-                </w:p>
-              </w:tc>
-              <w:tc>
-                <w:tcPr/>
-                <w:p>
-                  <w:pPr>
-                    <w:pStyle w:val="Compact"/>
-                    <w:jc w:val="left"/>
-                    <w:jc w:val="center"/>
-                  </w:pPr>
-                  <w:r>
-                    <w:t xml:space="preserve">10%</w:t>
-                  </w:r>
-                </w:p>
-              </w:tc>
-              <w:tc>
-                <w:tcPr/>
-                <w:p>
-                  <w:pPr>
-                    <w:pStyle w:val="Compact"/>
-                    <w:jc w:val="left"/>
-                    <w:jc w:val="center"/>
-                  </w:pPr>
-                  <w:r>
-                    <w:t xml:space="preserve">26%</w:t>
+                    <w:t xml:space="preserve">35,040 (14.0%)</w:t>
+                  </w:r>
+                </w:p>
+              </w:tc>
+              <w:tc>
+                <w:tcPr/>
+                <w:p>
+                  <w:pPr>
+                    <w:pStyle w:val="Compact"/>
+                    <w:jc w:val="left"/>
+                    <w:jc w:val="center"/>
+                  </w:pPr>
+                  <w:r>
+                    <w:t xml:space="preserve">19,715 (10.3%)</w:t>
+                  </w:r>
+                </w:p>
+              </w:tc>
+              <w:tc>
+                <w:tcPr/>
+                <w:p>
+                  <w:pPr>
+                    <w:pStyle w:val="Compact"/>
+                    <w:jc w:val="left"/>
+                    <w:jc w:val="center"/>
+                  </w:pPr>
+                  <w:r>
+                    <w:t xml:space="preserve">15,325 (26.3%)</w:t>
                   </w:r>
                 </w:p>
               </w:tc>
@@ -4769,33 +4766,33 @@
                     <w:jc w:val="center"/>
                   </w:pPr>
                   <w:r>
-                    <w:t xml:space="preserve">8.6%</w:t>
-                  </w:r>
-                </w:p>
-              </w:tc>
-              <w:tc>
-                <w:tcPr/>
-                <w:p>
-                  <w:pPr>
-                    <w:pStyle w:val="Compact"/>
-                    <w:jc w:val="left"/>
-                    <w:jc w:val="center"/>
-                  </w:pPr>
-                  <w:r>
-                    <w:t xml:space="preserve">5.9%</w:t>
-                  </w:r>
-                </w:p>
-              </w:tc>
-              <w:tc>
-                <w:tcPr/>
-                <w:p>
-                  <w:pPr>
-                    <w:pStyle w:val="Compact"/>
-                    <w:jc w:val="left"/>
-                    <w:jc w:val="center"/>
-                  </w:pPr>
-                  <w:r>
-                    <w:t xml:space="preserve">18%</w:t>
+                    <w:t xml:space="preserve">21,585 (8.6%)</w:t>
+                  </w:r>
+                </w:p>
+              </w:tc>
+              <w:tc>
+                <w:tcPr/>
+                <w:p>
+                  <w:pPr>
+                    <w:pStyle w:val="Compact"/>
+                    <w:jc w:val="left"/>
+                    <w:jc w:val="center"/>
+                  </w:pPr>
+                  <w:r>
+                    <w:t xml:space="preserve">11,295 (5.9%)</w:t>
+                  </w:r>
+                </w:p>
+              </w:tc>
+              <w:tc>
+                <w:tcPr/>
+                <w:p>
+                  <w:pPr>
+                    <w:pStyle w:val="Compact"/>
+                    <w:jc w:val="left"/>
+                    <w:jc w:val="center"/>
+                  </w:pPr>
+                  <w:r>
+                    <w:t xml:space="preserve">10,290 (17.7%)</w:t>
                   </w:r>
                 </w:p>
               </w:tc>
@@ -4836,33 +4833,33 @@
                     <w:jc w:val="center"/>
                   </w:pPr>
                   <w:r>
-                    <w:t xml:space="preserve">16%</w:t>
-                  </w:r>
-                </w:p>
-              </w:tc>
-              <w:tc>
-                <w:tcPr/>
-                <w:p>
-                  <w:pPr>
-                    <w:pStyle w:val="Compact"/>
-                    <w:jc w:val="left"/>
-                    <w:jc w:val="center"/>
-                  </w:pPr>
-                  <w:r>
-                    <w:t xml:space="preserve">17%</w:t>
-                  </w:r>
-                </w:p>
-              </w:tc>
-              <w:tc>
-                <w:tcPr/>
-                <w:p>
-                  <w:pPr>
-                    <w:pStyle w:val="Compact"/>
-                    <w:jc w:val="left"/>
-                    <w:jc w:val="center"/>
-                  </w:pPr>
-                  <w:r>
-                    <w:t xml:space="preserve">15%</w:t>
+                    <w:t xml:space="preserve">41,135 (16.5%)</w:t>
+                  </w:r>
+                </w:p>
+              </w:tc>
+              <w:tc>
+                <w:tcPr/>
+                <w:p>
+                  <w:pPr>
+                    <w:pStyle w:val="Compact"/>
+                    <w:jc w:val="left"/>
+                    <w:jc w:val="center"/>
+                  </w:pPr>
+                  <w:r>
+                    <w:t xml:space="preserve">32,465 (17.0%)</w:t>
+                  </w:r>
+                </w:p>
+              </w:tc>
+              <w:tc>
+                <w:tcPr/>
+                <w:p>
+                  <w:pPr>
+                    <w:pStyle w:val="Compact"/>
+                    <w:jc w:val="left"/>
+                    <w:jc w:val="center"/>
+                  </w:pPr>
+                  <w:r>
+                    <w:t xml:space="preserve">8,670 (14.9%)</w:t>
                   </w:r>
                 </w:p>
               </w:tc>
@@ -4903,33 +4900,33 @@
                     <w:jc w:val="center"/>
                   </w:pPr>
                   <w:r>
-                    <w:t xml:space="preserve">45%</w:t>
-                  </w:r>
-                </w:p>
-              </w:tc>
-              <w:tc>
-                <w:tcPr/>
-                <w:p>
-                  <w:pPr>
-                    <w:pStyle w:val="Compact"/>
-                    <w:jc w:val="left"/>
-                    <w:jc w:val="center"/>
-                  </w:pPr>
-                  <w:r>
-                    <w:t xml:space="preserve">44%</w:t>
-                  </w:r>
-                </w:p>
-              </w:tc>
-              <w:tc>
-                <w:tcPr/>
-                <w:p>
-                  <w:pPr>
-                    <w:pStyle w:val="Compact"/>
-                    <w:jc w:val="left"/>
-                    <w:jc w:val="center"/>
-                  </w:pPr>
-                  <w:r>
-                    <w:t xml:space="preserve">47%</w:t>
+                    <w:t xml:space="preserve">112,100 (44.9%)</w:t>
+                  </w:r>
+                </w:p>
+              </w:tc>
+              <w:tc>
+                <w:tcPr/>
+                <w:p>
+                  <w:pPr>
+                    <w:pStyle w:val="Compact"/>
+                    <w:jc w:val="left"/>
+                    <w:jc w:val="center"/>
+                  </w:pPr>
+                  <w:r>
+                    <w:t xml:space="preserve">84,825 (44.3%)</w:t>
+                  </w:r>
+                </w:p>
+              </w:tc>
+              <w:tc>
+                <w:tcPr/>
+                <w:p>
+                  <w:pPr>
+                    <w:pStyle w:val="Compact"/>
+                    <w:jc w:val="left"/>
+                    <w:jc w:val="center"/>
+                  </w:pPr>
+                  <w:r>
+                    <w:t xml:space="preserve">27,275 (46.8%)</w:t>
                   </w:r>
                 </w:p>
               </w:tc>
@@ -4962,7 +4959,7 @@
           <w:i/>
           <w:iCs/>
         </w:rPr>
-        <w:t xml:space="preserve">Values are reported as provided in the suppressed public table. AWS = alcohol withdrawal syndrome. Cells with unweighted counts ≤10, and complementary cells or percentages that could reveal them, are suppressed.</w:t>
+        <w:t xml:space="preserve">Values are survey-weighted national estimates, n (%), unless stated otherwise.</w:t>
       </w:r>
     </w:p>
     <w:bookmarkEnd w:id="23"/>
@@ -5018,13 +5015,13 @@
               <w:tblLook w:firstRow="1" w:lastRow="0" w:firstColumn="0" w:lastColumn="0" w:noHBand="0" w:noVBand="0" w:val="0020"/>
             </w:tblPr>
             <w:tblGrid>
-              <w:gridCol w:w="2308"/>
-              <w:gridCol w:w="633"/>
-              <w:gridCol w:w="633"/>
-              <w:gridCol w:w="1312"/>
-              <w:gridCol w:w="1221"/>
-              <w:gridCol w:w="1448"/>
-              <w:gridCol w:w="362"/>
+              <w:gridCol w:w="2207"/>
+              <w:gridCol w:w="865"/>
+              <w:gridCol w:w="692"/>
+              <w:gridCol w:w="1255"/>
+              <w:gridCol w:w="1168"/>
+              <w:gridCol w:w="1384"/>
+              <w:gridCol w:w="346"/>
             </w:tblGrid>
             <w:tr>
               <w:trPr>
@@ -5052,20 +5049,20 @@
                     <w:jc w:val="center"/>
                   </w:pPr>
                   <w:r>
-                    <w:t xml:space="preserve">No AWS</w:t>
-                  </w:r>
-                </w:p>
-              </w:tc>
-              <w:tc>
-                <w:tcPr/>
-                <w:p>
-                  <w:pPr>
-                    <w:pStyle w:val="Compact"/>
-                    <w:jc w:val="left"/>
-                    <w:jc w:val="center"/>
-                  </w:pPr>
-                  <w:r>
-                    <w:t xml:space="preserve">AWS</w:t>
+                    <w:t xml:space="preserve">No AWS, N = 191,300</w:t>
+                  </w:r>
+                </w:p>
+              </w:tc>
+              <w:tc>
+                <w:tcPr/>
+                <w:p>
+                  <w:pPr>
+                    <w:pStyle w:val="Compact"/>
+                    <w:jc w:val="left"/>
+                    <w:jc w:val="center"/>
+                  </w:pPr>
+                  <w:r>
+                    <w:t xml:space="preserve">AWS, N = 58,270</w:t>
                   </w:r>
                 </w:p>
               </w:tc>
@@ -5145,20 +5142,20 @@
                     <w:jc w:val="center"/>
                   </w:pPr>
                   <w:r>
-                    <w:t xml:space="preserve">5.3% (2,028)</w:t>
-                  </w:r>
-                </w:p>
-              </w:tc>
-              <w:tc>
-                <w:tcPr/>
-                <w:p>
-                  <w:pPr>
-                    <w:pStyle w:val="Compact"/>
-                    <w:jc w:val="left"/>
-                    <w:jc w:val="center"/>
-                  </w:pPr>
-                  <w:r>
-                    <w:t xml:space="preserve">4.0% (466)</w:t>
+                    <w:t xml:space="preserve">10,140 (5.3%)</w:t>
+                  </w:r>
+                </w:p>
+              </w:tc>
+              <w:tc>
+                <w:tcPr/>
+                <w:p>
+                  <w:pPr>
+                    <w:pStyle w:val="Compact"/>
+                    <w:jc w:val="left"/>
+                    <w:jc w:val="center"/>
+                  </w:pPr>
+                  <w:r>
+                    <w:t xml:space="preserve">2,330 (4.0%)</w:t>
                   </w:r>
                 </w:p>
               </w:tc>
@@ -5238,20 +5235,20 @@
                     <w:jc w:val="center"/>
                   </w:pPr>
                   <w:r>
-                    <w:t xml:space="preserve">22.1% (8,466)</w:t>
-                  </w:r>
-                </w:p>
-              </w:tc>
-              <w:tc>
-                <w:tcPr/>
-                <w:p>
-                  <w:pPr>
-                    <w:pStyle w:val="Compact"/>
-                    <w:jc w:val="left"/>
-                    <w:jc w:val="center"/>
-                  </w:pPr>
-                  <w:r>
-                    <w:t xml:space="preserve">26.0% (3,030)</w:t>
+                    <w:t xml:space="preserve">42,330 (22.1%)</w:t>
+                  </w:r>
+                </w:p>
+              </w:tc>
+              <w:tc>
+                <w:tcPr/>
+                <w:p>
+                  <w:pPr>
+                    <w:pStyle w:val="Compact"/>
+                    <w:jc w:val="left"/>
+                    <w:jc w:val="center"/>
+                  </w:pPr>
+                  <w:r>
+                    <w:t xml:space="preserve">15,150 (26.0%)</w:t>
                   </w:r>
                 </w:p>
               </w:tc>
@@ -5331,20 +5328,20 @@
                     <w:jc w:val="center"/>
                   </w:pPr>
                   <w:r>
-                    <w:t xml:space="preserve">7.8% (3,000)</w:t>
-                  </w:r>
-                </w:p>
-              </w:tc>
-              <w:tc>
-                <w:tcPr/>
-                <w:p>
-                  <w:pPr>
-                    <w:pStyle w:val="Compact"/>
-                    <w:jc w:val="left"/>
-                    <w:jc w:val="center"/>
-                  </w:pPr>
-                  <w:r>
-                    <w:t xml:space="preserve">18.0% (2,097)</w:t>
+                    <w:t xml:space="preserve">15,000 (7.8%)</w:t>
+                  </w:r>
+                </w:p>
+              </w:tc>
+              <w:tc>
+                <w:tcPr/>
+                <w:p>
+                  <w:pPr>
+                    <w:pStyle w:val="Compact"/>
+                    <w:jc w:val="left"/>
+                    <w:jc w:val="center"/>
+                  </w:pPr>
+                  <w:r>
+                    <w:t xml:space="preserve">10,480 (18.0%)</w:t>
                   </w:r>
                 </w:p>
               </w:tc>
@@ -5424,20 +5421,20 @@
                     <w:jc w:val="center"/>
                   </w:pPr>
                   <w:r>
-                    <w:t xml:space="preserve">25.7% (9,310)</w:t>
-                  </w:r>
-                </w:p>
-              </w:tc>
-              <w:tc>
-                <w:tcPr/>
-                <w:p>
-                  <w:pPr>
-                    <w:pStyle w:val="Compact"/>
-                    <w:jc w:val="left"/>
-                    <w:jc w:val="center"/>
-                  </w:pPr>
-                  <w:r>
-                    <w:t xml:space="preserve">39.9% (4,462)</w:t>
+                    <w:t xml:space="preserve">46,550 (25.7%)</w:t>
+                  </w:r>
+                </w:p>
+              </w:tc>
+              <w:tc>
+                <w:tcPr/>
+                <w:p>
+                  <w:pPr>
+                    <w:pStyle w:val="Compact"/>
+                    <w:jc w:val="left"/>
+                    <w:jc w:val="center"/>
+                  </w:pPr>
+                  <w:r>
+                    <w:t xml:space="preserve">22,310 (39.9%)</w:t>
                   </w:r>
                 </w:p>
               </w:tc>
@@ -5517,20 +5514,20 @@
                     <w:jc w:val="center"/>
                   </w:pPr>
                   <w:r>
-                    <w:t xml:space="preserve">4.2% (1,505)</w:t>
-                  </w:r>
-                </w:p>
-              </w:tc>
-              <w:tc>
-                <w:tcPr/>
-                <w:p>
-                  <w:pPr>
-                    <w:pStyle w:val="Compact"/>
-                    <w:jc w:val="left"/>
-                    <w:jc w:val="center"/>
-                  </w:pPr>
-                  <w:r>
-                    <w:t xml:space="preserve">5.6% (630)</w:t>
+                    <w:t xml:space="preserve">7,530 (4.2%)</w:t>
+                  </w:r>
+                </w:p>
+              </w:tc>
+              <w:tc>
+                <w:tcPr/>
+                <w:p>
+                  <w:pPr>
+                    <w:pStyle w:val="Compact"/>
+                    <w:jc w:val="left"/>
+                    <w:jc w:val="center"/>
+                  </w:pPr>
+                  <w:r>
+                    <w:t xml:space="preserve">3,150 (5.6%)</w:t>
                   </w:r>
                 </w:p>
               </w:tc>
@@ -5788,7 +5785,7 @@
           <w:i/>
           <w:iCs/>
         </w:rPr>
-        <w:t xml:space="preserve">AWS = alcohol withdrawal syndrome; aOR = adjusted odds ratio; CI = confidence interval; LOS = length of stay; AMA = against medical advice. Cells with unweighted counts ≤10, and complementary cells or percentages that could reveal them, are suppressed.</w:t>
+        <w:t xml:space="preserve">Values are survey-weighted national estimates, n (%), unless stated otherwise.</w:t>
       </w:r>
     </w:p>
     <w:bookmarkEnd w:id="25"/>
@@ -6048,11 +6045,11 @@
               <w:tblLook w:firstRow="1" w:lastRow="0" w:firstColumn="0" w:lastColumn="0" w:noHBand="0" w:noVBand="0" w:val="0020"/>
             </w:tblPr>
             <w:tblGrid>
-              <w:gridCol w:w="2668"/>
-              <w:gridCol w:w="1807"/>
-              <w:gridCol w:w="946"/>
-              <w:gridCol w:w="1807"/>
-              <w:gridCol w:w="688"/>
+              <w:gridCol w:w="2029"/>
+              <w:gridCol w:w="1898"/>
+              <w:gridCol w:w="2094"/>
+              <w:gridCol w:w="1374"/>
+              <w:gridCol w:w="523"/>
             </w:tblGrid>
             <w:tr>
               <w:trPr>
@@ -6080,20 +6077,20 @@
                     <w:jc w:val="center"/>
                   </w:pPr>
                   <w:r>
-                    <w:t xml:space="preserve">Hospitalizations (n)</w:t>
-                  </w:r>
-                </w:p>
-              </w:tc>
-              <w:tc>
-                <w:tcPr/>
-                <w:p>
-                  <w:pPr>
-                    <w:pStyle w:val="Compact"/>
-                    <w:jc w:val="left"/>
-                    <w:jc w:val="center"/>
-                  </w:pPr>
-                  <w:r>
-                    <w:t xml:space="preserve">Deaths (n)</w:t>
+                    <w:t xml:space="preserve">Hospitalizations, weighted n</w:t>
+                  </w:r>
+                </w:p>
+              </w:tc>
+              <w:tc>
+                <w:tcPr/>
+                <w:p>
+                  <w:pPr>
+                    <w:pStyle w:val="Compact"/>
+                    <w:jc w:val="left"/>
+                    <w:jc w:val="center"/>
+                  </w:pPr>
+                  <w:r>
+                    <w:t xml:space="preserve">Deaths, weighted n (weighted %)</w:t>
                   </w:r>
                 </w:p>
               </w:tc>
@@ -6147,20 +6144,20 @@
                     <w:jc w:val="center"/>
                   </w:pPr>
                   <w:r>
-                    <w:t xml:space="preserve">45,949</w:t>
-                  </w:r>
-                </w:p>
-              </w:tc>
-              <w:tc>
-                <w:tcPr/>
-                <w:p>
-                  <w:pPr>
-                    <w:pStyle w:val="Compact"/>
-                    <w:jc w:val="left"/>
-                    <w:jc w:val="center"/>
-                  </w:pPr>
-                  <w:r>
-                    <w:t xml:space="preserve">2,217</w:t>
+                    <w:t xml:space="preserve">229,740</w:t>
+                  </w:r>
+                </w:p>
+              </w:tc>
+              <w:tc>
+                <w:tcPr/>
+                <w:p>
+                  <w:pPr>
+                    <w:pStyle w:val="Compact"/>
+                    <w:jc w:val="left"/>
+                    <w:jc w:val="center"/>
+                  </w:pPr>
+                  <w:r>
+                    <w:t xml:space="preserve">11,080 (4.8%)</w:t>
                   </w:r>
                 </w:p>
               </w:tc>
@@ -6214,20 +6211,20 @@
                     <w:jc w:val="center"/>
                   </w:pPr>
                   <w:r>
-                    <w:t xml:space="preserve">37,494</w:t>
-                  </w:r>
-                </w:p>
-              </w:tc>
-              <w:tc>
-                <w:tcPr/>
-                <w:p>
-                  <w:pPr>
-                    <w:pStyle w:val="Compact"/>
-                    <w:jc w:val="left"/>
-                    <w:jc w:val="center"/>
-                  </w:pPr>
-                  <w:r>
-                    <w:t xml:space="preserve">1,657</w:t>
+                    <w:t xml:space="preserve">187,470</w:t>
+                  </w:r>
+                </w:p>
+              </w:tc>
+              <w:tc>
+                <w:tcPr/>
+                <w:p>
+                  <w:pPr>
+                    <w:pStyle w:val="Compact"/>
+                    <w:jc w:val="left"/>
+                    <w:jc w:val="center"/>
+                  </w:pPr>
+                  <w:r>
+                    <w:t xml:space="preserve">8,280 (4.4%)</w:t>
                   </w:r>
                 </w:p>
               </w:tc>
@@ -6281,20 +6278,20 @@
                     <w:jc w:val="center"/>
                   </w:pPr>
                   <w:r>
-                    <w:t xml:space="preserve">31,234</w:t>
-                  </w:r>
-                </w:p>
-              </w:tc>
-              <w:tc>
-                <w:tcPr/>
-                <w:p>
-                  <w:pPr>
-                    <w:pStyle w:val="Compact"/>
-                    <w:jc w:val="left"/>
-                    <w:jc w:val="center"/>
-                  </w:pPr>
-                  <w:r>
-                    <w:t xml:space="preserve">1,798</w:t>
+                    <w:t xml:space="preserve">156,170</w:t>
+                  </w:r>
+                </w:p>
+              </w:tc>
+              <w:tc>
+                <w:tcPr/>
+                <w:p>
+                  <w:pPr>
+                    <w:pStyle w:val="Compact"/>
+                    <w:jc w:val="left"/>
+                    <w:jc w:val="center"/>
+                  </w:pPr>
+                  <w:r>
+                    <w:t xml:space="preserve">8,990 (5.8%)</w:t>
                   </w:r>
                 </w:p>
               </w:tc>
@@ -6348,20 +6345,20 @@
                     <w:jc w:val="center"/>
                   </w:pPr>
                   <w:r>
-                    <w:t xml:space="preserve">38,511</w:t>
-                  </w:r>
-                </w:p>
-              </w:tc>
-              <w:tc>
-                <w:tcPr/>
-                <w:p>
-                  <w:pPr>
-                    <w:pStyle w:val="Compact"/>
-                    <w:jc w:val="left"/>
-                    <w:jc w:val="center"/>
-                  </w:pPr>
-                  <w:r>
-                    <w:t xml:space="preserve">1,732</w:t>
+                    <w:t xml:space="preserve">192,550</w:t>
+                  </w:r>
+                </w:p>
+              </w:tc>
+              <w:tc>
+                <w:tcPr/>
+                <w:p>
+                  <w:pPr>
+                    <w:pStyle w:val="Compact"/>
+                    <w:jc w:val="left"/>
+                    <w:jc w:val="center"/>
+                  </w:pPr>
+                  <w:r>
+                    <w:t xml:space="preserve">8,660 (4.5%)</w:t>
                   </w:r>
                 </w:p>
               </w:tc>
@@ -6407,7 +6404,7 @@
           <w:i/>
           <w:iCs/>
         </w:rPr>
-        <w:t xml:space="preserve">aOR = adjusted odds ratio; CI = confidence interval. Cells with unweighted counts ≤10, and complementary cells or percentages that could reveal them, are suppressed.</w:t>
+        <w:t xml:space="preserve">Values are survey-weighted national estimates, n (%), unless stated otherwise.</w:t>
       </w:r>
     </w:p>
     <w:bookmarkEnd w:id="37"/>
@@ -6991,6 +6988,18 @@
         </w:tc>
       </w:tr>
     </w:tbl>
+    <w:p>
+      <w:pPr>
+        <w:pStyle w:val="BodyText"/>
+      </w:pPr>
+      <w:r>
+        <w:rPr>
+          <w:i/>
+          <w:iCs/>
+        </w:rPr>
+        <w:t xml:space="preserve">Values are survey-weighted national estimates, n (%), unless stated otherwise.</w:t>
+      </w:r>
+    </w:p>
     <w:bookmarkEnd w:id="40"/>
     <w:sectPr>
       <w:footnotePr>

</xml_diff>

<commit_message>
Publish corrected weighted sex row
Co-Authored-By: Claude Opus 5.5 <noreply@anthropic.com>
</commit_message>
<xml_diff>
--- a/docs/quarto/index.docx
+++ b/docs/quarto/index.docx
@@ -768,32 +768,47 @@
                     <w:jc w:val="center"/>
                   </w:pPr>
                   <w:r>
-                    <w:t xml:space="preserve">Sex</w:t>
-                  </w:r>
-                </w:p>
-              </w:tc>
-              <w:tc>
-                <w:tcPr/>
-                <w:p>
-                  <w:pPr>
-                    <w:pStyle w:val="Compact"/>
-                  </w:pPr>
-                </w:p>
-              </w:tc>
-              <w:tc>
-                <w:tcPr/>
-                <w:p>
-                  <w:pPr>
-                    <w:pStyle w:val="Compact"/>
-                  </w:pPr>
-                </w:p>
-              </w:tc>
-              <w:tc>
-                <w:tcPr/>
-                <w:p>
-                  <w:pPr>
-                    <w:pStyle w:val="Compact"/>
-                  </w:pPr>
+                    <w:t xml:space="preserve">Female, n (%)</w:t>
+                  </w:r>
+                </w:p>
+              </w:tc>
+              <w:tc>
+                <w:tcPr/>
+                <w:p>
+                  <w:pPr>
+                    <w:pStyle w:val="Compact"/>
+                    <w:jc w:val="left"/>
+                    <w:jc w:val="center"/>
+                  </w:pPr>
+                  <w:r>
+                    <w:t xml:space="preserve">55,260 (22.2%)</w:t>
+                  </w:r>
+                </w:p>
+              </w:tc>
+              <w:tc>
+                <w:tcPr/>
+                <w:p>
+                  <w:pPr>
+                    <w:pStyle w:val="Compact"/>
+                    <w:jc w:val="left"/>
+                    <w:jc w:val="center"/>
+                  </w:pPr>
+                  <w:r>
+                    <w:t xml:space="preserve">44,425 (23.2%)</w:t>
+                  </w:r>
+                </w:p>
+              </w:tc>
+              <w:tc>
+                <w:tcPr/>
+                <w:p>
+                  <w:pPr>
+                    <w:pStyle w:val="Compact"/>
+                    <w:jc w:val="left"/>
+                    <w:jc w:val="center"/>
+                  </w:pPr>
+                  <w:r>
+                    <w:t xml:space="preserve">10,835 (18.6%)</w:t>
+                  </w:r>
                 </w:p>
               </w:tc>
               <w:tc>
@@ -807,192 +822,6 @@
                   <w:r>
                     <w:t xml:space="preserve">&lt;0.001</w:t>
                   </w:r>
-                </w:p>
-              </w:tc>
-            </w:tr>
-            <w:tr>
-              <w:tc>
-                <w:tcPr/>
-                <w:p>
-                  <w:pPr>
-                    <w:pStyle w:val="Compact"/>
-                    <w:jc w:val="left"/>
-                    <w:jc w:val="center"/>
-                  </w:pPr>
-                  <w:r>
-                    <w:t xml:space="preserve">Male</w:t>
-                  </w:r>
-                </w:p>
-              </w:tc>
-              <w:tc>
-                <w:tcPr/>
-                <w:p>
-                  <w:pPr>
-                    <w:pStyle w:val="Compact"/>
-                    <w:jc w:val="left"/>
-                    <w:jc w:val="center"/>
-                  </w:pPr>
-                  <w:r>
-                    <w:t xml:space="preserve">194,195 (77.8%)</w:t>
-                  </w:r>
-                </w:p>
-              </w:tc>
-              <w:tc>
-                <w:tcPr/>
-                <w:p>
-                  <w:pPr>
-                    <w:pStyle w:val="Compact"/>
-                    <w:jc w:val="left"/>
-                    <w:jc w:val="center"/>
-                  </w:pPr>
-                  <w:r>
-                    <w:t xml:space="preserve">146,785 (76.7%)</w:t>
-                  </w:r>
-                </w:p>
-              </w:tc>
-              <w:tc>
-                <w:tcPr/>
-                <w:p>
-                  <w:pPr>
-                    <w:pStyle w:val="Compact"/>
-                    <w:jc w:val="left"/>
-                    <w:jc w:val="center"/>
-                  </w:pPr>
-                  <w:r>
-                    <w:t xml:space="preserve">47,410 (81.4%)</w:t>
-                  </w:r>
-                </w:p>
-              </w:tc>
-              <w:tc>
-                <w:tcPr/>
-                <w:p>
-                  <w:pPr>
-                    <w:pStyle w:val="Compact"/>
-                  </w:pPr>
-                </w:p>
-              </w:tc>
-            </w:tr>
-            <w:tr>
-              <w:tc>
-                <w:tcPr/>
-                <w:p>
-                  <w:pPr>
-                    <w:pStyle w:val="Compact"/>
-                    <w:jc w:val="left"/>
-                    <w:jc w:val="center"/>
-                  </w:pPr>
-                  <w:r>
-                    <w:t xml:space="preserve">Female</w:t>
-                  </w:r>
-                </w:p>
-              </w:tc>
-              <w:tc>
-                <w:tcPr/>
-                <w:p>
-                  <w:pPr>
-                    <w:pStyle w:val="Compact"/>
-                    <w:jc w:val="left"/>
-                    <w:jc w:val="center"/>
-                  </w:pPr>
-                  <w:r>
-                    <w:t xml:space="preserve">≤10</w:t>
-                  </w:r>
-                </w:p>
-              </w:tc>
-              <w:tc>
-                <w:tcPr/>
-                <w:p>
-                  <w:pPr>
-                    <w:pStyle w:val="Compact"/>
-                    <w:jc w:val="left"/>
-                    <w:jc w:val="center"/>
-                  </w:pPr>
-                  <w:r>
-                    <w:t xml:space="preserve">44,425 (23.2%)</w:t>
-                  </w:r>
-                </w:p>
-              </w:tc>
-              <w:tc>
-                <w:tcPr/>
-                <w:p>
-                  <w:pPr>
-                    <w:pStyle w:val="Compact"/>
-                    <w:jc w:val="left"/>
-                    <w:jc w:val="center"/>
-                  </w:pPr>
-                  <w:r>
-                    <w:t xml:space="preserve">≤10</w:t>
-                  </w:r>
-                </w:p>
-              </w:tc>
-              <w:tc>
-                <w:tcPr/>
-                <w:p>
-                  <w:pPr>
-                    <w:pStyle w:val="Compact"/>
-                  </w:pPr>
-                </w:p>
-              </w:tc>
-            </w:tr>
-            <w:tr>
-              <w:tc>
-                <w:tcPr/>
-                <w:p>
-                  <w:pPr>
-                    <w:pStyle w:val="Compact"/>
-                    <w:jc w:val="left"/>
-                    <w:jc w:val="center"/>
-                  </w:pPr>
-                  <w:r>
-                    <w:t xml:space="preserve">Unknown</w:t>
-                  </w:r>
-                </w:p>
-              </w:tc>
-              <w:tc>
-                <w:tcPr/>
-                <w:p>
-                  <w:pPr>
-                    <w:pStyle w:val="Compact"/>
-                    <w:jc w:val="left"/>
-                    <w:jc w:val="center"/>
-                  </w:pPr>
-                  <w:r>
-                    <w:t xml:space="preserve">≤10</w:t>
-                  </w:r>
-                </w:p>
-              </w:tc>
-              <w:tc>
-                <w:tcPr/>
-                <w:p>
-                  <w:pPr>
-                    <w:pStyle w:val="Compact"/>
-                    <w:jc w:val="left"/>
-                    <w:jc w:val="center"/>
-                  </w:pPr>
-                  <w:r>
-                    <w:t xml:space="preserve">90 (0.0%)</w:t>
-                  </w:r>
-                </w:p>
-              </w:tc>
-              <w:tc>
-                <w:tcPr/>
-                <w:p>
-                  <w:pPr>
-                    <w:pStyle w:val="Compact"/>
-                    <w:jc w:val="left"/>
-                    <w:jc w:val="center"/>
-                  </w:pPr>
-                  <w:r>
-                    <w:t xml:space="preserve">≤10</w:t>
-                  </w:r>
-                </w:p>
-              </w:tc>
-              <w:tc>
-                <w:tcPr/>
-                <w:p>
-                  <w:pPr>
-                    <w:pStyle w:val="Compact"/>
-                  </w:pPr>
                 </w:p>
               </w:tc>
             </w:tr>
@@ -4960,6 +4789,18 @@
           <w:iCs/>
         </w:rPr>
         <w:t xml:space="preserve">Values are survey-weighted national estimates, n (%), unless stated otherwise.</w:t>
+      </w:r>
+    </w:p>
+    <w:p>
+      <w:pPr>
+        <w:pStyle w:val="BodyText"/>
+      </w:pPr>
+      <w:r>
+        <w:rPr>
+          <w:i/>
+          <w:iCs/>
+        </w:rPr>
+        <w:t xml:space="preserve">Sex was missing for &lt;0.1% of hospitalizations.</w:t>
       </w:r>
     </w:p>
     <w:bookmarkEnd w:id="23"/>

</xml_diff>

<commit_message>
Publish grouped Table 2 estimates
Co-Authored-By: Claude Opus 5.5 <noreply@anthropic.com>
</commit_message>
<xml_diff>
--- a/docs/quarto/index.docx
+++ b/docs/quarto/index.docx
@@ -461,7 +461,7 @@
         <w:pStyle w:val="FirstParagraph"/>
       </w:pPr>
       <w:r>
-        <w:t xml:space="preserve">We compared hospitalizations with and without coded AWS using survey-weighted regression. Adjusted odds ratios summarize the association after accounting for the listed covariates; values above 1 indicate higher odds and values below 1 indicate lower odds. Results describe associations and do not establish cause and effect. All counts and percentages are survey-weighted national estimates, reported as weighted n (weighted %). The analysis included 49,914 sampled hospitalizations, representing 249,570 hospitalizations nationally. Cells based on 10 or fewer sampled hospitalizations are suppressed (≤10) per the HCUP data use agreement.</w:t>
+        <w:t xml:space="preserve">We compared hospitalizations with and without coded AWS using survey-weighted regression. Binary outcomes are reported as weighted n (%) and analyzed with survey-weighted logistic regression; LOS and cost are summarized as weighted median (IQR) and modeled with survey-weighted log-link generalized linear models (quasipoisson for LOS and gamma for cost), which handle right-skewed data without transforming the outcome and estimate mean differences as predictive margins. Adjusted odds ratios summarize associations for binary outcomes after accounting for the listed covariates; values above 1 indicate higher odds and values below 1 indicate lower odds. Results describe associations and do not establish cause and effect. All counts and percentages are survey-weighted national estimates, reported as weighted n (weighted %). The analysis included 49,914 sampled hospitalizations, representing 249,570 hospitalizations nationally. Cells based on 10 or fewer sampled hospitalizations are suppressed (≤10) per the HCUP data use agreement.</w:t>
       </w:r>
     </w:p>
     <w:bookmarkEnd w:id="15"/>
@@ -4818,7 +4818,7 @@
         <w:pStyle w:val="FirstParagraph"/>
       </w:pPr>
       <w:r>
-        <w:t xml:space="preserve">The table presents crude comparisons and adjusted associations for the prespecified outcomes. Continuous outcomes are shown as weighted means. The adjusted estimate compares the odds or mean outcome for hospitalizations with AWS versus those without AWS, after covariate adjustment.</w:t>
+        <w:t xml:space="preserve">The table presents crude comparisons and adjusted associations for the prespecified outcomes. Binary outcomes are weighted counts and percentages; LOS and cost are weighted medians (IQR). The model estimates compare odds for binary outcomes and mean differences for continuous outcomes between hospitalizations with AWS and those without AWS.</w:t>
       </w:r>
     </w:p>
     <w:tbl>
@@ -4848,772 +4848,1269 @@
               <w:t xml:space="preserve">Table 2: Crude and adjusted in-hospital outcomes by AWS status.</w:t>
             </w:r>
           </w:p>
-          <w:tbl>
+          <w:tbl xmlns:w="http://schemas.openxmlformats.org/wordprocessingml/2006/main" xmlns:wp="http://schemas.openxmlformats.org/drawingml/2006/wordprocessingDrawing" xmlns:r="http://schemas.openxmlformats.org/officeDocument/2006/relationships" xmlns:w14="http://schemas.microsoft.com/office/word/2010/wordml">
             <w:tblPr>
-              <w:tblStyle w:val="Table"/>
-              <w:tblW w:type="pct" w:w="5000"/>
-              <w:tblLayout w:type="fixed"/>
-              <w:tblLook w:firstRow="1" w:lastRow="0" w:firstColumn="0" w:lastColumn="0" w:noHBand="0" w:noVBand="0" w:val="0020"/>
+              <w:tblCellMar>
+                <w:top w:w="0" w:type="dxa"/>
+                <w:bottom w:w="0" w:type="dxa"/>
+                <w:start w:w="60" w:type="dxa"/>
+                <w:end w:w="60" w:type="dxa"/>
+              </w:tblCellMar>
+              <w:tblW w:type="auto" w:w="0"/>
+              <w:tblLook w:firstRow="0" w:lastRow="0" w:firstColumn="0" w:lastColumn="0" w:noHBand="0" w:noVBand="0"/>
+              <w:jc w:val="center"/>
             </w:tblPr>
-            <w:tblGrid>
-              <w:gridCol w:w="2207"/>
-              <w:gridCol w:w="865"/>
-              <w:gridCol w:w="692"/>
-              <w:gridCol w:w="1255"/>
-              <w:gridCol w:w="1168"/>
-              <w:gridCol w:w="1384"/>
-              <w:gridCol w:w="346"/>
-            </w:tblGrid>
             <w:tr>
               <w:trPr>
-                <w:tblHeader w:val="on"/>
+                <w:cantSplit/>
+                <w:tblHeader/>
               </w:trPr>
               <w:tc>
-                <w:tcPr/>
-                <w:p>
-                  <w:pPr>
-                    <w:pStyle w:val="Compact"/>
-                    <w:jc w:val="left"/>
-                    <w:jc w:val="center"/>
-                  </w:pPr>
-                  <w:r>
-                    <w:t xml:space="preserve">Outcome</w:t>
-                  </w:r>
-                </w:p>
-              </w:tc>
-              <w:tc>
-                <w:tcPr/>
-                <w:p>
-                  <w:pPr>
-                    <w:pStyle w:val="Compact"/>
-                    <w:jc w:val="left"/>
-                    <w:jc w:val="center"/>
-                  </w:pPr>
-                  <w:r>
-                    <w:t xml:space="preserve">No AWS, N = 191,300</w:t>
-                  </w:r>
-                </w:p>
-              </w:tc>
-              <w:tc>
-                <w:tcPr/>
-                <w:p>
-                  <w:pPr>
-                    <w:pStyle w:val="Compact"/>
-                    <w:jc w:val="left"/>
-                    <w:jc w:val="center"/>
-                  </w:pPr>
-                  <w:r>
-                    <w:t xml:space="preserve">AWS, N = 58,270</w:t>
-                  </w:r>
-                </w:p>
-              </w:tc>
-              <w:tc>
-                <w:tcPr/>
-                <w:p>
-                  <w:pPr>
-                    <w:pStyle w:val="Compact"/>
-                    <w:jc w:val="left"/>
-                    <w:jc w:val="center"/>
-                  </w:pPr>
-                  <w:r>
-                    <w:t xml:space="preserve">Unadjusted OR/ratio (95% CI)</w:t>
-                  </w:r>
-                </w:p>
-              </w:tc>
-              <w:tc>
-                <w:tcPr/>
-                <w:p>
-                  <w:pPr>
-                    <w:pStyle w:val="Compact"/>
-                    <w:jc w:val="left"/>
-                    <w:jc w:val="center"/>
-                  </w:pPr>
-                  <w:r>
-                    <w:t xml:space="preserve">Adjusted OR/ratio (95% CI)</w:t>
-                  </w:r>
-                </w:p>
-              </w:tc>
-              <w:tc>
-                <w:tcPr/>
-                <w:p>
-                  <w:pPr>
-                    <w:pStyle w:val="Compact"/>
-                    <w:jc w:val="left"/>
-                    <w:jc w:val="center"/>
-                  </w:pPr>
-                  <w:r>
-                    <w:t xml:space="preserve">Adjusted difference (95% CI)</w:t>
-                  </w:r>
-                </w:p>
-              </w:tc>
-              <w:tc>
-                <w:tcPr/>
-                <w:p>
-                  <w:pPr>
-                    <w:pStyle w:val="Compact"/>
-                    <w:jc w:val="left"/>
-                    <w:jc w:val="center"/>
-                  </w:pPr>
-                  <w:r>
-                    <w:t xml:space="preserve">p-value</w:t>
+                <w:tcPr>
+                  <w:tcBorders>
+                    <w:top w:val="single" w:sz="16" w:space="0" w:color="D3D3D3"/>
+                    <w:bottom w:val="single" w:sz="16" w:space="0" w:color="D3D3D3"/>
+                    <w:start w:val="single" w:space="0" w:color="D3D3D3"/>
+                    <w:end w:val="single" w:space="0" w:color="D3D3D3"/>
+                  </w:tcBorders>
+                </w:tcPr>
+                <w:p>
+                  <w:pPr>
+                    <w:spacing w:before="0" w:after="60"/>
+                    <w:keepNext/>
+                    <w:jc w:val="start"/>
+                  </w:pPr>
+                  <w:r>
+                    <w:rPr>
+                      <w:rFonts w:ascii="Calibri" w:hAnsi="Calibri"/>
+                      <w:sz w:val="20"/>
+                    </w:rPr>
+                    <w:t xml:space="default">Outcome</w:t>
+                  </w:r>
+                </w:p>
+              </w:tc>
+              <w:tc>
+                <w:tcPr>
+                  <w:tcBorders>
+                    <w:top w:val="single" w:sz="16" w:space="0" w:color="D3D3D3"/>
+                    <w:bottom w:val="single" w:sz="16" w:space="0" w:color="D3D3D3"/>
+                    <w:start w:val="single" w:space="0" w:color="D3D3D3"/>
+                  </w:tcBorders>
+                </w:tcPr>
+                <w:p>
+                  <w:pPr>
+                    <w:spacing w:before="0" w:after="60"/>
+                    <w:keepNext/>
+                    <w:jc w:val="start"/>
+                  </w:pPr>
+                  <w:r>
+                    <w:rPr>
+                      <w:rFonts w:ascii="Calibri" w:hAnsi="Calibri"/>
+                      <w:sz w:val="20"/>
+                    </w:rPr>
+                    <w:t xml:space="default">No AWS, N = 191,300</w:t>
+                  </w:r>
+                </w:p>
+              </w:tc>
+              <w:tc>
+                <w:tcPr>
+                  <w:tcBorders>
+                    <w:top w:val="single" w:sz="16" w:space="0" w:color="D3D3D3"/>
+                    <w:bottom w:val="single" w:sz="16" w:space="0" w:color="D3D3D3"/>
+                  </w:tcBorders>
+                </w:tcPr>
+                <w:p>
+                  <w:pPr>
+                    <w:spacing w:before="0" w:after="60"/>
+                    <w:keepNext/>
+                    <w:jc w:val="start"/>
+                  </w:pPr>
+                  <w:r>
+                    <w:rPr>
+                      <w:rFonts w:ascii="Calibri" w:hAnsi="Calibri"/>
+                      <w:sz w:val="20"/>
+                    </w:rPr>
+                    <w:t xml:space="default">AWS, N = 58,270</w:t>
+                  </w:r>
+                </w:p>
+              </w:tc>
+              <w:tc>
+                <w:tcPr>
+                  <w:tcBorders>
+                    <w:top w:val="single" w:sz="16" w:space="0" w:color="D3D3D3"/>
+                    <w:bottom w:val="single" w:sz="16" w:space="0" w:color="D3D3D3"/>
+                  </w:tcBorders>
+                </w:tcPr>
+                <w:p>
+                  <w:pPr>
+                    <w:spacing w:before="0" w:after="60"/>
+                    <w:keepNext/>
+                    <w:jc w:val="start"/>
+                  </w:pPr>
+                  <w:r>
+                    <w:rPr>
+                      <w:rFonts w:ascii="Calibri" w:hAnsi="Calibri"/>
+                      <w:sz w:val="20"/>
+                    </w:rPr>
+                    <w:t xml:space="default">Unadjusted estimate (95% CI)</w:t>
+                  </w:r>
+                </w:p>
+              </w:tc>
+              <w:tc>
+                <w:tcPr>
+                  <w:tcBorders>
+                    <w:top w:val="single" w:sz="16" w:space="0" w:color="D3D3D3"/>
+                    <w:bottom w:val="single" w:sz="16" w:space="0" w:color="D3D3D3"/>
+                  </w:tcBorders>
+                </w:tcPr>
+                <w:p>
+                  <w:pPr>
+                    <w:spacing w:before="0" w:after="60"/>
+                    <w:keepNext/>
+                    <w:jc w:val="start"/>
+                  </w:pPr>
+                  <w:r>
+                    <w:rPr>
+                      <w:rFonts w:ascii="Calibri" w:hAnsi="Calibri"/>
+                      <w:sz w:val="20"/>
+                    </w:rPr>
+                    <w:t xml:space="default">Adjusted estimate (95% CI)</w:t>
+                  </w:r>
+                </w:p>
+              </w:tc>
+              <w:tc>
+                <w:tcPr>
+                  <w:tcBorders>
+                    <w:top w:val="single" w:sz="16" w:space="0" w:color="D3D3D3"/>
+                    <w:bottom w:val="single" w:sz="16" w:space="0" w:color="D3D3D3"/>
+                    <w:end w:val="single" w:space="0" w:color="D3D3D3"/>
+                  </w:tcBorders>
+                </w:tcPr>
+                <w:p>
+                  <w:pPr>
+                    <w:spacing w:before="0" w:after="60"/>
+                    <w:keepNext/>
+                    <w:jc w:val="start"/>
+                  </w:pPr>
+                  <w:r>
+                    <w:rPr>
+                      <w:rFonts w:ascii="Calibri" w:hAnsi="Calibri"/>
+                      <w:sz w:val="20"/>
+                    </w:rPr>
+                    <w:t xml:space="default">p-value</w:t>
                   </w:r>
                 </w:p>
               </w:tc>
             </w:tr>
             <w:tr>
-              <w:tc>
-                <w:tcPr/>
-                <w:p>
-                  <w:pPr>
-                    <w:pStyle w:val="Compact"/>
-                    <w:jc w:val="left"/>
-                    <w:jc w:val="center"/>
-                  </w:pPr>
-                  <w:r>
-                    <w:t xml:space="preserve">In-hospital mortality</w:t>
-                  </w:r>
-                </w:p>
-              </w:tc>
-              <w:tc>
-                <w:tcPr/>
-                <w:p>
-                  <w:pPr>
-                    <w:pStyle w:val="Compact"/>
-                    <w:jc w:val="left"/>
-                    <w:jc w:val="center"/>
-                  </w:pPr>
-                  <w:r>
-                    <w:t xml:space="preserve">10,140 (5.3%)</w:t>
-                  </w:r>
-                </w:p>
-              </w:tc>
-              <w:tc>
-                <w:tcPr/>
-                <w:p>
-                  <w:pPr>
-                    <w:pStyle w:val="Compact"/>
-                    <w:jc w:val="left"/>
-                    <w:jc w:val="center"/>
-                  </w:pPr>
-                  <w:r>
-                    <w:t xml:space="preserve">2,330 (4.0%)</w:t>
-                  </w:r>
-                </w:p>
-              </w:tc>
-              <w:tc>
-                <w:tcPr/>
-                <w:p>
-                  <w:pPr>
-                    <w:pStyle w:val="Compact"/>
-                    <w:jc w:val="left"/>
-                    <w:jc w:val="center"/>
-                  </w:pPr>
-                  <w:r>
-                    <w:t xml:space="preserve">0.74 (0.67–0.83)</w:t>
-                  </w:r>
-                </w:p>
-              </w:tc>
-              <w:tc>
-                <w:tcPr/>
-                <w:p>
-                  <w:pPr>
-                    <w:pStyle w:val="Compact"/>
-                    <w:jc w:val="left"/>
-                    <w:jc w:val="center"/>
-                  </w:pPr>
-                  <w:r>
-                    <w:t xml:space="preserve">0.60 (0.53–0.67)</w:t>
-                  </w:r>
-                </w:p>
-              </w:tc>
-              <w:tc>
-                <w:tcPr/>
-                <w:p>
-                  <w:pPr>
-                    <w:pStyle w:val="Compact"/>
-                    <w:jc w:val="left"/>
-                    <w:jc w:val="center"/>
-                  </w:pPr>
-                  <w:r>
-                    <w:t xml:space="preserve">-2.04% (-2.46% to -1.63%)</w:t>
-                  </w:r>
-                </w:p>
-              </w:tc>
-              <w:tc>
-                <w:tcPr/>
-                <w:p>
-                  <w:pPr>
-                    <w:pStyle w:val="Compact"/>
-                    <w:jc w:val="left"/>
-                    <w:jc w:val="center"/>
-                  </w:pPr>
-                  <w:r>
-                    <w:t xml:space="preserve">&lt;0.001</w:t>
+              <w:trPr>
+                <w:cantSplit/>
+              </w:trPr>
+              <w:tc>
+                <w:tcPr>
+                  <w:tcBorders>
+                    <w:top w:val="single" w:sz="16" w:space="0" w:color="D3D3D3"/>
+                    <w:bottom w:val="single" w:sz="16" w:space="0" w:color="D3D3D3"/>
+                    <w:start w:val="single" w:space="0" w:color="D3D3D3"/>
+                    <w:end w:val="single" w:space="0" w:color="D3D3D3"/>
+                  </w:tcBorders>
+                  <w:tcMar>
+                    <w:top w:w="25" w:type="dxa"/>
+                  </w:tcMar>
+                  <w:gridSpan w:val="6"/>
+                </w:tcPr>
+                <w:p>
+                  <w:pPr>
+                    <w:spacing w:before="0" w:after="60"/>
+                    <w:keepNext/>
+                  </w:pPr>
+                  <w:r>
+                    <w:rPr>
+                      <w:rFonts w:ascii="Calibri" w:hAnsi="Calibri"/>
+                      <w:sz w:val="20"/>
+                    </w:rPr>
+                    <w:t xml:space="default">Binary outcomes: n (%); odds ratio</w:t>
                   </w:r>
                 </w:p>
               </w:tc>
             </w:tr>
             <w:tr>
-              <w:tc>
-                <w:tcPr/>
-                <w:p>
-                  <w:pPr>
-                    <w:pStyle w:val="Compact"/>
-                    <w:jc w:val="left"/>
-                    <w:jc w:val="center"/>
-                  </w:pPr>
-                  <w:r>
-                    <w:t xml:space="preserve">Invasive mechanical ventilation</w:t>
-                  </w:r>
-                </w:p>
-              </w:tc>
-              <w:tc>
-                <w:tcPr/>
-                <w:p>
-                  <w:pPr>
-                    <w:pStyle w:val="Compact"/>
-                    <w:jc w:val="left"/>
-                    <w:jc w:val="center"/>
-                  </w:pPr>
-                  <w:r>
-                    <w:t xml:space="preserve">42,330 (22.1%)</w:t>
-                  </w:r>
-                </w:p>
-              </w:tc>
-              <w:tc>
-                <w:tcPr/>
-                <w:p>
-                  <w:pPr>
-                    <w:pStyle w:val="Compact"/>
-                    <w:jc w:val="left"/>
-                    <w:jc w:val="center"/>
-                  </w:pPr>
-                  <w:r>
-                    <w:t xml:space="preserve">15,150 (26.0%)</w:t>
-                  </w:r>
-                </w:p>
-              </w:tc>
-              <w:tc>
-                <w:tcPr/>
-                <w:p>
-                  <w:pPr>
-                    <w:pStyle w:val="Compact"/>
-                    <w:jc w:val="left"/>
-                    <w:jc w:val="center"/>
-                  </w:pPr>
-                  <w:r>
-                    <w:t xml:space="preserve">1.24 (1.18–1.30)</w:t>
-                  </w:r>
-                </w:p>
-              </w:tc>
-              <w:tc>
-                <w:tcPr/>
-                <w:p>
-                  <w:pPr>
-                    <w:pStyle w:val="Compact"/>
-                    <w:jc w:val="left"/>
-                    <w:jc w:val="center"/>
-                  </w:pPr>
-                  <w:r>
-                    <w:t xml:space="preserve">1.42 (1.34–1.50)</w:t>
-                  </w:r>
-                </w:p>
-              </w:tc>
-              <w:tc>
-                <w:tcPr/>
-                <w:p>
-                  <w:pPr>
-                    <w:pStyle w:val="Compact"/>
-                    <w:jc w:val="left"/>
-                    <w:jc w:val="center"/>
-                  </w:pPr>
-                  <w:r>
-                    <w:t xml:space="preserve">+5.97% (+4.94% to +7.00%)</w:t>
-                  </w:r>
-                </w:p>
-              </w:tc>
-              <w:tc>
-                <w:tcPr/>
-                <w:p>
-                  <w:pPr>
-                    <w:pStyle w:val="Compact"/>
-                    <w:jc w:val="left"/>
-                    <w:jc w:val="center"/>
-                  </w:pPr>
-                  <w:r>
-                    <w:t xml:space="preserve">&lt;0.001</w:t>
+              <w:trPr>
+                <w:cantSplit/>
+              </w:trPr>
+              <w:tc>
+                <w:tcPr>
+                  <w:tcBorders>
+                    <w:top w:val="single" w:space="0" w:color="D3D3D3"/>
+                    <w:bottom w:val="single" w:space="0" w:color="D3D3D3"/>
+                    <w:start w:val="single" w:space="0" w:color="D3D3D3"/>
+                    <w:end w:val="single" w:space="0" w:color="D3D3D3"/>
+                  </w:tcBorders>
+                </w:tcPr>
+                <w:p>
+                  <w:pPr>
+                    <w:spacing w:before="0" w:after="60"/>
+                    <w:keepNext/>
+                    <w:jc w:val="start"/>
+                  </w:pPr>
+                  <w:r>
+                    <w:rPr>
+                      <w:rFonts w:ascii="Calibri" w:hAnsi="Calibri"/>
+                      <w:sz w:val="20"/>
+                    </w:rPr>
+                    <w:t xml:space="default">In-hospital mortality</w:t>
+                  </w:r>
+                </w:p>
+              </w:tc>
+              <w:tc>
+                <w:tcPr>
+                  <w:tcBorders>
+                    <w:top w:val="single" w:space="0" w:color="D3D3D3"/>
+                    <w:bottom w:val="single" w:space="0" w:color="D3D3D3"/>
+                    <w:start w:val="single" w:space="0" w:color="D3D3D3"/>
+                    <w:end w:val="single" w:space="0" w:color="D3D3D3"/>
+                  </w:tcBorders>
+                </w:tcPr>
+                <w:p>
+                  <w:pPr>
+                    <w:spacing w:before="0" w:after="60"/>
+                    <w:keepNext/>
+                    <w:jc w:val="start"/>
+                  </w:pPr>
+                  <w:r>
+                    <w:rPr>
+                      <w:rFonts w:ascii="Calibri" w:hAnsi="Calibri"/>
+                      <w:sz w:val="20"/>
+                    </w:rPr>
+                    <w:t xml:space="default">10,140 (5.3%)</w:t>
+                  </w:r>
+                </w:p>
+              </w:tc>
+              <w:tc>
+                <w:tcPr>
+                  <w:tcBorders>
+                    <w:top w:val="single" w:space="0" w:color="D3D3D3"/>
+                    <w:bottom w:val="single" w:space="0" w:color="D3D3D3"/>
+                    <w:start w:val="single" w:space="0" w:color="D3D3D3"/>
+                    <w:end w:val="single" w:space="0" w:color="D3D3D3"/>
+                  </w:tcBorders>
+                </w:tcPr>
+                <w:p>
+                  <w:pPr>
+                    <w:spacing w:before="0" w:after="60"/>
+                    <w:keepNext/>
+                    <w:jc w:val="start"/>
+                  </w:pPr>
+                  <w:r>
+                    <w:rPr>
+                      <w:rFonts w:ascii="Calibri" w:hAnsi="Calibri"/>
+                      <w:sz w:val="20"/>
+                    </w:rPr>
+                    <w:t xml:space="default">2,330 (4.0%)</w:t>
+                  </w:r>
+                </w:p>
+              </w:tc>
+              <w:tc>
+                <w:tcPr>
+                  <w:tcBorders>
+                    <w:top w:val="single" w:space="0" w:color="D3D3D3"/>
+                    <w:bottom w:val="single" w:space="0" w:color="D3D3D3"/>
+                    <w:start w:val="single" w:space="0" w:color="D3D3D3"/>
+                    <w:end w:val="single" w:space="0" w:color="D3D3D3"/>
+                  </w:tcBorders>
+                </w:tcPr>
+                <w:p>
+                  <w:pPr>
+                    <w:spacing w:before="0" w:after="60"/>
+                    <w:keepNext/>
+                    <w:jc w:val="start"/>
+                  </w:pPr>
+                  <w:r>
+                    <w:rPr>
+                      <w:rFonts w:ascii="Calibri" w:hAnsi="Calibri"/>
+                      <w:sz w:val="20"/>
+                    </w:rPr>
+                    <w:t xml:space="default">0.74 (0.67–0.83)</w:t>
+                  </w:r>
+                </w:p>
+              </w:tc>
+              <w:tc>
+                <w:tcPr>
+                  <w:tcBorders>
+                    <w:top w:val="single" w:space="0" w:color="D3D3D3"/>
+                    <w:bottom w:val="single" w:space="0" w:color="D3D3D3"/>
+                    <w:start w:val="single" w:space="0" w:color="D3D3D3"/>
+                    <w:end w:val="single" w:space="0" w:color="D3D3D3"/>
+                  </w:tcBorders>
+                </w:tcPr>
+                <w:p>
+                  <w:pPr>
+                    <w:spacing w:before="0" w:after="60"/>
+                    <w:keepNext/>
+                    <w:jc w:val="start"/>
+                  </w:pPr>
+                  <w:r>
+                    <w:rPr>
+                      <w:rFonts w:ascii="Calibri" w:hAnsi="Calibri"/>
+                      <w:sz w:val="20"/>
+                    </w:rPr>
+                    <w:t xml:space="default">0.60 (0.53–0.67)</w:t>
+                  </w:r>
+                </w:p>
+              </w:tc>
+              <w:tc>
+                <w:tcPr>
+                  <w:tcBorders>
+                    <w:top w:val="single" w:space="0" w:color="D3D3D3"/>
+                    <w:bottom w:val="single" w:space="0" w:color="D3D3D3"/>
+                    <w:start w:val="single" w:space="0" w:color="D3D3D3"/>
+                    <w:end w:val="single" w:space="0" w:color="D3D3D3"/>
+                  </w:tcBorders>
+                </w:tcPr>
+                <w:p>
+                  <w:pPr>
+                    <w:spacing w:before="0" w:after="60"/>
+                    <w:keepNext/>
+                    <w:jc w:val="start"/>
+                  </w:pPr>
+                  <w:r>
+                    <w:rPr>
+                      <w:rFonts w:ascii="Calibri" w:hAnsi="Calibri"/>
+                      <w:sz w:val="20"/>
+                    </w:rPr>
+                    <w:t xml:space="default">&lt;0.001</w:t>
                   </w:r>
                 </w:p>
               </w:tc>
             </w:tr>
             <w:tr>
-              <w:tc>
-                <w:tcPr/>
-                <w:p>
-                  <w:pPr>
-                    <w:pStyle w:val="Compact"/>
-                    <w:jc w:val="left"/>
-                    <w:jc w:val="center"/>
-                  </w:pPr>
-                  <w:r>
-                    <w:t xml:space="preserve">Pneumonia or aspiration pneumonitis</w:t>
-                  </w:r>
-                </w:p>
-              </w:tc>
-              <w:tc>
-                <w:tcPr/>
-                <w:p>
-                  <w:pPr>
-                    <w:pStyle w:val="Compact"/>
-                    <w:jc w:val="left"/>
-                    <w:jc w:val="center"/>
-                  </w:pPr>
-                  <w:r>
-                    <w:t xml:space="preserve">15,000 (7.8%)</w:t>
-                  </w:r>
-                </w:p>
-              </w:tc>
-              <w:tc>
-                <w:tcPr/>
-                <w:p>
-                  <w:pPr>
-                    <w:pStyle w:val="Compact"/>
-                    <w:jc w:val="left"/>
-                    <w:jc w:val="center"/>
-                  </w:pPr>
-                  <w:r>
-                    <w:t xml:space="preserve">10,480 (18.0%)</w:t>
-                  </w:r>
-                </w:p>
-              </w:tc>
-              <w:tc>
-                <w:tcPr/>
-                <w:p>
-                  <w:pPr>
-                    <w:pStyle w:val="Compact"/>
-                    <w:jc w:val="left"/>
-                    <w:jc w:val="center"/>
-                  </w:pPr>
-                  <w:r>
-                    <w:t xml:space="preserve">2.58 (2.43–2.74)</w:t>
-                  </w:r>
-                </w:p>
-              </w:tc>
-              <w:tc>
-                <w:tcPr/>
-                <w:p>
-                  <w:pPr>
-                    <w:pStyle w:val="Compact"/>
-                    <w:jc w:val="left"/>
-                    <w:jc w:val="center"/>
-                  </w:pPr>
-                  <w:r>
-                    <w:t xml:space="preserve">2.32 (2.17–2.49)</w:t>
-                  </w:r>
-                </w:p>
-              </w:tc>
-              <w:tc>
-                <w:tcPr/>
-                <w:p>
-                  <w:pPr>
-                    <w:pStyle w:val="Compact"/>
-                    <w:jc w:val="left"/>
-                    <w:jc w:val="center"/>
-                  </w:pPr>
-                  <w:r>
-                    <w:t xml:space="preserve">+8.49% (+7.70% to +9.29%)</w:t>
-                  </w:r>
-                </w:p>
-              </w:tc>
-              <w:tc>
-                <w:tcPr/>
-                <w:p>
-                  <w:pPr>
-                    <w:pStyle w:val="Compact"/>
-                    <w:jc w:val="left"/>
-                    <w:jc w:val="center"/>
-                  </w:pPr>
-                  <w:r>
-                    <w:t xml:space="preserve">&lt;0.001</w:t>
+              <w:trPr>
+                <w:cantSplit/>
+              </w:trPr>
+              <w:tc>
+                <w:tcPr>
+                  <w:tcBorders>
+                    <w:top w:val="single" w:space="0" w:color="D3D3D3"/>
+                    <w:bottom w:val="single" w:space="0" w:color="D3D3D3"/>
+                    <w:start w:val="single" w:space="0" w:color="D3D3D3"/>
+                    <w:end w:val="single" w:space="0" w:color="D3D3D3"/>
+                  </w:tcBorders>
+                </w:tcPr>
+                <w:p>
+                  <w:pPr>
+                    <w:spacing w:before="0" w:after="60"/>
+                    <w:keepNext/>
+                    <w:jc w:val="start"/>
+                  </w:pPr>
+                  <w:r>
+                    <w:rPr>
+                      <w:rFonts w:ascii="Calibri" w:hAnsi="Calibri"/>
+                      <w:sz w:val="20"/>
+                    </w:rPr>
+                    <w:t xml:space="default">Invasive mechanical ventilation</w:t>
+                  </w:r>
+                </w:p>
+              </w:tc>
+              <w:tc>
+                <w:tcPr>
+                  <w:tcBorders>
+                    <w:top w:val="single" w:space="0" w:color="D3D3D3"/>
+                    <w:bottom w:val="single" w:space="0" w:color="D3D3D3"/>
+                    <w:start w:val="single" w:space="0" w:color="D3D3D3"/>
+                    <w:end w:val="single" w:space="0" w:color="D3D3D3"/>
+                  </w:tcBorders>
+                </w:tcPr>
+                <w:p>
+                  <w:pPr>
+                    <w:spacing w:before="0" w:after="60"/>
+                    <w:keepNext/>
+                    <w:jc w:val="start"/>
+                  </w:pPr>
+                  <w:r>
+                    <w:rPr>
+                      <w:rFonts w:ascii="Calibri" w:hAnsi="Calibri"/>
+                      <w:sz w:val="20"/>
+                    </w:rPr>
+                    <w:t xml:space="default">42,330 (22.1%)</w:t>
+                  </w:r>
+                </w:p>
+              </w:tc>
+              <w:tc>
+                <w:tcPr>
+                  <w:tcBorders>
+                    <w:top w:val="single" w:space="0" w:color="D3D3D3"/>
+                    <w:bottom w:val="single" w:space="0" w:color="D3D3D3"/>
+                    <w:start w:val="single" w:space="0" w:color="D3D3D3"/>
+                    <w:end w:val="single" w:space="0" w:color="D3D3D3"/>
+                  </w:tcBorders>
+                </w:tcPr>
+                <w:p>
+                  <w:pPr>
+                    <w:spacing w:before="0" w:after="60"/>
+                    <w:keepNext/>
+                    <w:jc w:val="start"/>
+                  </w:pPr>
+                  <w:r>
+                    <w:rPr>
+                      <w:rFonts w:ascii="Calibri" w:hAnsi="Calibri"/>
+                      <w:sz w:val="20"/>
+                    </w:rPr>
+                    <w:t xml:space="default">15,150 (26.0%)</w:t>
+                  </w:r>
+                </w:p>
+              </w:tc>
+              <w:tc>
+                <w:tcPr>
+                  <w:tcBorders>
+                    <w:top w:val="single" w:space="0" w:color="D3D3D3"/>
+                    <w:bottom w:val="single" w:space="0" w:color="D3D3D3"/>
+                    <w:start w:val="single" w:space="0" w:color="D3D3D3"/>
+                    <w:end w:val="single" w:space="0" w:color="D3D3D3"/>
+                  </w:tcBorders>
+                </w:tcPr>
+                <w:p>
+                  <w:pPr>
+                    <w:spacing w:before="0" w:after="60"/>
+                    <w:keepNext/>
+                    <w:jc w:val="start"/>
+                  </w:pPr>
+                  <w:r>
+                    <w:rPr>
+                      <w:rFonts w:ascii="Calibri" w:hAnsi="Calibri"/>
+                      <w:sz w:val="20"/>
+                    </w:rPr>
+                    <w:t xml:space="default">1.24 (1.18–1.30)</w:t>
+                  </w:r>
+                </w:p>
+              </w:tc>
+              <w:tc>
+                <w:tcPr>
+                  <w:tcBorders>
+                    <w:top w:val="single" w:space="0" w:color="D3D3D3"/>
+                    <w:bottom w:val="single" w:space="0" w:color="D3D3D3"/>
+                    <w:start w:val="single" w:space="0" w:color="D3D3D3"/>
+                    <w:end w:val="single" w:space="0" w:color="D3D3D3"/>
+                  </w:tcBorders>
+                </w:tcPr>
+                <w:p>
+                  <w:pPr>
+                    <w:spacing w:before="0" w:after="60"/>
+                    <w:keepNext/>
+                    <w:jc w:val="start"/>
+                  </w:pPr>
+                  <w:r>
+                    <w:rPr>
+                      <w:rFonts w:ascii="Calibri" w:hAnsi="Calibri"/>
+                      <w:sz w:val="20"/>
+                    </w:rPr>
+                    <w:t xml:space="default">1.42 (1.34–1.50)</w:t>
+                  </w:r>
+                </w:p>
+              </w:tc>
+              <w:tc>
+                <w:tcPr>
+                  <w:tcBorders>
+                    <w:top w:val="single" w:space="0" w:color="D3D3D3"/>
+                    <w:bottom w:val="single" w:space="0" w:color="D3D3D3"/>
+                    <w:start w:val="single" w:space="0" w:color="D3D3D3"/>
+                    <w:end w:val="single" w:space="0" w:color="D3D3D3"/>
+                  </w:tcBorders>
+                </w:tcPr>
+                <w:p>
+                  <w:pPr>
+                    <w:spacing w:before="0" w:after="60"/>
+                    <w:keepNext/>
+                    <w:jc w:val="start"/>
+                  </w:pPr>
+                  <w:r>
+                    <w:rPr>
+                      <w:rFonts w:ascii="Calibri" w:hAnsi="Calibri"/>
+                      <w:sz w:val="20"/>
+                    </w:rPr>
+                    <w:t xml:space="default">&lt;0.001</w:t>
                   </w:r>
                 </w:p>
               </w:tc>
             </w:tr>
             <w:tr>
-              <w:tc>
-                <w:tcPr/>
-                <w:p>
-                  <w:pPr>
-                    <w:pStyle w:val="Compact"/>
-                    <w:jc w:val="left"/>
-                    <w:jc w:val="center"/>
-                  </w:pPr>
-                  <w:r>
-                    <w:t xml:space="preserve">Institutional discharge (among survivors)</w:t>
-                  </w:r>
-                </w:p>
-              </w:tc>
-              <w:tc>
-                <w:tcPr/>
-                <w:p>
-                  <w:pPr>
-                    <w:pStyle w:val="Compact"/>
-                    <w:jc w:val="left"/>
-                    <w:jc w:val="center"/>
-                  </w:pPr>
-                  <w:r>
-                    <w:t xml:space="preserve">46,550 (25.7%)</w:t>
-                  </w:r>
-                </w:p>
-              </w:tc>
-              <w:tc>
-                <w:tcPr/>
-                <w:p>
-                  <w:pPr>
-                    <w:pStyle w:val="Compact"/>
-                    <w:jc w:val="left"/>
-                    <w:jc w:val="center"/>
-                  </w:pPr>
-                  <w:r>
-                    <w:t xml:space="preserve">22,310 (39.9%)</w:t>
-                  </w:r>
-                </w:p>
-              </w:tc>
-              <w:tc>
-                <w:tcPr/>
-                <w:p>
-                  <w:pPr>
-                    <w:pStyle w:val="Compact"/>
-                    <w:jc w:val="left"/>
-                    <w:jc w:val="center"/>
-                  </w:pPr>
-                  <w:r>
-                    <w:t xml:space="preserve">1.92 (1.83–2.01)</w:t>
-                  </w:r>
-                </w:p>
-              </w:tc>
-              <w:tc>
-                <w:tcPr/>
-                <w:p>
-                  <w:pPr>
-                    <w:pStyle w:val="Compact"/>
-                    <w:jc w:val="left"/>
-                    <w:jc w:val="center"/>
-                  </w:pPr>
-                  <w:r>
-                    <w:t xml:space="preserve">1.74 (1.65–1.84)</w:t>
-                  </w:r>
-                </w:p>
-              </w:tc>
-              <w:tc>
-                <w:tcPr/>
-                <w:p>
-                  <w:pPr>
-                    <w:pStyle w:val="Compact"/>
-                    <w:jc w:val="left"/>
-                    <w:jc w:val="center"/>
-                  </w:pPr>
-                  <w:r>
-                    <w:t xml:space="preserve">+10.38% (+9.35% to +11.40%)</w:t>
-                  </w:r>
-                </w:p>
-              </w:tc>
-              <w:tc>
-                <w:tcPr/>
-                <w:p>
-                  <w:pPr>
-                    <w:pStyle w:val="Compact"/>
-                    <w:jc w:val="left"/>
-                    <w:jc w:val="center"/>
-                  </w:pPr>
-                  <w:r>
-                    <w:t xml:space="preserve">&lt;0.001</w:t>
+              <w:trPr>
+                <w:cantSplit/>
+              </w:trPr>
+              <w:tc>
+                <w:tcPr>
+                  <w:tcBorders>
+                    <w:top w:val="single" w:space="0" w:color="D3D3D3"/>
+                    <w:bottom w:val="single" w:space="0" w:color="D3D3D3"/>
+                    <w:start w:val="single" w:space="0" w:color="D3D3D3"/>
+                    <w:end w:val="single" w:space="0" w:color="D3D3D3"/>
+                  </w:tcBorders>
+                </w:tcPr>
+                <w:p>
+                  <w:pPr>
+                    <w:spacing w:before="0" w:after="60"/>
+                    <w:keepNext/>
+                    <w:jc w:val="start"/>
+                  </w:pPr>
+                  <w:r>
+                    <w:rPr>
+                      <w:rFonts w:ascii="Calibri" w:hAnsi="Calibri"/>
+                      <w:sz w:val="20"/>
+                    </w:rPr>
+                    <w:t xml:space="default">Pneumonia or aspiration pneumonitis</w:t>
+                  </w:r>
+                </w:p>
+              </w:tc>
+              <w:tc>
+                <w:tcPr>
+                  <w:tcBorders>
+                    <w:top w:val="single" w:space="0" w:color="D3D3D3"/>
+                    <w:bottom w:val="single" w:space="0" w:color="D3D3D3"/>
+                    <w:start w:val="single" w:space="0" w:color="D3D3D3"/>
+                    <w:end w:val="single" w:space="0" w:color="D3D3D3"/>
+                  </w:tcBorders>
+                </w:tcPr>
+                <w:p>
+                  <w:pPr>
+                    <w:spacing w:before="0" w:after="60"/>
+                    <w:keepNext/>
+                    <w:jc w:val="start"/>
+                  </w:pPr>
+                  <w:r>
+                    <w:rPr>
+                      <w:rFonts w:ascii="Calibri" w:hAnsi="Calibri"/>
+                      <w:sz w:val="20"/>
+                    </w:rPr>
+                    <w:t xml:space="default">15,000 (7.8%)</w:t>
+                  </w:r>
+                </w:p>
+              </w:tc>
+              <w:tc>
+                <w:tcPr>
+                  <w:tcBorders>
+                    <w:top w:val="single" w:space="0" w:color="D3D3D3"/>
+                    <w:bottom w:val="single" w:space="0" w:color="D3D3D3"/>
+                    <w:start w:val="single" w:space="0" w:color="D3D3D3"/>
+                    <w:end w:val="single" w:space="0" w:color="D3D3D3"/>
+                  </w:tcBorders>
+                </w:tcPr>
+                <w:p>
+                  <w:pPr>
+                    <w:spacing w:before="0" w:after="60"/>
+                    <w:keepNext/>
+                    <w:jc w:val="start"/>
+                  </w:pPr>
+                  <w:r>
+                    <w:rPr>
+                      <w:rFonts w:ascii="Calibri" w:hAnsi="Calibri"/>
+                      <w:sz w:val="20"/>
+                    </w:rPr>
+                    <w:t xml:space="default">10,480 (18.0%)</w:t>
+                  </w:r>
+                </w:p>
+              </w:tc>
+              <w:tc>
+                <w:tcPr>
+                  <w:tcBorders>
+                    <w:top w:val="single" w:space="0" w:color="D3D3D3"/>
+                    <w:bottom w:val="single" w:space="0" w:color="D3D3D3"/>
+                    <w:start w:val="single" w:space="0" w:color="D3D3D3"/>
+                    <w:end w:val="single" w:space="0" w:color="D3D3D3"/>
+                  </w:tcBorders>
+                </w:tcPr>
+                <w:p>
+                  <w:pPr>
+                    <w:spacing w:before="0" w:after="60"/>
+                    <w:keepNext/>
+                    <w:jc w:val="start"/>
+                  </w:pPr>
+                  <w:r>
+                    <w:rPr>
+                      <w:rFonts w:ascii="Calibri" w:hAnsi="Calibri"/>
+                      <w:sz w:val="20"/>
+                    </w:rPr>
+                    <w:t xml:space="default">2.58 (2.43–2.74)</w:t>
+                  </w:r>
+                </w:p>
+              </w:tc>
+              <w:tc>
+                <w:tcPr>
+                  <w:tcBorders>
+                    <w:top w:val="single" w:space="0" w:color="D3D3D3"/>
+                    <w:bottom w:val="single" w:space="0" w:color="D3D3D3"/>
+                    <w:start w:val="single" w:space="0" w:color="D3D3D3"/>
+                    <w:end w:val="single" w:space="0" w:color="D3D3D3"/>
+                  </w:tcBorders>
+                </w:tcPr>
+                <w:p>
+                  <w:pPr>
+                    <w:spacing w:before="0" w:after="60"/>
+                    <w:keepNext/>
+                    <w:jc w:val="start"/>
+                  </w:pPr>
+                  <w:r>
+                    <w:rPr>
+                      <w:rFonts w:ascii="Calibri" w:hAnsi="Calibri"/>
+                      <w:sz w:val="20"/>
+                    </w:rPr>
+                    <w:t xml:space="default">2.32 (2.17–2.49)</w:t>
+                  </w:r>
+                </w:p>
+              </w:tc>
+              <w:tc>
+                <w:tcPr>
+                  <w:tcBorders>
+                    <w:top w:val="single" w:space="0" w:color="D3D3D3"/>
+                    <w:bottom w:val="single" w:space="0" w:color="D3D3D3"/>
+                    <w:start w:val="single" w:space="0" w:color="D3D3D3"/>
+                    <w:end w:val="single" w:space="0" w:color="D3D3D3"/>
+                  </w:tcBorders>
+                </w:tcPr>
+                <w:p>
+                  <w:pPr>
+                    <w:spacing w:before="0" w:after="60"/>
+                    <w:keepNext/>
+                    <w:jc w:val="start"/>
+                  </w:pPr>
+                  <w:r>
+                    <w:rPr>
+                      <w:rFonts w:ascii="Calibri" w:hAnsi="Calibri"/>
+                      <w:sz w:val="20"/>
+                    </w:rPr>
+                    <w:t xml:space="default">&lt;0.001</w:t>
                   </w:r>
                 </w:p>
               </w:tc>
             </w:tr>
             <w:tr>
-              <w:tc>
-                <w:tcPr/>
-                <w:p>
-                  <w:pPr>
-                    <w:pStyle w:val="Compact"/>
-                    <w:jc w:val="left"/>
-                    <w:jc w:val="center"/>
-                  </w:pPr>
-                  <w:r>
-                    <w:t xml:space="preserve">Discharge against medical advice (among survivors)</w:t>
-                  </w:r>
-                </w:p>
-              </w:tc>
-              <w:tc>
-                <w:tcPr/>
-                <w:p>
-                  <w:pPr>
-                    <w:pStyle w:val="Compact"/>
-                    <w:jc w:val="left"/>
-                    <w:jc w:val="center"/>
-                  </w:pPr>
-                  <w:r>
-                    <w:t xml:space="preserve">7,530 (4.2%)</w:t>
-                  </w:r>
-                </w:p>
-              </w:tc>
-              <w:tc>
-                <w:tcPr/>
-                <w:p>
-                  <w:pPr>
-                    <w:pStyle w:val="Compact"/>
-                    <w:jc w:val="left"/>
-                    <w:jc w:val="center"/>
-                  </w:pPr>
-                  <w:r>
-                    <w:t xml:space="preserve">3,150 (5.6%)</w:t>
-                  </w:r>
-                </w:p>
-              </w:tc>
-              <w:tc>
-                <w:tcPr/>
-                <w:p>
-                  <w:pPr>
-                    <w:pStyle w:val="Compact"/>
-                    <w:jc w:val="left"/>
-                    <w:jc w:val="center"/>
-                  </w:pPr>
-                  <w:r>
-                    <w:t xml:space="preserve">1.38 (1.25–1.52)</w:t>
-                  </w:r>
-                </w:p>
-              </w:tc>
-              <w:tc>
-                <w:tcPr/>
-                <w:p>
-                  <w:pPr>
-                    <w:pStyle w:val="Compact"/>
-                    <w:jc w:val="left"/>
-                    <w:jc w:val="center"/>
-                  </w:pPr>
-                  <w:r>
-                    <w:t xml:space="preserve">1.49 (1.34–1.66)</w:t>
-                  </w:r>
-                </w:p>
-              </w:tc>
-              <w:tc>
-                <w:tcPr/>
-                <w:p>
-                  <w:pPr>
-                    <w:pStyle w:val="Compact"/>
-                    <w:jc w:val="left"/>
-                    <w:jc w:val="center"/>
-                  </w:pPr>
-                  <w:r>
-                    <w:t xml:space="preserve">+1.75% (+1.23% to +2.27%)</w:t>
-                  </w:r>
-                </w:p>
-              </w:tc>
-              <w:tc>
-                <w:tcPr/>
-                <w:p>
-                  <w:pPr>
-                    <w:pStyle w:val="Compact"/>
-                    <w:jc w:val="left"/>
-                    <w:jc w:val="center"/>
-                  </w:pPr>
-                  <w:r>
-                    <w:t xml:space="preserve">&lt;0.001</w:t>
+              <w:trPr>
+                <w:cantSplit/>
+              </w:trPr>
+              <w:tc>
+                <w:tcPr>
+                  <w:tcBorders>
+                    <w:top w:val="single" w:space="0" w:color="D3D3D3"/>
+                    <w:bottom w:val="single" w:space="0" w:color="D3D3D3"/>
+                    <w:start w:val="single" w:space="0" w:color="D3D3D3"/>
+                    <w:end w:val="single" w:space="0" w:color="D3D3D3"/>
+                  </w:tcBorders>
+                </w:tcPr>
+                <w:p>
+                  <w:pPr>
+                    <w:spacing w:before="0" w:after="60"/>
+                    <w:keepNext/>
+                    <w:jc w:val="start"/>
+                  </w:pPr>
+                  <w:r>
+                    <w:rPr>
+                      <w:rFonts w:ascii="Calibri" w:hAnsi="Calibri"/>
+                      <w:sz w:val="20"/>
+                    </w:rPr>
+                    <w:t xml:space="default">Institutional discharge (among survivors)</w:t>
+                  </w:r>
+                </w:p>
+              </w:tc>
+              <w:tc>
+                <w:tcPr>
+                  <w:tcBorders>
+                    <w:top w:val="single" w:space="0" w:color="D3D3D3"/>
+                    <w:bottom w:val="single" w:space="0" w:color="D3D3D3"/>
+                    <w:start w:val="single" w:space="0" w:color="D3D3D3"/>
+                    <w:end w:val="single" w:space="0" w:color="D3D3D3"/>
+                  </w:tcBorders>
+                </w:tcPr>
+                <w:p>
+                  <w:pPr>
+                    <w:spacing w:before="0" w:after="60"/>
+                    <w:keepNext/>
+                    <w:jc w:val="start"/>
+                  </w:pPr>
+                  <w:r>
+                    <w:rPr>
+                      <w:rFonts w:ascii="Calibri" w:hAnsi="Calibri"/>
+                      <w:sz w:val="20"/>
+                    </w:rPr>
+                    <w:t xml:space="default">46,550 (25.7%)</w:t>
+                  </w:r>
+                </w:p>
+              </w:tc>
+              <w:tc>
+                <w:tcPr>
+                  <w:tcBorders>
+                    <w:top w:val="single" w:space="0" w:color="D3D3D3"/>
+                    <w:bottom w:val="single" w:space="0" w:color="D3D3D3"/>
+                    <w:start w:val="single" w:space="0" w:color="D3D3D3"/>
+                    <w:end w:val="single" w:space="0" w:color="D3D3D3"/>
+                  </w:tcBorders>
+                </w:tcPr>
+                <w:p>
+                  <w:pPr>
+                    <w:spacing w:before="0" w:after="60"/>
+                    <w:keepNext/>
+                    <w:jc w:val="start"/>
+                  </w:pPr>
+                  <w:r>
+                    <w:rPr>
+                      <w:rFonts w:ascii="Calibri" w:hAnsi="Calibri"/>
+                      <w:sz w:val="20"/>
+                    </w:rPr>
+                    <w:t xml:space="default">22,310 (39.9%)</w:t>
+                  </w:r>
+                </w:p>
+              </w:tc>
+              <w:tc>
+                <w:tcPr>
+                  <w:tcBorders>
+                    <w:top w:val="single" w:space="0" w:color="D3D3D3"/>
+                    <w:bottom w:val="single" w:space="0" w:color="D3D3D3"/>
+                    <w:start w:val="single" w:space="0" w:color="D3D3D3"/>
+                    <w:end w:val="single" w:space="0" w:color="D3D3D3"/>
+                  </w:tcBorders>
+                </w:tcPr>
+                <w:p>
+                  <w:pPr>
+                    <w:spacing w:before="0" w:after="60"/>
+                    <w:keepNext/>
+                    <w:jc w:val="start"/>
+                  </w:pPr>
+                  <w:r>
+                    <w:rPr>
+                      <w:rFonts w:ascii="Calibri" w:hAnsi="Calibri"/>
+                      <w:sz w:val="20"/>
+                    </w:rPr>
+                    <w:t xml:space="default">1.92 (1.83–2.01)</w:t>
+                  </w:r>
+                </w:p>
+              </w:tc>
+              <w:tc>
+                <w:tcPr>
+                  <w:tcBorders>
+                    <w:top w:val="single" w:space="0" w:color="D3D3D3"/>
+                    <w:bottom w:val="single" w:space="0" w:color="D3D3D3"/>
+                    <w:start w:val="single" w:space="0" w:color="D3D3D3"/>
+                    <w:end w:val="single" w:space="0" w:color="D3D3D3"/>
+                  </w:tcBorders>
+                </w:tcPr>
+                <w:p>
+                  <w:pPr>
+                    <w:spacing w:before="0" w:after="60"/>
+                    <w:keepNext/>
+                    <w:jc w:val="start"/>
+                  </w:pPr>
+                  <w:r>
+                    <w:rPr>
+                      <w:rFonts w:ascii="Calibri" w:hAnsi="Calibri"/>
+                      <w:sz w:val="20"/>
+                    </w:rPr>
+                    <w:t xml:space="default">1.74 (1.65–1.84)</w:t>
+                  </w:r>
+                </w:p>
+              </w:tc>
+              <w:tc>
+                <w:tcPr>
+                  <w:tcBorders>
+                    <w:top w:val="single" w:space="0" w:color="D3D3D3"/>
+                    <w:bottom w:val="single" w:space="0" w:color="D3D3D3"/>
+                    <w:start w:val="single" w:space="0" w:color="D3D3D3"/>
+                    <w:end w:val="single" w:space="0" w:color="D3D3D3"/>
+                  </w:tcBorders>
+                </w:tcPr>
+                <w:p>
+                  <w:pPr>
+                    <w:spacing w:before="0" w:after="60"/>
+                    <w:keepNext/>
+                    <w:jc w:val="start"/>
+                  </w:pPr>
+                  <w:r>
+                    <w:rPr>
+                      <w:rFonts w:ascii="Calibri" w:hAnsi="Calibri"/>
+                      <w:sz w:val="20"/>
+                    </w:rPr>
+                    <w:t xml:space="default">&lt;0.001</w:t>
                   </w:r>
                 </w:p>
               </w:tc>
             </w:tr>
             <w:tr>
-              <w:tc>
-                <w:tcPr/>
-                <w:p>
-                  <w:pPr>
-                    <w:pStyle w:val="Compact"/>
-                    <w:jc w:val="left"/>
-                    <w:jc w:val="center"/>
-                  </w:pPr>
-                  <w:r>
-                    <w:t xml:space="preserve">Length of stay</w:t>
-                  </w:r>
-                </w:p>
-              </w:tc>
-              <w:tc>
-                <w:tcPr/>
-                <w:p>
-                  <w:pPr>
-                    <w:pStyle w:val="Compact"/>
-                    <w:jc w:val="left"/>
-                    <w:jc w:val="center"/>
-                  </w:pPr>
-                  <w:r>
-                    <w:t xml:space="preserve">6.7 days</w:t>
-                  </w:r>
-                </w:p>
-              </w:tc>
-              <w:tc>
-                <w:tcPr/>
-                <w:p>
-                  <w:pPr>
-                    <w:pStyle w:val="Compact"/>
-                    <w:jc w:val="left"/>
-                    <w:jc w:val="center"/>
-                  </w:pPr>
-                  <w:r>
-                    <w:t xml:space="preserve">12.1 days</w:t>
-                  </w:r>
-                </w:p>
-              </w:tc>
-              <w:tc>
-                <w:tcPr/>
-                <w:p>
-                  <w:pPr>
-                    <w:pStyle w:val="Compact"/>
-                    <w:jc w:val="left"/>
-                    <w:jc w:val="center"/>
-                  </w:pPr>
-                  <w:r>
-                    <w:t xml:space="preserve">1.80 (1.75–1.86)</w:t>
-                  </w:r>
-                </w:p>
-              </w:tc>
-              <w:tc>
-                <w:tcPr/>
-                <w:p>
-                  <w:pPr>
-                    <w:pStyle w:val="Compact"/>
-                    <w:jc w:val="left"/>
-                    <w:jc w:val="center"/>
-                  </w:pPr>
-                  <w:r>
-                    <w:t xml:space="preserve">1.70 (1.64–1.75)</w:t>
-                  </w:r>
-                </w:p>
-              </w:tc>
-              <w:tc>
-                <w:tcPr/>
-                <w:p>
-                  <w:pPr>
-                    <w:pStyle w:val="Compact"/>
-                    <w:jc w:val="left"/>
-                    <w:jc w:val="center"/>
-                  </w:pPr>
-                  <w:r>
-                    <w:t xml:space="preserve">+4.69 days (+4.38 to +5.00)</w:t>
-                  </w:r>
-                </w:p>
-              </w:tc>
-              <w:tc>
-                <w:tcPr/>
-                <w:p>
-                  <w:pPr>
-                    <w:pStyle w:val="Compact"/>
-                    <w:jc w:val="left"/>
-                    <w:jc w:val="center"/>
-                  </w:pPr>
-                  <w:r>
-                    <w:t xml:space="preserve">&lt;0.001</w:t>
+              <w:trPr>
+                <w:cantSplit/>
+              </w:trPr>
+              <w:tc>
+                <w:tcPr>
+                  <w:tcBorders>
+                    <w:top w:val="single" w:space="0" w:color="D3D3D3"/>
+                    <w:bottom w:val="single" w:space="0" w:color="D3D3D3"/>
+                    <w:start w:val="single" w:space="0" w:color="D3D3D3"/>
+                    <w:end w:val="single" w:space="0" w:color="D3D3D3"/>
+                  </w:tcBorders>
+                </w:tcPr>
+                <w:p>
+                  <w:pPr>
+                    <w:spacing w:before="0" w:after="60"/>
+                    <w:keepNext/>
+                    <w:jc w:val="start"/>
+                  </w:pPr>
+                  <w:r>
+                    <w:rPr>
+                      <w:rFonts w:ascii="Calibri" w:hAnsi="Calibri"/>
+                      <w:sz w:val="20"/>
+                    </w:rPr>
+                    <w:t xml:space="default">Discharge against medical advice (among survivors)</w:t>
+                  </w:r>
+                </w:p>
+              </w:tc>
+              <w:tc>
+                <w:tcPr>
+                  <w:tcBorders>
+                    <w:top w:val="single" w:space="0" w:color="D3D3D3"/>
+                    <w:bottom w:val="single" w:space="0" w:color="D3D3D3"/>
+                    <w:start w:val="single" w:space="0" w:color="D3D3D3"/>
+                    <w:end w:val="single" w:space="0" w:color="D3D3D3"/>
+                  </w:tcBorders>
+                </w:tcPr>
+                <w:p>
+                  <w:pPr>
+                    <w:spacing w:before="0" w:after="60"/>
+                    <w:keepNext/>
+                    <w:jc w:val="start"/>
+                  </w:pPr>
+                  <w:r>
+                    <w:rPr>
+                      <w:rFonts w:ascii="Calibri" w:hAnsi="Calibri"/>
+                      <w:sz w:val="20"/>
+                    </w:rPr>
+                    <w:t xml:space="default">7,530 (4.2%)</w:t>
+                  </w:r>
+                </w:p>
+              </w:tc>
+              <w:tc>
+                <w:tcPr>
+                  <w:tcBorders>
+                    <w:top w:val="single" w:space="0" w:color="D3D3D3"/>
+                    <w:bottom w:val="single" w:space="0" w:color="D3D3D3"/>
+                    <w:start w:val="single" w:space="0" w:color="D3D3D3"/>
+                    <w:end w:val="single" w:space="0" w:color="D3D3D3"/>
+                  </w:tcBorders>
+                </w:tcPr>
+                <w:p>
+                  <w:pPr>
+                    <w:spacing w:before="0" w:after="60"/>
+                    <w:keepNext/>
+                    <w:jc w:val="start"/>
+                  </w:pPr>
+                  <w:r>
+                    <w:rPr>
+                      <w:rFonts w:ascii="Calibri" w:hAnsi="Calibri"/>
+                      <w:sz w:val="20"/>
+                    </w:rPr>
+                    <w:t xml:space="default">3,150 (5.6%)</w:t>
+                  </w:r>
+                </w:p>
+              </w:tc>
+              <w:tc>
+                <w:tcPr>
+                  <w:tcBorders>
+                    <w:top w:val="single" w:space="0" w:color="D3D3D3"/>
+                    <w:bottom w:val="single" w:space="0" w:color="D3D3D3"/>
+                    <w:start w:val="single" w:space="0" w:color="D3D3D3"/>
+                    <w:end w:val="single" w:space="0" w:color="D3D3D3"/>
+                  </w:tcBorders>
+                </w:tcPr>
+                <w:p>
+                  <w:pPr>
+                    <w:spacing w:before="0" w:after="60"/>
+                    <w:keepNext/>
+                    <w:jc w:val="start"/>
+                  </w:pPr>
+                  <w:r>
+                    <w:rPr>
+                      <w:rFonts w:ascii="Calibri" w:hAnsi="Calibri"/>
+                      <w:sz w:val="20"/>
+                    </w:rPr>
+                    <w:t xml:space="default">1.38 (1.25–1.52)</w:t>
+                  </w:r>
+                </w:p>
+              </w:tc>
+              <w:tc>
+                <w:tcPr>
+                  <w:tcBorders>
+                    <w:top w:val="single" w:space="0" w:color="D3D3D3"/>
+                    <w:bottom w:val="single" w:space="0" w:color="D3D3D3"/>
+                    <w:start w:val="single" w:space="0" w:color="D3D3D3"/>
+                    <w:end w:val="single" w:space="0" w:color="D3D3D3"/>
+                  </w:tcBorders>
+                </w:tcPr>
+                <w:p>
+                  <w:pPr>
+                    <w:spacing w:before="0" w:after="60"/>
+                    <w:keepNext/>
+                    <w:jc w:val="start"/>
+                  </w:pPr>
+                  <w:r>
+                    <w:rPr>
+                      <w:rFonts w:ascii="Calibri" w:hAnsi="Calibri"/>
+                      <w:sz w:val="20"/>
+                    </w:rPr>
+                    <w:t xml:space="default">1.49 (1.34–1.66)</w:t>
+                  </w:r>
+                </w:p>
+              </w:tc>
+              <w:tc>
+                <w:tcPr>
+                  <w:tcBorders>
+                    <w:top w:val="single" w:space="0" w:color="D3D3D3"/>
+                    <w:bottom w:val="single" w:space="0" w:color="D3D3D3"/>
+                    <w:start w:val="single" w:space="0" w:color="D3D3D3"/>
+                    <w:end w:val="single" w:space="0" w:color="D3D3D3"/>
+                  </w:tcBorders>
+                </w:tcPr>
+                <w:p>
+                  <w:pPr>
+                    <w:spacing w:before="0" w:after="60"/>
+                    <w:keepNext/>
+                    <w:jc w:val="start"/>
+                  </w:pPr>
+                  <w:r>
+                    <w:rPr>
+                      <w:rFonts w:ascii="Calibri" w:hAnsi="Calibri"/>
+                      <w:sz w:val="20"/>
+                    </w:rPr>
+                    <w:t xml:space="default">&lt;0.001</w:t>
                   </w:r>
                 </w:p>
               </w:tc>
             </w:tr>
             <w:tr>
-              <w:tc>
-                <w:tcPr/>
-                <w:p>
-                  <w:pPr>
-                    <w:pStyle w:val="Compact"/>
-                    <w:jc w:val="left"/>
-                    <w:jc w:val="center"/>
-                  </w:pPr>
-                  <w:r>
-                    <w:t xml:space="preserve">Hospital cost</w:t>
-                  </w:r>
-                </w:p>
-              </w:tc>
-              <w:tc>
-                <w:tcPr/>
-                <w:p>
-                  <w:pPr>
-                    <w:pStyle w:val="Compact"/>
-                    <w:jc w:val="left"/>
-                    <w:jc w:val="center"/>
-                  </w:pPr>
-                  <w:r>
-                    <w:t xml:space="preserve">$29,446</w:t>
-                  </w:r>
-                </w:p>
-              </w:tc>
-              <w:tc>
-                <w:tcPr/>
-                <w:p>
-                  <w:pPr>
-                    <w:pStyle w:val="Compact"/>
-                    <w:jc w:val="left"/>
-                    <w:jc w:val="center"/>
-                  </w:pPr>
-                  <w:r>
-                    <w:t xml:space="preserve">$42,535</w:t>
-                  </w:r>
-                </w:p>
-              </w:tc>
-              <w:tc>
-                <w:tcPr/>
-                <w:p>
-                  <w:pPr>
-                    <w:pStyle w:val="Compact"/>
-                    <w:jc w:val="left"/>
-                    <w:jc w:val="center"/>
-                  </w:pPr>
-                  <w:r>
-                    <w:t xml:space="preserve">1.44 (1.41–1.48)</w:t>
-                  </w:r>
-                </w:p>
-              </w:tc>
-              <w:tc>
-                <w:tcPr/>
-                <w:p>
-                  <w:pPr>
-                    <w:pStyle w:val="Compact"/>
-                    <w:jc w:val="left"/>
-                    <w:jc w:val="center"/>
-                  </w:pPr>
-                  <w:r>
-                    <w:t xml:space="preserve">1.46 (1.42–1.51)</w:t>
-                  </w:r>
-                </w:p>
-              </w:tc>
-              <w:tc>
-                <w:tcPr/>
-                <w:p>
-                  <w:pPr>
-                    <w:pStyle w:val="Compact"/>
-                    <w:jc w:val="left"/>
-                    <w:jc w:val="center"/>
-                  </w:pPr>
-                  <w:r>
-                    <w:t xml:space="preserve">+$13,543 (+$12,456 to +$14,630)</w:t>
-                  </w:r>
-                </w:p>
-              </w:tc>
-              <w:tc>
-                <w:tcPr/>
-                <w:p>
-                  <w:pPr>
-                    <w:pStyle w:val="Compact"/>
-                    <w:jc w:val="left"/>
-                    <w:jc w:val="center"/>
-                  </w:pPr>
-                  <w:r>
-                    <w:t xml:space="preserve">&lt;0.001</w:t>
+              <w:trPr>
+                <w:cantSplit/>
+              </w:trPr>
+              <w:tc>
+                <w:tcPr>
+                  <w:tcBorders>
+                    <w:top w:val="single" w:sz="16" w:space="0" w:color="D3D3D3"/>
+                    <w:bottom w:val="single" w:sz="16" w:space="0" w:color="D3D3D3"/>
+                    <w:start w:val="single" w:space="0" w:color="D3D3D3"/>
+                    <w:end w:val="single" w:space="0" w:color="D3D3D3"/>
+                  </w:tcBorders>
+                  <w:tcMar>
+                    <w:top w:w="25" w:type="dxa"/>
+                  </w:tcMar>
+                  <w:gridSpan w:val="6"/>
+                </w:tcPr>
+                <w:p>
+                  <w:pPr>
+                    <w:spacing w:before="0" w:after="60"/>
+                    <w:keepNext/>
+                  </w:pPr>
+                  <w:r>
+                    <w:rPr>
+                      <w:rFonts w:ascii="Calibri" w:hAnsi="Calibri"/>
+                      <w:sz w:val="20"/>
+                    </w:rPr>
+                    <w:t xml:space="default">Continuous outcomes: median (IQR); difference in adjusted means</w:t>
+                  </w:r>
+                </w:p>
+              </w:tc>
+            </w:tr>
+            <w:tr>
+              <w:trPr>
+                <w:cantSplit/>
+              </w:trPr>
+              <w:tc>
+                <w:tcPr>
+                  <w:tcBorders>
+                    <w:top w:val="single" w:space="0" w:color="D3D3D3"/>
+                    <w:bottom w:val="single" w:space="0" w:color="D3D3D3"/>
+                    <w:start w:val="single" w:space="0" w:color="D3D3D3"/>
+                    <w:end w:val="single" w:space="0" w:color="D3D3D3"/>
+                  </w:tcBorders>
+                </w:tcPr>
+                <w:p>
+                  <w:pPr>
+                    <w:spacing w:before="0" w:after="60"/>
+                    <w:keepNext/>
+                    <w:jc w:val="start"/>
+                  </w:pPr>
+                  <w:r>
+                    <w:rPr>
+                      <w:rFonts w:ascii="Calibri" w:hAnsi="Calibri"/>
+                      <w:sz w:val="20"/>
+                    </w:rPr>
+                    <w:t xml:space="default">Length of stay</w:t>
+                  </w:r>
+                </w:p>
+              </w:tc>
+              <w:tc>
+                <w:tcPr>
+                  <w:tcBorders>
+                    <w:top w:val="single" w:space="0" w:color="D3D3D3"/>
+                    <w:bottom w:val="single" w:space="0" w:color="D3D3D3"/>
+                    <w:start w:val="single" w:space="0" w:color="D3D3D3"/>
+                    <w:end w:val="single" w:space="0" w:color="D3D3D3"/>
+                  </w:tcBorders>
+                </w:tcPr>
+                <w:p>
+                  <w:pPr>
+                    <w:spacing w:before="0" w:after="60"/>
+                    <w:keepNext/>
+                    <w:jc w:val="start"/>
+                  </w:pPr>
+                  <w:r>
+                    <w:rPr>
+                      <w:rFonts w:ascii="Calibri" w:hAnsi="Calibri"/>
+                      <w:sz w:val="20"/>
+                    </w:rPr>
+                    <w:t xml:space="default">3 (2–7)</w:t>
+                  </w:r>
+                </w:p>
+              </w:tc>
+              <w:tc>
+                <w:tcPr>
+                  <w:tcBorders>
+                    <w:top w:val="single" w:space="0" w:color="D3D3D3"/>
+                    <w:bottom w:val="single" w:space="0" w:color="D3D3D3"/>
+                    <w:start w:val="single" w:space="0" w:color="D3D3D3"/>
+                    <w:end w:val="single" w:space="0" w:color="D3D3D3"/>
+                  </w:tcBorders>
+                </w:tcPr>
+                <w:p>
+                  <w:pPr>
+                    <w:spacing w:before="0" w:after="60"/>
+                    <w:keepNext/>
+                    <w:jc w:val="start"/>
+                  </w:pPr>
+                  <w:r>
+                    <w:rPr>
+                      <w:rFonts w:ascii="Calibri" w:hAnsi="Calibri"/>
+                      <w:sz w:val="20"/>
+                    </w:rPr>
+                    <w:t xml:space="default">8 (4–15)</w:t>
+                  </w:r>
+                </w:p>
+              </w:tc>
+              <w:tc>
+                <w:tcPr>
+                  <w:tcBorders>
+                    <w:top w:val="single" w:space="0" w:color="D3D3D3"/>
+                    <w:bottom w:val="single" w:space="0" w:color="D3D3D3"/>
+                    <w:start w:val="single" w:space="0" w:color="D3D3D3"/>
+                    <w:end w:val="single" w:space="0" w:color="D3D3D3"/>
+                  </w:tcBorders>
+                </w:tcPr>
+                <w:p>
+                  <w:pPr>
+                    <w:spacing w:before="0" w:after="60"/>
+                    <w:keepNext/>
+                    <w:jc w:val="start"/>
+                  </w:pPr>
+                  <w:r>
+                    <w:rPr>
+                      <w:rFonts w:ascii="Calibri" w:hAnsi="Calibri"/>
+                      <w:sz w:val="20"/>
+                    </w:rPr>
+                    <w:t xml:space="default">+5.38 days (+5.06 to +5.69)</w:t>
+                  </w:r>
+                </w:p>
+              </w:tc>
+              <w:tc>
+                <w:tcPr>
+                  <w:tcBorders>
+                    <w:top w:val="single" w:space="0" w:color="D3D3D3"/>
+                    <w:bottom w:val="single" w:space="0" w:color="D3D3D3"/>
+                    <w:start w:val="single" w:space="0" w:color="D3D3D3"/>
+                    <w:end w:val="single" w:space="0" w:color="D3D3D3"/>
+                  </w:tcBorders>
+                </w:tcPr>
+                <w:p>
+                  <w:pPr>
+                    <w:spacing w:before="0" w:after="60"/>
+                    <w:keepNext/>
+                    <w:jc w:val="start"/>
+                  </w:pPr>
+                  <w:r>
+                    <w:rPr>
+                      <w:rFonts w:ascii="Calibri" w:hAnsi="Calibri"/>
+                      <w:sz w:val="20"/>
+                    </w:rPr>
+                    <w:t xml:space="default">+4.69 days (+4.38 to +5.00)</w:t>
+                  </w:r>
+                </w:p>
+              </w:tc>
+              <w:tc>
+                <w:tcPr>
+                  <w:tcBorders>
+                    <w:top w:val="single" w:space="0" w:color="D3D3D3"/>
+                    <w:bottom w:val="single" w:space="0" w:color="D3D3D3"/>
+                    <w:start w:val="single" w:space="0" w:color="D3D3D3"/>
+                    <w:end w:val="single" w:space="0" w:color="D3D3D3"/>
+                  </w:tcBorders>
+                </w:tcPr>
+                <w:p>
+                  <w:pPr>
+                    <w:spacing w:before="0" w:after="60"/>
+                    <w:keepNext/>
+                    <w:jc w:val="start"/>
+                  </w:pPr>
+                  <w:r>
+                    <w:rPr>
+                      <w:rFonts w:ascii="Calibri" w:hAnsi="Calibri"/>
+                      <w:sz w:val="20"/>
+                    </w:rPr>
+                    <w:t xml:space="default">&lt;0.001</w:t>
+                  </w:r>
+                </w:p>
+              </w:tc>
+            </w:tr>
+            <w:tr>
+              <w:trPr>
+                <w:cantSplit/>
+              </w:trPr>
+              <w:tc>
+                <w:tcPr>
+                  <w:tcBorders>
+                    <w:top w:val="single" w:space="0" w:color="D3D3D3"/>
+                    <w:bottom w:val="single" w:space="0" w:color="D3D3D3"/>
+                    <w:start w:val="single" w:space="0" w:color="D3D3D3"/>
+                    <w:end w:val="single" w:space="0" w:color="D3D3D3"/>
+                  </w:tcBorders>
+                </w:tcPr>
+                <w:p>
+                  <w:pPr>
+                    <w:spacing w:before="0" w:after="60"/>
+                    <w:keepNext/>
+                    <w:jc w:val="start"/>
+                  </w:pPr>
+                  <w:r>
+                    <w:rPr>
+                      <w:rFonts w:ascii="Calibri" w:hAnsi="Calibri"/>
+                      <w:sz w:val="20"/>
+                    </w:rPr>
+                    <w:t xml:space="default">Hospital cost</w:t>
+                  </w:r>
+                </w:p>
+              </w:tc>
+              <w:tc>
+                <w:tcPr>
+                  <w:tcBorders>
+                    <w:top w:val="single" w:space="0" w:color="D3D3D3"/>
+                    <w:bottom w:val="single" w:space="0" w:color="D3D3D3"/>
+                    <w:start w:val="single" w:space="0" w:color="D3D3D3"/>
+                    <w:end w:val="single" w:space="0" w:color="D3D3D3"/>
+                  </w:tcBorders>
+                </w:tcPr>
+                <w:p>
+                  <w:pPr>
+                    <w:spacing w:before="0" w:after="60"/>
+                    <w:keepNext/>
+                    <w:jc w:val="start"/>
+                  </w:pPr>
+                  <w:r>
+                    <w:rPr>
+                      <w:rFonts w:ascii="Calibri" w:hAnsi="Calibri"/>
+                      <w:sz w:val="20"/>
+                    </w:rPr>
+                    <w:t xml:space="default">$16,326 ($9,290–$32,533)</w:t>
+                  </w:r>
+                </w:p>
+              </w:tc>
+              <w:tc>
+                <w:tcPr>
+                  <w:tcBorders>
+                    <w:top w:val="single" w:space="0" w:color="D3D3D3"/>
+                    <w:bottom w:val="single" w:space="0" w:color="D3D3D3"/>
+                    <w:start w:val="single" w:space="0" w:color="D3D3D3"/>
+                    <w:end w:val="single" w:space="0" w:color="D3D3D3"/>
+                  </w:tcBorders>
+                </w:tcPr>
+                <w:p>
+                  <w:pPr>
+                    <w:spacing w:before="0" w:after="60"/>
+                    <w:keepNext/>
+                    <w:jc w:val="start"/>
+                  </w:pPr>
+                  <w:r>
+                    <w:rPr>
+                      <w:rFonts w:ascii="Calibri" w:hAnsi="Calibri"/>
+                      <w:sz w:val="20"/>
+                    </w:rPr>
+                    <w:t xml:space="default">$25,814 ($13,234–$52,889)</w:t>
+                  </w:r>
+                </w:p>
+              </w:tc>
+              <w:tc>
+                <w:tcPr>
+                  <w:tcBorders>
+                    <w:top w:val="single" w:space="0" w:color="D3D3D3"/>
+                    <w:bottom w:val="single" w:space="0" w:color="D3D3D3"/>
+                    <w:start w:val="single" w:space="0" w:color="D3D3D3"/>
+                    <w:end w:val="single" w:space="0" w:color="D3D3D3"/>
+                  </w:tcBorders>
+                </w:tcPr>
+                <w:p>
+                  <w:pPr>
+                    <w:spacing w:before="0" w:after="60"/>
+                    <w:keepNext/>
+                    <w:jc w:val="start"/>
+                  </w:pPr>
+                  <w:r>
+                    <w:rPr>
+                      <w:rFonts w:ascii="Calibri" w:hAnsi="Calibri"/>
+                      <w:sz w:val="20"/>
+                    </w:rPr>
+                    <w:t xml:space="default">+$13,090 (+$12,073 to +$14,106)</w:t>
+                  </w:r>
+                </w:p>
+              </w:tc>
+              <w:tc>
+                <w:tcPr>
+                  <w:tcBorders>
+                    <w:top w:val="single" w:space="0" w:color="D3D3D3"/>
+                    <w:bottom w:val="single" w:space="0" w:color="D3D3D3"/>
+                    <w:start w:val="single" w:space="0" w:color="D3D3D3"/>
+                    <w:end w:val="single" w:space="0" w:color="D3D3D3"/>
+                  </w:tcBorders>
+                </w:tcPr>
+                <w:p>
+                  <w:pPr>
+                    <w:spacing w:before="0" w:after="60"/>
+                    <w:keepNext/>
+                    <w:jc w:val="start"/>
+                  </w:pPr>
+                  <w:r>
+                    <w:rPr>
+                      <w:rFonts w:ascii="Calibri" w:hAnsi="Calibri"/>
+                      <w:sz w:val="20"/>
+                    </w:rPr>
+                    <w:t xml:space="default">+$13,543 (+$12,456 to +$14,630)</w:t>
+                  </w:r>
+                </w:p>
+              </w:tc>
+              <w:tc>
+                <w:tcPr>
+                  <w:tcBorders>
+                    <w:top w:val="single" w:space="0" w:color="D3D3D3"/>
+                    <w:bottom w:val="single" w:space="0" w:color="D3D3D3"/>
+                    <w:start w:val="single" w:space="0" w:color="D3D3D3"/>
+                    <w:end w:val="single" w:space="0" w:color="D3D3D3"/>
+                  </w:tcBorders>
+                </w:tcPr>
+                <w:p>
+                  <w:pPr>
+                    <w:spacing w:before="0" w:after="60"/>
+                    <w:keepNext/>
+                    <w:jc w:val="start"/>
+                  </w:pPr>
+                  <w:r>
+                    <w:rPr>
+                      <w:rFonts w:ascii="Calibri" w:hAnsi="Calibri"/>
+                      <w:sz w:val="20"/>
+                    </w:rPr>
+                    <w:t xml:space="default">&lt;0.001</w:t>
                   </w:r>
                 </w:p>
               </w:tc>
             </w:tr>
           </w:tbl>
           <w:bookmarkEnd w:id="24"/>
-          <w:p/>
         </w:tc>
       </w:tr>
     </w:tbl>
@@ -5626,7 +6123,7 @@
           <w:i/>
           <w:iCs/>
         </w:rPr>
-        <w:t xml:space="preserve">Values are survey-weighted national estimates, n (%), unless stated otherwise.</w:t>
+        <w:t xml:space="preserve">Survey-weighted national estimates. Binary outcomes are shown as weighted n (%) with odds ratios from survey-weighted logistic regression. Length of stay and cost are right-skewed, so they are summarized as median (IQR). Differences are estimated with survey-weighted generalized linear models with a log link (Poisson for length of stay, gamma for cost). These models handle skewed data without transforming the outcome, and the results are reported as differences in adjusted mean values (predictive margins). Adjusted models include all covariates listed in Methods. Costs are inflation-adjusted to 2022 US dollars. Institutional discharge and discharge against medical advice are among survivors.</w:t>
       </w:r>
     </w:p>
     <w:bookmarkEnd w:id="25"/>

</xml_diff>